<commit_message>
Updated revision with accepted changes
</commit_message>
<xml_diff>
--- a/Извештај.docx
+++ b/Извештај.docx
@@ -1,6 +1,6 @@
 
 <file path=word/document.xml><?xml version="1.0" encoding="utf-8"?>
-<w:document xmlns:wpc="http://schemas.microsoft.com/office/word/2010/wordprocessingCanvas" xmlns:cx="http://schemas.microsoft.com/office/drawing/2014/chartex" xmlns:cx1="http://schemas.microsoft.com/office/drawing/2015/9/8/chartex" xmlns:cx2="http://schemas.microsoft.com/office/drawing/2015/10/21/chartex" xmlns:cx3="http://schemas.microsoft.com/office/drawing/2016/5/9/chartex" xmlns:cx4="http://schemas.microsoft.com/office/drawing/2016/5/10/chartex" xmlns:cx5="http://schemas.microsoft.com/office/drawing/2016/5/11/chartex" xmlns:cx6="http://schemas.microsoft.com/office/drawing/2016/5/12/chartex" xmlns:cx7="http://schemas.microsoft.com/office/drawing/2016/5/13/chartex" xmlns:cx8="http://schemas.microsoft.com/office/drawing/2016/5/14/chartex" xmlns:mc="http://schemas.openxmlformats.org/markup-compatibility/2006" xmlns:aink="http://schemas.microsoft.com/office/drawing/2016/ink" xmlns:am3d="http://schemas.microsoft.com/office/drawing/2017/model3d" xmlns:o="urn:schemas-microsoft-com:office:office" xmlns:oel="http://schemas.microsoft.com/office/2019/extlst" xmlns:r="http://schemas.openxmlformats.org/officeDocument/2006/relationships" xmlns:m="http://schemas.openxmlformats.org/officeDocument/2006/math" xmlns:v="urn:schemas-microsoft-com:vml" xmlns:wp14="http://schemas.microsoft.com/office/word/2010/wordprocessingDrawing" xmlns:wp="http://schemas.openxmlformats.org/drawingml/2006/wordprocessingDrawing" xmlns:w10="urn:schemas-microsoft-com:office:word" xmlns:w="http://schemas.openxmlformats.org/wordprocessingml/2006/main" xmlns:w14="http://schemas.microsoft.com/office/word/2010/wordml" xmlns:w15="http://schemas.microsoft.com/office/word/2012/wordml" xmlns:w16cei="http://schemas.microsoft.com/office/word/2026/wordml/cei" xmlns:w16cex="http://schemas.microsoft.com/office/word/2018/wordml/cex" xmlns:w16cid="http://schemas.microsoft.com/office/word/2016/wordml/cid" xmlns:w16="http://schemas.microsoft.com/office/word/2018/wordml" xmlns:w16du="http://schemas.microsoft.com/office/word/2023/wordml/word16du" xmlns:w16sdtdh="http://schemas.microsoft.com/office/word/2020/wordml/sdtdatahash" xmlns:w16sdtfl="http://schemas.microsoft.com/office/word/2024/wordml/sdtformatlock" xmlns:w16se="http://schemas.microsoft.com/office/word/2015/wordml/symex" xmlns:wpg="http://schemas.microsoft.com/office/word/2010/wordprocessingGroup" xmlns:wpi="http://schemas.microsoft.com/office/word/2010/wordprocessingInk" xmlns:wne="http://schemas.microsoft.com/office/word/2006/wordml" xmlns:wps="http://schemas.microsoft.com/office/word/2010/wordprocessingShape" mc:Ignorable="w14 w15 w16se w16cid w16 w16cex w16sdtdh w16sdtfl w16du wp14">
+<w:document xmlns:wpc="http://schemas.microsoft.com/office/word/2010/wordprocessingCanvas" xmlns:cx="http://schemas.microsoft.com/office/drawing/2014/chartex" xmlns:cx1="http://schemas.microsoft.com/office/drawing/2015/9/8/chartex" xmlns:cx2="http://schemas.microsoft.com/office/drawing/2015/10/21/chartex" xmlns:cx3="http://schemas.microsoft.com/office/drawing/2016/5/9/chartex" xmlns:cx4="http://schemas.microsoft.com/office/drawing/2016/5/10/chartex" xmlns:cx5="http://schemas.microsoft.com/office/drawing/2016/5/11/chartex" xmlns:cx6="http://schemas.microsoft.com/office/drawing/2016/5/12/chartex" xmlns:cx7="http://schemas.microsoft.com/office/drawing/2016/5/13/chartex" xmlns:cx8="http://schemas.microsoft.com/office/drawing/2016/5/14/chartex" xmlns:mc="http://schemas.openxmlformats.org/markup-compatibility/2006" xmlns:aink="http://schemas.microsoft.com/office/drawing/2016/ink" xmlns:am3d="http://schemas.microsoft.com/office/drawing/2017/model3d" xmlns:o="urn:schemas-microsoft-com:office:office" xmlns:oel="http://schemas.microsoft.com/office/2019/extlst" xmlns:r="http://schemas.openxmlformats.org/officeDocument/2006/relationships" xmlns:m="http://schemas.openxmlformats.org/officeDocument/2006/math" xmlns:v="urn:schemas-microsoft-com:vml" xmlns:wp14="http://schemas.microsoft.com/office/word/2010/wordprocessingDrawing" xmlns:wp="http://schemas.openxmlformats.org/drawingml/2006/wordprocessingDrawing" xmlns:w10="urn:schemas-microsoft-com:office:word" xmlns:w="http://schemas.openxmlformats.org/wordprocessingml/2006/main" xmlns:w14="http://schemas.microsoft.com/office/word/2010/wordml" xmlns:w15="http://schemas.microsoft.com/office/word/2012/wordml" xmlns:w16cex="http://schemas.microsoft.com/office/word/2018/wordml/cex" xmlns:w16cid="http://schemas.microsoft.com/office/word/2016/wordml/cid" xmlns:w16="http://schemas.microsoft.com/office/word/2018/wordml" xmlns:w16du="http://schemas.microsoft.com/office/word/2023/wordml/word16du" xmlns:w16sdtdh="http://schemas.microsoft.com/office/word/2020/wordml/sdtdatahash" xmlns:w16sdtfl="http://schemas.microsoft.com/office/word/2024/wordml/sdtformatlock" xmlns:w16se="http://schemas.microsoft.com/office/word/2015/wordml/symex" xmlns:wpg="http://schemas.microsoft.com/office/word/2010/wordprocessingGroup" xmlns:wpi="http://schemas.microsoft.com/office/word/2010/wordprocessingInk" xmlns:wne="http://schemas.microsoft.com/office/word/2006/wordml" xmlns:wps="http://schemas.microsoft.com/office/word/2010/wordprocessingShape" mc:Ignorable="w14 w15 w16se w16cid w16 w16cex w16sdtdh w16sdtfl w16du wp14">
   <w:body>
     <w:p>
       <w:pPr>
@@ -353,6 +353,7 @@
           <w:docPartUnique/>
         </w:docPartObj>
       </w:sdtPr>
+      <w:sdtEndPr/>
       <w:sdtContent>
         <w:p>
           <w:pPr>
@@ -394,7 +395,7 @@
           <w:r>
             <w:fldChar w:fldCharType="separate"/>
           </w:r>
-          <w:hyperlink w:anchor="_Toc238141426" w:history="1">
+          <w:hyperlink w:anchor="_Toc238481644" w:history="1">
             <w:r>
               <w:rPr>
                 <w:rStyle w:val="Hyperlink"/>
@@ -436,7 +437,7 @@
                 <w:noProof/>
                 <w:webHidden/>
               </w:rPr>
-              <w:instrText xml:space="preserve"> PAGEREF _Toc238141426 \h </w:instrText>
+              <w:instrText xml:space="preserve"> PAGEREF _Toc238481644 \h </w:instrText>
             </w:r>
             <w:r>
               <w:rPr>
@@ -481,7 +482,7 @@
               <w14:ligatures w14:val="standardContextual"/>
             </w:rPr>
           </w:pPr>
-          <w:hyperlink w:anchor="_Toc238141427" w:history="1">
+          <w:hyperlink w:anchor="_Toc238481645" w:history="1">
             <w:r>
               <w:rPr>
                 <w:rStyle w:val="Hyperlink"/>
@@ -508,7 +509,7 @@
                 <w:noProof/>
                 <w:webHidden/>
               </w:rPr>
-              <w:instrText xml:space="preserve"> PAGEREF _Toc238141427 \h </w:instrText>
+              <w:instrText xml:space="preserve"> PAGEREF _Toc238481645 \h </w:instrText>
             </w:r>
             <w:r>
               <w:rPr>
@@ -528,7 +529,7 @@
                 <w:noProof/>
                 <w:webHidden/>
               </w:rPr>
-              <w:t>3</w:t>
+              <w:t>4</w:t>
             </w:r>
             <w:r>
               <w:rPr>
@@ -553,7 +554,7 @@
               <w14:ligatures w14:val="standardContextual"/>
             </w:rPr>
           </w:pPr>
-          <w:hyperlink w:anchor="_Toc238141428" w:history="1">
+          <w:hyperlink w:anchor="_Toc238481646" w:history="1">
             <w:r>
               <w:rPr>
                 <w:rStyle w:val="Hyperlink"/>
@@ -580,7 +581,7 @@
                 <w:noProof/>
                 <w:webHidden/>
               </w:rPr>
-              <w:instrText xml:space="preserve"> PAGEREF _Toc238141428 \h </w:instrText>
+              <w:instrText xml:space="preserve"> PAGEREF _Toc238481646 \h </w:instrText>
             </w:r>
             <w:r>
               <w:rPr>
@@ -600,7 +601,7 @@
                 <w:noProof/>
                 <w:webHidden/>
               </w:rPr>
-              <w:t>4</w:t>
+              <w:t>5</w:t>
             </w:r>
             <w:r>
               <w:rPr>
@@ -625,7 +626,7 @@
               <w14:ligatures w14:val="standardContextual"/>
             </w:rPr>
           </w:pPr>
-          <w:hyperlink w:anchor="_Toc238141429" w:history="1">
+          <w:hyperlink w:anchor="_Toc238481647" w:history="1">
             <w:r>
               <w:rPr>
                 <w:rStyle w:val="Hyperlink"/>
@@ -660,7 +661,7 @@
                 <w:noProof/>
                 <w:webHidden/>
               </w:rPr>
-              <w:instrText xml:space="preserve"> PAGEREF _Toc238141429 \h </w:instrText>
+              <w:instrText xml:space="preserve"> PAGEREF _Toc238481647 \h </w:instrText>
             </w:r>
             <w:r>
               <w:rPr>
@@ -705,13 +706,28 @@
               <w14:ligatures w14:val="standardContextual"/>
             </w:rPr>
           </w:pPr>
-          <w:hyperlink w:anchor="_Toc238141430" w:history="1">
+          <w:hyperlink w:anchor="_Toc238481648" w:history="1">
             <w:r>
               <w:rPr>
                 <w:rStyle w:val="Hyperlink"/>
                 <w:noProof/>
               </w:rPr>
-              <w:t>2.1. Прикупљање сирових података са друштвених мрежа</w:t>
+              <w:t xml:space="preserve">2.1. Прикупљање </w:t>
+            </w:r>
+            <w:r>
+              <w:rPr>
+                <w:rStyle w:val="Hyperlink"/>
+                <w:noProof/>
+                <w:lang w:val="sr-Cyrl-RS"/>
+              </w:rPr>
+              <w:t xml:space="preserve">необрађених </w:t>
+            </w:r>
+            <w:r>
+              <w:rPr>
+                <w:rStyle w:val="Hyperlink"/>
+                <w:noProof/>
+              </w:rPr>
+              <w:t>података са друштвених мрежа</w:t>
             </w:r>
             <w:r>
               <w:rPr>
@@ -732,7 +748,7 @@
                 <w:noProof/>
                 <w:webHidden/>
               </w:rPr>
-              <w:instrText xml:space="preserve"> PAGEREF _Toc238141430 \h </w:instrText>
+              <w:instrText xml:space="preserve"> PAGEREF _Toc238481648 \h </w:instrText>
             </w:r>
             <w:r>
               <w:rPr>
@@ -752,7 +768,7 @@
                 <w:noProof/>
                 <w:webHidden/>
               </w:rPr>
-              <w:t>5</w:t>
+              <w:t>6</w:t>
             </w:r>
             <w:r>
               <w:rPr>
@@ -777,7 +793,7 @@
               <w14:ligatures w14:val="standardContextual"/>
             </w:rPr>
           </w:pPr>
-          <w:hyperlink w:anchor="_Toc238141431" w:history="1">
+          <w:hyperlink w:anchor="_Toc238481649" w:history="1">
             <w:r>
               <w:rPr>
                 <w:rStyle w:val="Hyperlink"/>
@@ -804,7 +820,7 @@
                 <w:noProof/>
                 <w:webHidden/>
               </w:rPr>
-              <w:instrText xml:space="preserve"> PAGEREF _Toc238141431 \h </w:instrText>
+              <w:instrText xml:space="preserve"> PAGEREF _Toc238481649 \h </w:instrText>
             </w:r>
             <w:r>
               <w:rPr>
@@ -849,13 +865,28 @@
               <w14:ligatures w14:val="standardContextual"/>
             </w:rPr>
           </w:pPr>
-          <w:hyperlink w:anchor="_Toc238141432" w:history="1">
+          <w:hyperlink w:anchor="_Toc238481650" w:history="1">
             <w:r>
               <w:rPr>
                 <w:rStyle w:val="Hyperlink"/>
                 <w:noProof/>
               </w:rPr>
-              <w:t>2.2.1. Припрема сировог корпуса</w:t>
+              <w:t xml:space="preserve">2.2.1. Припрема </w:t>
+            </w:r>
+            <w:r>
+              <w:rPr>
+                <w:rStyle w:val="Hyperlink"/>
+                <w:noProof/>
+                <w:lang w:val="sr-Cyrl-RS"/>
+              </w:rPr>
+              <w:t>необрађеног</w:t>
+            </w:r>
+            <w:r>
+              <w:rPr>
+                <w:rStyle w:val="Hyperlink"/>
+                <w:noProof/>
+              </w:rPr>
+              <w:t xml:space="preserve"> корпуса</w:t>
             </w:r>
             <w:r>
               <w:rPr>
@@ -876,7 +907,7 @@
                 <w:noProof/>
                 <w:webHidden/>
               </w:rPr>
-              <w:instrText xml:space="preserve"> PAGEREF _Toc238141432 \h </w:instrText>
+              <w:instrText xml:space="preserve"> PAGEREF _Toc238481650 \h </w:instrText>
             </w:r>
             <w:r>
               <w:rPr>
@@ -896,7 +927,7 @@
                 <w:noProof/>
                 <w:webHidden/>
               </w:rPr>
-              <w:t>6</w:t>
+              <w:t>7</w:t>
             </w:r>
             <w:r>
               <w:rPr>
@@ -921,7 +952,7 @@
               <w14:ligatures w14:val="standardContextual"/>
             </w:rPr>
           </w:pPr>
-          <w:hyperlink w:anchor="_Toc238141433" w:history="1">
+          <w:hyperlink w:anchor="_Toc238481651" w:history="1">
             <w:r>
               <w:rPr>
                 <w:rStyle w:val="Hyperlink"/>
@@ -948,7 +979,7 @@
                 <w:noProof/>
                 <w:webHidden/>
               </w:rPr>
-              <w:instrText xml:space="preserve"> PAGEREF _Toc238141433 \h </w:instrText>
+              <w:instrText xml:space="preserve"> PAGEREF _Toc238481651 \h </w:instrText>
             </w:r>
             <w:r>
               <w:rPr>
@@ -993,7 +1024,7 @@
               <w14:ligatures w14:val="standardContextual"/>
             </w:rPr>
           </w:pPr>
-          <w:hyperlink w:anchor="_Toc238141434" w:history="1">
+          <w:hyperlink w:anchor="_Toc238481652" w:history="1">
             <w:r>
               <w:rPr>
                 <w:rStyle w:val="Hyperlink"/>
@@ -1035,7 +1066,7 @@
                 <w:noProof/>
                 <w:webHidden/>
               </w:rPr>
-              <w:instrText xml:space="preserve"> PAGEREF _Toc238141434 \h </w:instrText>
+              <w:instrText xml:space="preserve"> PAGEREF _Toc238481652 \h </w:instrText>
             </w:r>
             <w:r>
               <w:rPr>
@@ -1055,7 +1086,7 @@
                 <w:noProof/>
                 <w:webHidden/>
               </w:rPr>
-              <w:t>7</w:t>
+              <w:t>8</w:t>
             </w:r>
             <w:r>
               <w:rPr>
@@ -1080,7 +1111,7 @@
               <w14:ligatures w14:val="standardContextual"/>
             </w:rPr>
           </w:pPr>
-          <w:hyperlink w:anchor="_Toc238141435" w:history="1">
+          <w:hyperlink w:anchor="_Toc238481653" w:history="1">
             <w:r>
               <w:rPr>
                 <w:rStyle w:val="Hyperlink"/>
@@ -1107,7 +1138,7 @@
                 <w:noProof/>
                 <w:webHidden/>
               </w:rPr>
-              <w:instrText xml:space="preserve"> PAGEREF _Toc238141435 \h </w:instrText>
+              <w:instrText xml:space="preserve"> PAGEREF _Toc238481653 \h </w:instrText>
             </w:r>
             <w:r>
               <w:rPr>
@@ -1127,7 +1158,7 @@
                 <w:noProof/>
                 <w:webHidden/>
               </w:rPr>
-              <w:t>7</w:t>
+              <w:t>8</w:t>
             </w:r>
             <w:r>
               <w:rPr>
@@ -1152,7 +1183,7 @@
               <w14:ligatures w14:val="standardContextual"/>
             </w:rPr>
           </w:pPr>
-          <w:hyperlink w:anchor="_Toc238141436" w:history="1">
+          <w:hyperlink w:anchor="_Toc238481654" w:history="1">
             <w:r>
               <w:rPr>
                 <w:rStyle w:val="Hyperlink"/>
@@ -1179,7 +1210,7 @@
                 <w:noProof/>
                 <w:webHidden/>
               </w:rPr>
-              <w:instrText xml:space="preserve"> PAGEREF _Toc238141436 \h </w:instrText>
+              <w:instrText xml:space="preserve"> PAGEREF _Toc238481654 \h </w:instrText>
             </w:r>
             <w:r>
               <w:rPr>
@@ -1199,7 +1230,7 @@
                 <w:noProof/>
                 <w:webHidden/>
               </w:rPr>
-              <w:t>7</w:t>
+              <w:t>8</w:t>
             </w:r>
             <w:r>
               <w:rPr>
@@ -1224,7 +1255,7 @@
               <w14:ligatures w14:val="standardContextual"/>
             </w:rPr>
           </w:pPr>
-          <w:hyperlink w:anchor="_Toc238141437" w:history="1">
+          <w:hyperlink w:anchor="_Toc238481655" w:history="1">
             <w:r>
               <w:rPr>
                 <w:rStyle w:val="Hyperlink"/>
@@ -1251,7 +1282,7 @@
                 <w:noProof/>
                 <w:webHidden/>
               </w:rPr>
-              <w:instrText xml:space="preserve"> PAGEREF _Toc238141437 \h </w:instrText>
+              <w:instrText xml:space="preserve"> PAGEREF _Toc238481655 \h </w:instrText>
             </w:r>
             <w:r>
               <w:rPr>
@@ -1271,7 +1302,7 @@
                 <w:noProof/>
                 <w:webHidden/>
               </w:rPr>
-              <w:t>12</w:t>
+              <w:t>13</w:t>
             </w:r>
             <w:r>
               <w:rPr>
@@ -1296,7 +1327,7 @@
               <w14:ligatures w14:val="standardContextual"/>
             </w:rPr>
           </w:pPr>
-          <w:hyperlink w:anchor="_Toc238141438" w:history="1">
+          <w:hyperlink w:anchor="_Toc238481656" w:history="1">
             <w:r>
               <w:rPr>
                 <w:rStyle w:val="Hyperlink"/>
@@ -1339,7 +1370,7 @@
                 <w:noProof/>
                 <w:webHidden/>
               </w:rPr>
-              <w:instrText xml:space="preserve"> PAGEREF _Toc238141438 \h </w:instrText>
+              <w:instrText xml:space="preserve"> PAGEREF _Toc238481656 \h </w:instrText>
             </w:r>
             <w:r>
               <w:rPr>
@@ -1359,7 +1390,7 @@
                 <w:noProof/>
                 <w:webHidden/>
               </w:rPr>
-              <w:t>13</w:t>
+              <w:t>14</w:t>
             </w:r>
             <w:r>
               <w:rPr>
@@ -1384,7 +1415,7 @@
               <w14:ligatures w14:val="standardContextual"/>
             </w:rPr>
           </w:pPr>
-          <w:hyperlink w:anchor="_Toc238141439" w:history="1">
+          <w:hyperlink w:anchor="_Toc238481657" w:history="1">
             <w:r>
               <w:rPr>
                 <w:rStyle w:val="Hyperlink"/>
@@ -1443,7 +1474,7 @@
                 <w:noProof/>
                 <w:webHidden/>
               </w:rPr>
-              <w:instrText xml:space="preserve"> PAGEREF _Toc238141439 \h </w:instrText>
+              <w:instrText xml:space="preserve"> PAGEREF _Toc238481657 \h </w:instrText>
             </w:r>
             <w:r>
               <w:rPr>
@@ -1463,7 +1494,7 @@
                 <w:noProof/>
                 <w:webHidden/>
               </w:rPr>
-              <w:t>13</w:t>
+              <w:t>14</w:t>
             </w:r>
             <w:r>
               <w:rPr>
@@ -1488,7 +1519,7 @@
               <w14:ligatures w14:val="standardContextual"/>
             </w:rPr>
           </w:pPr>
-          <w:hyperlink w:anchor="_Toc238141440" w:history="1">
+          <w:hyperlink w:anchor="_Toc238481658" w:history="1">
             <w:r>
               <w:rPr>
                 <w:rStyle w:val="Hyperlink"/>
@@ -1531,7 +1562,7 @@
                 <w:noProof/>
                 <w:webHidden/>
               </w:rPr>
-              <w:instrText xml:space="preserve"> PAGEREF _Toc238141440 \h </w:instrText>
+              <w:instrText xml:space="preserve"> PAGEREF _Toc238481658 \h </w:instrText>
             </w:r>
             <w:r>
               <w:rPr>
@@ -1551,7 +1582,7 @@
                 <w:noProof/>
                 <w:webHidden/>
               </w:rPr>
-              <w:t>14</w:t>
+              <w:t>15</w:t>
             </w:r>
             <w:r>
               <w:rPr>
@@ -1576,7 +1607,7 @@
               <w14:ligatures w14:val="standardContextual"/>
             </w:rPr>
           </w:pPr>
-          <w:hyperlink w:anchor="_Toc238141441" w:history="1">
+          <w:hyperlink w:anchor="_Toc238481659" w:history="1">
             <w:r>
               <w:rPr>
                 <w:rStyle w:val="Hyperlink"/>
@@ -1619,7 +1650,7 @@
                 <w:noProof/>
                 <w:webHidden/>
               </w:rPr>
-              <w:instrText xml:space="preserve"> PAGEREF _Toc238141441 \h </w:instrText>
+              <w:instrText xml:space="preserve"> PAGEREF _Toc238481659 \h </w:instrText>
             </w:r>
             <w:r>
               <w:rPr>
@@ -1639,7 +1670,7 @@
                 <w:noProof/>
                 <w:webHidden/>
               </w:rPr>
-              <w:t>14</w:t>
+              <w:t>15</w:t>
             </w:r>
             <w:r>
               <w:rPr>
@@ -1664,7 +1695,7 @@
               <w14:ligatures w14:val="standardContextual"/>
             </w:rPr>
           </w:pPr>
-          <w:hyperlink w:anchor="_Toc238141442" w:history="1">
+          <w:hyperlink w:anchor="_Toc238481660" w:history="1">
             <w:r>
               <w:rPr>
                 <w:rStyle w:val="Hyperlink"/>
@@ -1707,7 +1738,7 @@
                 <w:noProof/>
                 <w:webHidden/>
               </w:rPr>
-              <w:instrText xml:space="preserve"> PAGEREF _Toc238141442 \h </w:instrText>
+              <w:instrText xml:space="preserve"> PAGEREF _Toc238481660 \h </w:instrText>
             </w:r>
             <w:r>
               <w:rPr>
@@ -1727,7 +1758,7 @@
                 <w:noProof/>
                 <w:webHidden/>
               </w:rPr>
-              <w:t>15</w:t>
+              <w:t>16</w:t>
             </w:r>
             <w:r>
               <w:rPr>
@@ -1752,7 +1783,7 @@
               <w14:ligatures w14:val="standardContextual"/>
             </w:rPr>
           </w:pPr>
-          <w:hyperlink w:anchor="_Toc238141443" w:history="1">
+          <w:hyperlink w:anchor="_Toc238481661" w:history="1">
             <w:r>
               <w:rPr>
                 <w:rStyle w:val="Hyperlink"/>
@@ -1795,7 +1826,7 @@
                 <w:noProof/>
                 <w:webHidden/>
               </w:rPr>
-              <w:instrText xml:space="preserve"> PAGEREF _Toc238141443 \h </w:instrText>
+              <w:instrText xml:space="preserve"> PAGEREF _Toc238481661 \h </w:instrText>
             </w:r>
             <w:r>
               <w:rPr>
@@ -1815,7 +1846,7 @@
                 <w:noProof/>
                 <w:webHidden/>
               </w:rPr>
-              <w:t>20</w:t>
+              <w:t>21</w:t>
             </w:r>
             <w:r>
               <w:rPr>
@@ -1840,7 +1871,7 @@
               <w14:ligatures w14:val="standardContextual"/>
             </w:rPr>
           </w:pPr>
-          <w:hyperlink w:anchor="_Toc238141444" w:history="1">
+          <w:hyperlink w:anchor="_Toc238481662" w:history="1">
             <w:r>
               <w:rPr>
                 <w:rStyle w:val="Hyperlink"/>
@@ -1867,7 +1898,7 @@
                 <w:noProof/>
                 <w:webHidden/>
               </w:rPr>
-              <w:instrText xml:space="preserve"> PAGEREF _Toc238141444 \h </w:instrText>
+              <w:instrText xml:space="preserve"> PAGEREF _Toc238481662 \h </w:instrText>
             </w:r>
             <w:r>
               <w:rPr>
@@ -1887,7 +1918,7 @@
                 <w:noProof/>
                 <w:webHidden/>
               </w:rPr>
-              <w:t>21</w:t>
+              <w:t>22</w:t>
             </w:r>
             <w:r>
               <w:rPr>
@@ -1912,7 +1943,7 @@
               <w14:ligatures w14:val="standardContextual"/>
             </w:rPr>
           </w:pPr>
-          <w:hyperlink w:anchor="_Toc238141445" w:history="1">
+          <w:hyperlink w:anchor="_Toc238481663" w:history="1">
             <w:r>
               <w:rPr>
                 <w:rStyle w:val="Hyperlink"/>
@@ -1963,7 +1994,7 @@
                 <w:noProof/>
                 <w:webHidden/>
               </w:rPr>
-              <w:instrText xml:space="preserve"> PAGEREF _Toc238141445 \h </w:instrText>
+              <w:instrText xml:space="preserve"> PAGEREF _Toc238481663 \h </w:instrText>
             </w:r>
             <w:r>
               <w:rPr>
@@ -1983,7 +2014,7 @@
                 <w:noProof/>
                 <w:webHidden/>
               </w:rPr>
-              <w:t>21</w:t>
+              <w:t>22</w:t>
             </w:r>
             <w:r>
               <w:rPr>
@@ -2008,7 +2039,7 @@
               <w14:ligatures w14:val="standardContextual"/>
             </w:rPr>
           </w:pPr>
-          <w:hyperlink w:anchor="_Toc238141446" w:history="1">
+          <w:hyperlink w:anchor="_Toc238481664" w:history="1">
             <w:r>
               <w:rPr>
                 <w:rStyle w:val="Hyperlink"/>
@@ -2067,7 +2098,7 @@
                 <w:noProof/>
                 <w:webHidden/>
               </w:rPr>
-              <w:instrText xml:space="preserve"> PAGEREF _Toc238141446 \h </w:instrText>
+              <w:instrText xml:space="preserve"> PAGEREF _Toc238481664 \h </w:instrText>
             </w:r>
             <w:r>
               <w:rPr>
@@ -2087,7 +2118,7 @@
                 <w:noProof/>
                 <w:webHidden/>
               </w:rPr>
-              <w:t>22</w:t>
+              <w:t>23</w:t>
             </w:r>
             <w:r>
               <w:rPr>
@@ -2112,7 +2143,7 @@
               <w14:ligatures w14:val="standardContextual"/>
             </w:rPr>
           </w:pPr>
-          <w:hyperlink w:anchor="_Toc238141447" w:history="1">
+          <w:hyperlink w:anchor="_Toc238481665" w:history="1">
             <w:r>
               <w:rPr>
                 <w:rStyle w:val="Hyperlink"/>
@@ -2171,7 +2202,7 @@
                 <w:noProof/>
                 <w:webHidden/>
               </w:rPr>
-              <w:instrText xml:space="preserve"> PAGEREF _Toc238141447 \h </w:instrText>
+              <w:instrText xml:space="preserve"> PAGEREF _Toc238481665 \h </w:instrText>
             </w:r>
             <w:r>
               <w:rPr>
@@ -2191,7 +2222,7 @@
                 <w:noProof/>
                 <w:webHidden/>
               </w:rPr>
-              <w:t>23</w:t>
+              <w:t>24</w:t>
             </w:r>
             <w:r>
               <w:rPr>
@@ -2216,7 +2247,7 @@
               <w14:ligatures w14:val="standardContextual"/>
             </w:rPr>
           </w:pPr>
-          <w:hyperlink w:anchor="_Toc238141448" w:history="1">
+          <w:hyperlink w:anchor="_Toc238481666" w:history="1">
             <w:r>
               <w:rPr>
                 <w:rStyle w:val="Hyperlink"/>
@@ -2275,7 +2306,7 @@
                 <w:noProof/>
                 <w:webHidden/>
               </w:rPr>
-              <w:instrText xml:space="preserve"> PAGEREF _Toc238141448 \h </w:instrText>
+              <w:instrText xml:space="preserve"> PAGEREF _Toc238481666 \h </w:instrText>
             </w:r>
             <w:r>
               <w:rPr>
@@ -2295,7 +2326,7 @@
                 <w:noProof/>
                 <w:webHidden/>
               </w:rPr>
-              <w:t>29</w:t>
+              <w:t>30</w:t>
             </w:r>
             <w:r>
               <w:rPr>
@@ -2320,7 +2351,7 @@
               <w14:ligatures w14:val="standardContextual"/>
             </w:rPr>
           </w:pPr>
-          <w:hyperlink w:anchor="_Toc238141449" w:history="1">
+          <w:hyperlink w:anchor="_Toc238481667" w:history="1">
             <w:r>
               <w:rPr>
                 <w:rStyle w:val="Hyperlink"/>
@@ -2363,7 +2394,7 @@
                 <w:noProof/>
                 <w:webHidden/>
               </w:rPr>
-              <w:instrText xml:space="preserve"> PAGEREF _Toc238141449 \h </w:instrText>
+              <w:instrText xml:space="preserve"> PAGEREF _Toc238481667 \h </w:instrText>
             </w:r>
             <w:r>
               <w:rPr>
@@ -2383,7 +2414,7 @@
                 <w:noProof/>
                 <w:webHidden/>
               </w:rPr>
-              <w:t>30</w:t>
+              <w:t>31</w:t>
             </w:r>
             <w:r>
               <w:rPr>
@@ -2558,7 +2589,7 @@
           <w:lang w:val="en-US"/>
         </w:rPr>
       </w:pPr>
-      <w:bookmarkStart w:id="1" w:name="_Toc238141426"/>
+      <w:bookmarkStart w:id="1" w:name="_Toc238481644"/>
       <w:r>
         <w:rPr>
           <w:b/>
@@ -2617,61 +2648,45 @@
         </w:rPr>
         <w:t xml:space="preserve">Предмет </w:t>
       </w:r>
-      <w:del w:id="2" w:author="Nikola Babić" w:date="2026-08-20T18:52:00Z" w16du:dateUtc="2026-08-20T16:52:00Z">
-        <w:r>
-          <w:rPr>
-            <w:color w:val="0F1115"/>
-            <w:szCs w:val="27"/>
-            <w:lang w:val="en-US"/>
-          </w:rPr>
-          <w:delText xml:space="preserve">овог </w:delText>
-        </w:r>
-      </w:del>
-      <w:ins w:id="3" w:author="Nikola Babić" w:date="2026-08-20T18:52:00Z" w16du:dateUtc="2026-08-20T16:52:00Z">
-        <w:r>
-          <w:rPr>
-            <w:color w:val="0F1115"/>
-            <w:szCs w:val="27"/>
-            <w:lang w:val="sr-Cyrl-RS"/>
-          </w:rPr>
-          <w:t>изучавања овог</w:t>
-        </w:r>
-        <w:r>
-          <w:rPr>
-            <w:color w:val="0F1115"/>
-            <w:szCs w:val="27"/>
-            <w:lang w:val="en-US"/>
-          </w:rPr>
-          <w:t xml:space="preserve"> </w:t>
-        </w:r>
-      </w:ins>
-      <w:r>
-        <w:rPr>
-          <w:color w:val="0F1115"/>
-          <w:szCs w:val="27"/>
-          <w:lang w:val="en-US"/>
-        </w:rPr>
-        <w:t xml:space="preserve">пројекта је класификација политичких ставова у коментарима на друштвеним мрежама који се односе на </w:t>
-      </w:r>
-      <w:commentRangeStart w:id="4"/>
-      <w:r>
-        <w:rPr>
-          <w:color w:val="0F1115"/>
-          <w:szCs w:val="27"/>
-          <w:lang w:val="en-US"/>
-        </w:rPr>
-        <w:t>студентске протесте у Србији</w:t>
-      </w:r>
-      <w:commentRangeEnd w:id="4"/>
-      <w:r>
-        <w:rPr>
-          <w:rStyle w:val="CommentReference"/>
-          <w:color w:val="0F1115"/>
-          <w:sz w:val="24"/>
-          <w:szCs w:val="27"/>
-          <w:lang w:val="en-US"/>
-        </w:rPr>
-        <w:commentReference w:id="4"/>
+      <w:r>
+        <w:rPr>
+          <w:color w:val="0F1115"/>
+          <w:szCs w:val="27"/>
+          <w:lang w:val="sr-Cyrl-RS"/>
+        </w:rPr>
+        <w:t>изучавања овог</w:t>
+      </w:r>
+      <w:r>
+        <w:rPr>
+          <w:color w:val="0F1115"/>
+          <w:szCs w:val="27"/>
+          <w:lang w:val="en-US"/>
+        </w:rPr>
+        <w:t xml:space="preserve"> </w:t>
+      </w:r>
+      <w:r>
+        <w:rPr>
+          <w:color w:val="0F1115"/>
+          <w:szCs w:val="27"/>
+          <w:lang w:val="en-US"/>
+        </w:rPr>
+        <w:t>пројекта је класификација политичких ставова у коментарима на друштвеним мрежама који се односе на</w:t>
+      </w:r>
+      <w:r>
+        <w:rPr>
+          <w:color w:val="0F1115"/>
+          <w:szCs w:val="27"/>
+          <w:lang w:val="sr-Cyrl-RS"/>
+        </w:rPr>
+        <w:t xml:space="preserve"> актуелна политичка дешавања у Србији у </w:t>
+      </w:r>
+      <w:r>
+        <w:rPr>
+          <w:color w:val="0F1115"/>
+          <w:szCs w:val="27"/>
+          <w:lang w:val="sr-Cyrl-RS"/>
+        </w:rPr>
+        <w:t>последње две године.</w:t>
       </w:r>
       <w:r>
         <w:rPr>
@@ -2723,61 +2738,69 @@
         </w:rPr>
         <w:t xml:space="preserve">За тематски домен одабрани су коментари са друштвених мрежа </w:t>
       </w:r>
-      <w:commentRangeStart w:id="5"/>
-      <w:r>
-        <w:rPr>
-          <w:color w:val="0F1115"/>
-          <w:szCs w:val="27"/>
-          <w:lang w:val="en-US"/>
-        </w:rPr>
-        <w:t>поводом студентских протеста у Србији, који су се догодили у периоду 2024-2026. године</w:t>
-      </w:r>
-      <w:commentRangeEnd w:id="5"/>
-      <w:r>
-        <w:rPr>
-          <w:rStyle w:val="CommentReference"/>
-          <w:color w:val="0F1115"/>
-          <w:sz w:val="24"/>
-          <w:szCs w:val="27"/>
-          <w:lang w:val="en-US"/>
-        </w:rPr>
-        <w:commentReference w:id="5"/>
-      </w:r>
-      <w:r>
-        <w:rPr>
-          <w:color w:val="0F1115"/>
-          <w:szCs w:val="27"/>
-          <w:lang w:val="en-US"/>
-        </w:rPr>
-        <w:t xml:space="preserve">. Ова тема је изабрана због високог степена поларизације у јавном дискурсу, што омогућава јасно разликовање различитих политичких ставова. Са друге стране, коментари на друштвеним мрежама карактеришу се неформалним језиком, </w:t>
-      </w:r>
-      <w:commentRangeStart w:id="6"/>
-      <w:r>
-        <w:rPr>
-          <w:color w:val="0F1115"/>
-          <w:szCs w:val="27"/>
-          <w:lang w:val="en-US"/>
-        </w:rPr>
-        <w:t>честом употребом сленга</w:t>
-      </w:r>
-      <w:commentRangeEnd w:id="6"/>
-      <w:r>
-        <w:rPr>
-          <w:rStyle w:val="CommentReference"/>
-          <w:color w:val="0F1115"/>
-          <w:sz w:val="24"/>
-          <w:szCs w:val="27"/>
-          <w:lang w:val="en-US"/>
-        </w:rPr>
-        <w:commentReference w:id="6"/>
-      </w:r>
-      <w:r>
-        <w:rPr>
-          <w:color w:val="0F1115"/>
-          <w:szCs w:val="27"/>
-          <w:lang w:val="en-US"/>
-        </w:rPr>
-        <w:t>, скраћеница и правописних грешака, што чини задатак додатно изазовним и релевантним за истраживање у области обраде природних језика.</w:t>
+      <w:r>
+        <w:rPr>
+          <w:color w:val="0F1115"/>
+          <w:szCs w:val="27"/>
+          <w:lang w:val="sr-Cyrl-RS"/>
+        </w:rPr>
+        <w:t xml:space="preserve">који коментаришу актуелности </w:t>
+      </w:r>
+      <w:r>
+        <w:rPr>
+          <w:color w:val="0F1115"/>
+          <w:szCs w:val="27"/>
+          <w:lang w:val="sr-Cyrl-RS"/>
+        </w:rPr>
+        <w:t xml:space="preserve">и појаве на политичкој сцени у Србији у периоду </w:t>
+      </w:r>
+      <w:r>
+        <w:rPr>
+          <w:color w:val="0F1115"/>
+          <w:szCs w:val="27"/>
+          <w:lang w:val="sr-Cyrl-RS"/>
+        </w:rPr>
+        <w:t>од појаве</w:t>
+      </w:r>
+      <w:r>
+        <w:rPr>
+          <w:color w:val="0F1115"/>
+          <w:szCs w:val="27"/>
+          <w:lang w:val="en-US"/>
+        </w:rPr>
+        <w:t xml:space="preserve"> студентских протеста у Србији</w:t>
+      </w:r>
+      <w:r>
+        <w:rPr>
+          <w:color w:val="0F1115"/>
+          <w:szCs w:val="27"/>
+          <w:lang w:val="sr-Cyrl-RS"/>
+        </w:rPr>
+        <w:t xml:space="preserve"> до тренутка израдде пројекта</w:t>
+      </w:r>
+      <w:r>
+        <w:rPr>
+          <w:color w:val="0F1115"/>
+          <w:szCs w:val="27"/>
+          <w:lang w:val="en-US"/>
+        </w:rPr>
+        <w:t>, који су се догодили у периоду 2024-2026. године. Ова тема је изабрана због високог степена поларизације у јавном дискурсу, што омогућава јасно разликовање различитих политичких ставова. Са друге стране, коментари на друштвеним мрежама карактеришу се неформалним језиком, честом употребом сленга,</w:t>
+      </w:r>
+      <w:r>
+        <w:rPr>
+          <w:color w:val="0F1115"/>
+          <w:szCs w:val="27"/>
+          <w:lang w:val="sr-Cyrl-RS"/>
+        </w:rPr>
+        <w:t xml:space="preserve"> вулгарних речи,</w:t>
+      </w:r>
+      <w:r>
+        <w:rPr>
+          <w:color w:val="0F1115"/>
+          <w:szCs w:val="27"/>
+          <w:lang w:val="en-US"/>
+        </w:rPr>
+        <w:t xml:space="preserve"> скраћеница и правописних грешака, што чини задатак додатно изазовним и релевантним за истраживање у области обраде природних језика.</w:t>
       </w:r>
     </w:p>
     <w:p>
@@ -2806,11 +2829,11 @@
         <w:pStyle w:val="Heading2"/>
         <w:jc w:val="both"/>
       </w:pPr>
-      <w:bookmarkStart w:id="7" w:name="_Toc238141427"/>
+      <w:bookmarkStart w:id="2" w:name="_Toc238481645"/>
       <w:r>
         <w:t>1.1. Категорије политичких ставова у скупу података</w:t>
       </w:r>
-      <w:bookmarkEnd w:id="7"/>
+      <w:bookmarkEnd w:id="2"/>
     </w:p>
     <w:p>
       <w:pPr>
@@ -2832,36 +2855,22 @@
         </w:rPr>
         <w:t>Скуп података обухвата коментаре који су класификовани у три категорије политичких ставова</w:t>
       </w:r>
-      <w:del w:id="8" w:author="Nikola Babić" w:date="2026-08-20T18:54:00Z" w16du:dateUtc="2026-08-20T16:54:00Z">
-        <w:r>
-          <w:rPr>
-            <w:color w:val="0F1115"/>
-            <w:szCs w:val="27"/>
-            <w:lang w:val="en-US"/>
-          </w:rPr>
-          <w:delText xml:space="preserve"> </w:delText>
-        </w:r>
-      </w:del>
-      <w:ins w:id="9" w:author="Nikola Babić" w:date="2026-08-20T18:54:00Z" w16du:dateUtc="2026-08-20T16:54:00Z">
-        <w:r>
-          <w:rPr>
-            <w:color w:val="0F1115"/>
-            <w:szCs w:val="27"/>
-            <w:lang w:val="sr-Cyrl-RS"/>
-          </w:rPr>
-          <w:t>у односу на подршку тренутној власти</w:t>
-        </w:r>
-      </w:ins>
-      <w:del w:id="10" w:author="Nikola Babić" w:date="2026-08-20T18:54:00Z" w16du:dateUtc="2026-08-20T16:54:00Z">
-        <w:r>
-          <w:rPr>
-            <w:color w:val="0F1115"/>
-            <w:szCs w:val="27"/>
-            <w:lang w:val="en-US"/>
-          </w:rPr>
-          <w:delText>према односу према студентским протестима и ширим политичким контекстом</w:delText>
-        </w:r>
-      </w:del>
+      <w:r>
+        <w:rPr>
+          <w:color w:val="0F1115"/>
+          <w:szCs w:val="27"/>
+          <w:lang w:val="sr-Cyrl-RS"/>
+        </w:rPr>
+        <w:t xml:space="preserve"> </w:t>
+      </w:r>
+      <w:r>
+        <w:rPr>
+          <w:color w:val="0F1115"/>
+          <w:szCs w:val="27"/>
+          <w:lang w:val="sr-Cyrl-RS"/>
+        </w:rPr>
+        <w:t>у односу на подршку тренутној власти</w:t>
+      </w:r>
       <w:r>
         <w:rPr>
           <w:color w:val="0F1115"/>
@@ -2897,35 +2906,6 @@
         <w:lastRenderedPageBreak/>
         <w:t xml:space="preserve">Против власти </w:t>
       </w:r>
-      <w:del w:id="11" w:author="Nikola Babić" w:date="2026-08-20T18:54:00Z" w16du:dateUtc="2026-08-20T16:54:00Z">
-        <w:r>
-          <w:rPr>
-            <w:b/>
-            <w:bCs/>
-            <w:color w:val="0F1115"/>
-            <w:lang w:val="en-US"/>
-          </w:rPr>
-          <w:delText>/</w:delText>
-        </w:r>
-      </w:del>
-      <w:del w:id="12" w:author="Nikola Babić" w:date="2026-08-20T18:50:00Z" w16du:dateUtc="2026-08-20T16:50:00Z">
-        <w:r>
-          <w:rPr>
-            <w:b/>
-            <w:bCs/>
-            <w:color w:val="0F1115"/>
-            <w:lang w:val="en-US"/>
-          </w:rPr>
-          <w:delText xml:space="preserve"> Подршка протестима</w:delText>
-        </w:r>
-        <w:r>
-          <w:rPr>
-            <w:color w:val="0F1115"/>
-            <w:lang w:val="en-US"/>
-          </w:rPr>
-          <w:delText> </w:delText>
-        </w:r>
-      </w:del>
       <w:r>
         <w:rPr>
           <w:color w:val="0F1115"/>
@@ -2959,24 +2939,15 @@
         </w:rPr>
         <w:t>За власт</w:t>
       </w:r>
-      <w:del w:id="13" w:author="Nikola Babić" w:date="2026-08-20T18:54:00Z" w16du:dateUtc="2026-08-20T16:54:00Z">
-        <w:r>
-          <w:rPr>
-            <w:b/>
-            <w:bCs/>
-            <w:color w:val="0F1115"/>
-            <w:lang w:val="en-US"/>
-          </w:rPr>
-          <w:delText xml:space="preserve"> / Противљење протестима</w:delText>
-        </w:r>
-        <w:r>
-          <w:rPr>
-            <w:color w:val="0F1115"/>
-            <w:lang w:val="en-US"/>
-          </w:rPr>
-          <w:delText> </w:delText>
-        </w:r>
-      </w:del>
+      <w:r>
+        <w:rPr>
+          <w:b/>
+          <w:bCs/>
+          <w:color w:val="0F1115"/>
+          <w:lang w:val="sr-Cyrl-RS"/>
+        </w:rPr>
+        <w:t xml:space="preserve"> </w:t>
+      </w:r>
       <w:r>
         <w:rPr>
           <w:color w:val="0F1115"/>
@@ -2984,7 +2955,7 @@
         </w:rPr>
         <w:t xml:space="preserve">– коментари који изражавају подршку властима и противљење студентским протестима. Карактерише их лексика противљења </w:t>
       </w:r>
-      <w:commentRangeStart w:id="14"/>
+      <w:commentRangeStart w:id="3"/>
       <w:r>
         <w:rPr>
           <w:color w:val="0F1115"/>
@@ -2992,7 +2963,7 @@
         </w:rPr>
         <w:t>(„наплаћени протести", „студенти су марионете", „ред и закон", „одржавање стабилности"</w:t>
       </w:r>
-      <w:commentRangeEnd w:id="14"/>
+      <w:commentRangeEnd w:id="3"/>
       <w:r>
         <w:rPr>
           <w:rStyle w:val="CommentReference"/>
@@ -3001,7 +2972,7 @@
           <w:szCs w:val="24"/>
           <w:lang w:val="en-US"/>
         </w:rPr>
-        <w:commentReference w:id="14"/>
+        <w:commentReference w:id="3"/>
       </w:r>
       <w:r>
         <w:rPr>
@@ -3036,25 +3007,15 @@
         </w:rPr>
         <w:t>Неутрални</w:t>
       </w:r>
-      <w:del w:id="15" w:author="Nikola Babić" w:date="2026-08-20T18:55:00Z" w16du:dateUtc="2026-08-20T16:55:00Z">
-        <w:r>
-          <w:rPr>
-            <w:b/>
-            <w:bCs/>
-            <w:color w:val="0F1115"/>
-            <w:lang w:val="en-US"/>
-          </w:rPr>
-          <w:delText xml:space="preserve"> / Информативни</w:delText>
-        </w:r>
-        <w:r>
-          <w:rPr>
-            <w:color w:val="0F1115"/>
-            <w:szCs w:val="27"/>
-            <w:lang w:val="en-US"/>
-          </w:rPr>
-          <w:delText> </w:delText>
-        </w:r>
-      </w:del>
+      <w:r>
+        <w:rPr>
+          <w:b/>
+          <w:bCs/>
+          <w:color w:val="0F1115"/>
+          <w:lang w:val="sr-Cyrl-RS"/>
+        </w:rPr>
+        <w:t xml:space="preserve"> </w:t>
+      </w:r>
       <w:r>
         <w:rPr>
           <w:color w:val="0F1115"/>
@@ -3099,7 +3060,7 @@
           <w:sz w:val="32"/>
         </w:rPr>
       </w:pPr>
-      <w:bookmarkStart w:id="16" w:name="_Toc238141428"/>
+      <w:bookmarkStart w:id="4" w:name="_Toc238481646"/>
       <w:r>
         <w:rPr>
           <w:sz w:val="32"/>
@@ -3109,7 +3070,7 @@
       <w:r>
         <w:t>.2. Циљ пројекта</w:t>
       </w:r>
-      <w:bookmarkEnd w:id="16"/>
+      <w:bookmarkEnd w:id="4"/>
     </w:p>
     <w:p>
       <w:pPr>
@@ -3131,51 +3092,29 @@
         </w:rPr>
         <w:t xml:space="preserve">Главни циљеви овог пројекта су имплементација, анализа и поређење различитих рачунарских решења која на основу текста једног коментара имају задатак да предвиде политички став који коментар изражава. Поред саме предикције, важан аспект рада односи се на испитивање лингвистичких и стилских одлика које највише доприносе ефикасном разликовању и диференцијацији обухваћених категорија. Истраживање је структурирано кроз неколико кључних фаза, почевши од прикупљања </w:t>
       </w:r>
-      <w:ins w:id="17" w:author="Nikola Babić" w:date="2026-08-20T19:01:00Z" w16du:dateUtc="2026-08-20T17:01:00Z">
-        <w:r>
-          <w:rPr>
-            <w:color w:val="0F1115"/>
-            <w:szCs w:val="27"/>
-            <w:lang w:val="sr-Cyrl-RS"/>
-          </w:rPr>
-          <w:t>необрађених</w:t>
-        </w:r>
-      </w:ins>
-      <w:del w:id="18" w:author="Nikola Babić" w:date="2026-08-20T19:01:00Z" w16du:dateUtc="2026-08-20T17:01:00Z">
-        <w:r>
-          <w:rPr>
-            <w:color w:val="0F1115"/>
-            <w:szCs w:val="27"/>
-            <w:lang w:val="en-US"/>
-          </w:rPr>
-          <w:delText xml:space="preserve">сирових </w:delText>
-        </w:r>
-      </w:del>
-      <w:r>
-        <w:rPr>
-          <w:color w:val="0F1115"/>
-          <w:szCs w:val="27"/>
-          <w:lang w:val="en-US"/>
-        </w:rPr>
-        <w:t xml:space="preserve">података, преко </w:t>
-      </w:r>
-      <w:del w:id="19" w:author="Nikola Babić" w:date="2026-08-20T18:59:00Z" w16du:dateUtc="2026-08-20T16:59:00Z">
-        <w:r>
-          <w:rPr>
-            <w:color w:val="0F1115"/>
-            <w:szCs w:val="27"/>
-            <w:lang w:val="en-US"/>
-          </w:rPr>
-          <w:delText xml:space="preserve">детаљне </w:delText>
-        </w:r>
-      </w:del>
-      <w:r>
-        <w:rPr>
-          <w:color w:val="0F1115"/>
-          <w:szCs w:val="27"/>
-          <w:lang w:val="en-US"/>
-        </w:rPr>
-        <w:t>анотације, па све до напредног моделовања и евалуације добијених резултата.</w:t>
+      <w:r>
+        <w:rPr>
+          <w:color w:val="0F1115"/>
+          <w:szCs w:val="27"/>
+          <w:lang w:val="sr-Cyrl-RS"/>
+        </w:rPr>
+        <w:t>необрађених</w:t>
+      </w:r>
+      <w:r>
+        <w:rPr>
+          <w:color w:val="0F1115"/>
+          <w:szCs w:val="27"/>
+          <w:lang w:val="sr-Cyrl-RS"/>
+        </w:rPr>
+        <w:t xml:space="preserve"> </w:t>
+      </w:r>
+      <w:r>
+        <w:rPr>
+          <w:color w:val="0F1115"/>
+          <w:szCs w:val="27"/>
+          <w:lang w:val="en-US"/>
+        </w:rPr>
+        <w:t>података, преко анотације, па све до напредног моделовања и евалуације добијених резултата.</w:t>
       </w:r>
     </w:p>
     <w:p>
@@ -3295,7 +3234,7 @@
           <w:lang w:val="sr-Cyrl-RS"/>
         </w:rPr>
       </w:pPr>
-      <w:bookmarkStart w:id="20" w:name="_Toc238141429"/>
+      <w:bookmarkStart w:id="5" w:name="_Toc238481647"/>
       <w:r>
         <w:rPr>
           <w:color w:val="0F1115"/>
@@ -3313,7 +3252,7 @@
         </w:rPr>
         <w:t>рикупљање података</w:t>
       </w:r>
-      <w:bookmarkEnd w:id="20"/>
+      <w:bookmarkEnd w:id="5"/>
     </w:p>
     <w:p>
       <w:pPr>
@@ -3332,76 +3271,39 @@
           <w:color w:val="0F1115"/>
           <w:szCs w:val="30"/>
         </w:rPr>
-        <w:t xml:space="preserve">У овом поглављу описан је целокупан процес формирања корпуса </w:t>
-      </w:r>
-      <w:del w:id="21" w:author="Nikola Babić" w:date="2026-08-20T18:59:00Z" w16du:dateUtc="2026-08-20T16:59:00Z">
-        <w:r>
-          <w:rPr>
-            <w:color w:val="0F1115"/>
-            <w:szCs w:val="30"/>
-          </w:rPr>
-          <w:delText>—</w:delText>
-        </w:r>
-      </w:del>
-      <w:r>
-        <w:rPr>
-          <w:color w:val="0F1115"/>
-          <w:szCs w:val="30"/>
-        </w:rPr>
-        <w:t xml:space="preserve"> од прикупљања </w:t>
-      </w:r>
-      <w:ins w:id="22" w:author="Nikola Babić" w:date="2026-08-20T19:01:00Z" w16du:dateUtc="2026-08-20T17:01:00Z">
-        <w:r>
-          <w:rPr>
-            <w:color w:val="0F1115"/>
-            <w:szCs w:val="30"/>
-            <w:lang w:val="sr-Cyrl-RS"/>
-          </w:rPr>
-          <w:t>необрађених</w:t>
-        </w:r>
-      </w:ins>
-      <w:del w:id="23" w:author="Nikola Babić" w:date="2026-08-20T19:01:00Z" w16du:dateUtc="2026-08-20T17:01:00Z">
-        <w:r>
-          <w:rPr>
-            <w:color w:val="0F1115"/>
-            <w:szCs w:val="30"/>
-          </w:rPr>
-          <w:delText xml:space="preserve">сирових </w:delText>
-        </w:r>
-      </w:del>
-      <w:r>
-        <w:rPr>
-          <w:color w:val="0F1115"/>
-          <w:szCs w:val="30"/>
-        </w:rPr>
-        <w:t xml:space="preserve">коментара са друштвених мрежа, </w:t>
-      </w:r>
-      <w:del w:id="24" w:author="Nikola Babić" w:date="2026-08-20T19:02:00Z" w16du:dateUtc="2026-08-20T17:02:00Z">
-        <w:r>
-          <w:rPr>
-            <w:color w:val="0F1115"/>
-            <w:szCs w:val="30"/>
-          </w:rPr>
-          <w:delText xml:space="preserve">преко </w:delText>
-        </w:r>
-      </w:del>
-      <w:r>
-        <w:rPr>
-          <w:color w:val="0F1115"/>
-          <w:szCs w:val="30"/>
-        </w:rPr>
-        <w:t>чишћења и стандардизације, до ручне анотације</w:t>
-      </w:r>
-      <w:ins w:id="25" w:author="Nikola Babić" w:date="2026-08-20T19:02:00Z" w16du:dateUtc="2026-08-20T17:02:00Z">
-        <w:r>
-          <w:rPr>
-            <w:color w:val="0F1115"/>
-            <w:szCs w:val="30"/>
-            <w:lang w:val="sr-Cyrl-RS"/>
-          </w:rPr>
-          <w:t xml:space="preserve"> коришћењем специјализовано израђених алата анотације за овај проблем</w:t>
-        </w:r>
-      </w:ins>
+        <w:t xml:space="preserve">У овом поглављу описан је целокупан процес формирања корпуса  од прикупљања </w:t>
+      </w:r>
+      <w:r>
+        <w:rPr>
+          <w:color w:val="0F1115"/>
+          <w:szCs w:val="30"/>
+          <w:lang w:val="sr-Cyrl-RS"/>
+        </w:rPr>
+        <w:t>необрађених</w:t>
+      </w:r>
+      <w:r>
+        <w:rPr>
+          <w:color w:val="0F1115"/>
+          <w:szCs w:val="30"/>
+          <w:lang w:val="sr-Cyrl-RS"/>
+        </w:rPr>
+        <w:t xml:space="preserve"> </w:t>
+      </w:r>
+      <w:r>
+        <w:rPr>
+          <w:color w:val="0F1115"/>
+          <w:szCs w:val="30"/>
+        </w:rPr>
+        <w:t>коментара са друштвених мрежа, чишћења и стандардизације, до ручне анотације</w:t>
+      </w:r>
+      <w:r>
+        <w:rPr>
+          <w:color w:val="0F1115"/>
+          <w:szCs w:val="30"/>
+          <w:lang w:val="sr-Cyrl-RS"/>
+        </w:rPr>
+        <w:t xml:space="preserve"> коришћењем специјализовано израђених алата анотације за овај проблем</w:t>
+      </w:r>
       <w:r>
         <w:rPr>
           <w:color w:val="0F1115"/>
@@ -3415,35 +3317,26 @@
         <w:pStyle w:val="Heading2"/>
         <w:jc w:val="both"/>
       </w:pPr>
-      <w:bookmarkStart w:id="26" w:name="_Toc238141430"/>
+      <w:bookmarkStart w:id="6" w:name="_Toc238481648"/>
       <w:r>
         <w:t xml:space="preserve">2.1. Прикупљање </w:t>
       </w:r>
-      <w:ins w:id="27" w:author="Nikola Babić" w:date="2026-08-20T19:05:00Z" w16du:dateUtc="2026-08-20T17:05:00Z">
-        <w:r>
-          <w:rPr>
-            <w:lang w:val="sr-Cyrl-RS"/>
-          </w:rPr>
-          <w:t>необрађених</w:t>
-        </w:r>
-      </w:ins>
-      <w:ins w:id="28" w:author="Nikola Babić" w:date="2026-08-20T19:03:00Z" w16du:dateUtc="2026-08-20T17:03:00Z">
-        <w:r>
-          <w:rPr>
-            <w:lang w:val="sr-Cyrl-RS"/>
-          </w:rPr>
-          <w:t xml:space="preserve"> </w:t>
-        </w:r>
-      </w:ins>
-      <w:del w:id="29" w:author="Nikola Babić" w:date="2026-08-20T19:03:00Z" w16du:dateUtc="2026-08-20T17:03:00Z">
-        <w:r>
-          <w:delText xml:space="preserve">сирових </w:delText>
-        </w:r>
-      </w:del>
+      <w:r>
+        <w:rPr>
+          <w:lang w:val="sr-Cyrl-RS"/>
+        </w:rPr>
+        <w:t>необрађених</w:t>
+      </w:r>
+      <w:r>
+        <w:rPr>
+          <w:lang w:val="sr-Cyrl-RS"/>
+        </w:rPr>
+        <w:t xml:space="preserve"> </w:t>
+      </w:r>
       <w:r>
         <w:t>података са друштвених мрежа</w:t>
       </w:r>
-      <w:bookmarkEnd w:id="26"/>
+      <w:bookmarkEnd w:id="6"/>
     </w:p>
     <w:p>
       <w:pPr>
@@ -3457,45 +3350,14 @@
           <w:szCs w:val="30"/>
         </w:rPr>
       </w:pPr>
-      <w:ins w:id="30" w:author="Nikola Babić" w:date="2026-08-20T19:04:00Z" w16du:dateUtc="2026-08-20T17:04:00Z">
-        <w:r>
-          <w:rPr>
-            <w:color w:val="0F1115"/>
-            <w:szCs w:val="30"/>
-            <w:lang w:val="sr-Cyrl-RS"/>
-          </w:rPr>
-          <w:t>Извор за корпус података модела</w:t>
-        </w:r>
-      </w:ins>
-      <w:ins w:id="31" w:author="Nikola Babić" w:date="2026-08-20T19:05:00Z" w16du:dateUtc="2026-08-20T17:05:00Z">
-        <w:r>
-          <w:rPr>
-            <w:color w:val="0F1115"/>
-            <w:szCs w:val="30"/>
-            <w:lang w:val="sr-Cyrl-RS"/>
-          </w:rPr>
-          <w:t xml:space="preserve">, </w:t>
-        </w:r>
-      </w:ins>
-      <w:ins w:id="32" w:author="Nikola Babić" w:date="2026-08-20T19:04:00Z" w16du:dateUtc="2026-08-20T17:04:00Z">
-        <w:r>
-          <w:rPr>
-            <w:color w:val="0F1115"/>
-            <w:szCs w:val="30"/>
-            <w:lang w:val="sr-Cyrl-RS"/>
-          </w:rPr>
-          <w:t xml:space="preserve"> </w:t>
-        </w:r>
-      </w:ins>
-      <w:del w:id="33" w:author="Nikola Babić" w:date="2026-08-20T19:04:00Z" w16du:dateUtc="2026-08-20T17:04:00Z">
-        <w:r>
-          <w:rPr>
-            <w:color w:val="0F1115"/>
-            <w:szCs w:val="30"/>
-          </w:rPr>
-          <w:delText xml:space="preserve">Полазну грађу </w:delText>
-        </w:r>
-      </w:del>
+      <w:r>
+        <w:rPr>
+          <w:color w:val="0F1115"/>
+          <w:szCs w:val="30"/>
+          <w:lang w:val="sr-Cyrl-RS"/>
+        </w:rPr>
+        <w:t xml:space="preserve">Извор за корпус података модела,  </w:t>
+      </w:r>
       <w:r>
         <w:rPr>
           <w:color w:val="0F1115"/>
@@ -3509,12 +3371,6 @@
           <w:bCs/>
           <w:color w:val="0F1115"/>
           <w:szCs w:val="30"/>
-          <w:rPrChange w:id="34" w:author="Nikola Babić" w:date="2026-08-20T19:05:00Z" w16du:dateUtc="2026-08-20T17:05:00Z">
-            <w:rPr>
-              <w:color w:val="0F1115"/>
-              <w:szCs w:val="30"/>
-            </w:rPr>
-          </w:rPrChange>
         </w:rPr>
         <w:t>Instagram</w:t>
       </w:r>
@@ -3531,12 +3387,6 @@
           <w:bCs/>
           <w:color w:val="0F1115"/>
           <w:szCs w:val="30"/>
-          <w:rPrChange w:id="35" w:author="Nikola Babić" w:date="2026-08-20T19:05:00Z" w16du:dateUtc="2026-08-20T17:05:00Z">
-            <w:rPr>
-              <w:color w:val="0F1115"/>
-              <w:szCs w:val="30"/>
-            </w:rPr>
-          </w:rPrChange>
         </w:rPr>
         <w:t>X</w:t>
       </w:r>
@@ -3553,12 +3403,6 @@
           <w:bCs/>
           <w:color w:val="0F1115"/>
           <w:szCs w:val="30"/>
-          <w:rPrChange w:id="36" w:author="Nikola Babić" w:date="2026-08-20T19:05:00Z" w16du:dateUtc="2026-08-20T17:05:00Z">
-            <w:rPr>
-              <w:color w:val="0F1115"/>
-              <w:szCs w:val="30"/>
-            </w:rPr>
-          </w:rPrChange>
         </w:rPr>
         <w:t>YouTube</w:t>
       </w:r>
@@ -3575,12 +3419,6 @@
           <w:bCs/>
           <w:color w:val="0F1115"/>
           <w:szCs w:val="30"/>
-          <w:rPrChange w:id="37" w:author="Nikola Babić" w:date="2026-08-20T19:05:00Z" w16du:dateUtc="2026-08-20T17:05:00Z">
-            <w:rPr>
-              <w:color w:val="0F1115"/>
-              <w:szCs w:val="30"/>
-            </w:rPr>
-          </w:rPrChange>
         </w:rPr>
         <w:t>Facebook</w:t>
       </w:r>
@@ -3589,43 +3427,16 @@
           <w:color w:val="0F1115"/>
           <w:szCs w:val="30"/>
         </w:rPr>
-        <w:t xml:space="preserve">. </w:t>
-      </w:r>
-      <w:del w:id="38" w:author="Nikola Babić" w:date="2026-08-20T19:06:00Z" w16du:dateUtc="2026-08-20T17:06:00Z">
-        <w:r>
-          <w:rPr>
-            <w:color w:val="0F1115"/>
-            <w:szCs w:val="30"/>
-          </w:rPr>
-          <w:delText>Одабир ових платформи није случајан —</w:delText>
-        </w:r>
-      </w:del>
-      <w:r>
-        <w:rPr>
-          <w:color w:val="0F1115"/>
-          <w:szCs w:val="30"/>
-        </w:rPr>
-        <w:t xml:space="preserve"> </w:t>
-      </w:r>
-      <w:ins w:id="39" w:author="Nikola Babić" w:date="2026-08-20T19:06:00Z" w16du:dateUtc="2026-08-20T17:06:00Z">
-        <w:r>
-          <w:rPr>
-            <w:color w:val="0F1115"/>
-            <w:szCs w:val="30"/>
-            <w:lang w:val="sr-Cyrl-RS"/>
-          </w:rPr>
-          <w:t>Управо ове платформе</w:t>
-        </w:r>
-      </w:ins>
-      <w:del w:id="40" w:author="Nikola Babić" w:date="2026-08-20T19:06:00Z" w16du:dateUtc="2026-08-20T17:06:00Z">
-        <w:r>
-          <w:rPr>
-            <w:color w:val="0F1115"/>
-            <w:szCs w:val="30"/>
-          </w:rPr>
-          <w:delText>оне</w:delText>
-        </w:r>
-      </w:del>
+        <w:t xml:space="preserve">.  </w:t>
+      </w:r>
+      <w:r>
+        <w:rPr>
+          <w:color w:val="0F1115"/>
+          <w:szCs w:val="30"/>
+          <w:lang w:val="sr-Cyrl-RS"/>
+        </w:rPr>
+        <w:t>Управо ове платформе</w:t>
+      </w:r>
       <w:r>
         <w:rPr>
           <w:color w:val="0F1115"/>
@@ -3653,44 +3464,21 @@
         </w:rPr>
         <w:t xml:space="preserve">Прикупљање је вршено претраживањем објава које се односе на студентске протесте у периоду 2024–2026. године, након чега су екстраховани сви коментари испод </w:t>
       </w:r>
-      <w:del w:id="41" w:author="Nikola Babić" w:date="2026-08-20T19:07:00Z" w16du:dateUtc="2026-08-20T17:07:00Z">
-        <w:r>
-          <w:rPr>
-            <w:color w:val="0F1115"/>
-            <w:szCs w:val="30"/>
-          </w:rPr>
-          <w:delText xml:space="preserve">тих </w:delText>
-        </w:r>
-      </w:del>
-      <w:ins w:id="42" w:author="Nikola Babić" w:date="2026-08-20T19:07:00Z" w16du:dateUtc="2026-08-20T17:07:00Z">
-        <w:r>
-          <w:rPr>
-            <w:color w:val="0F1115"/>
-            <w:szCs w:val="30"/>
-            <w:lang w:val="sr-Cyrl-RS"/>
-          </w:rPr>
-          <w:t>одабраних репрезента</w:t>
-        </w:r>
-      </w:ins>
-      <w:ins w:id="43" w:author="Nikola Babić" w:date="2026-08-20T19:08:00Z" w16du:dateUtc="2026-08-20T17:08:00Z">
-        <w:r>
-          <w:rPr>
-            <w:color w:val="0F1115"/>
-            <w:szCs w:val="30"/>
-            <w:lang w:val="sr-Cyrl-RS"/>
-          </w:rPr>
-          <w:t>тивнихи</w:t>
-        </w:r>
-      </w:ins>
-      <w:ins w:id="44" w:author="Nikola Babić" w:date="2026-08-20T19:07:00Z" w16du:dateUtc="2026-08-20T17:07:00Z">
-        <w:r>
-          <w:rPr>
-            <w:color w:val="0F1115"/>
-            <w:szCs w:val="30"/>
-          </w:rPr>
-          <w:t xml:space="preserve"> </w:t>
-        </w:r>
-      </w:ins>
+      <w:r>
+        <w:rPr>
+          <w:color w:val="0F1115"/>
+          <w:szCs w:val="30"/>
+          <w:lang w:val="sr-Cyrl-RS"/>
+        </w:rPr>
+        <w:t>одабраних репрезентативнихи</w:t>
+      </w:r>
+      <w:r>
+        <w:rPr>
+          <w:color w:val="0F1115"/>
+          <w:szCs w:val="30"/>
+        </w:rPr>
+        <w:t xml:space="preserve"> </w:t>
+      </w:r>
       <w:r>
         <w:rPr>
           <w:color w:val="0F1115"/>
@@ -3698,7 +3486,7 @@
         </w:rPr>
         <w:t xml:space="preserve">објава. Укупан број сирових коментара износио је </w:t>
       </w:r>
-      <w:commentRangeStart w:id="45"/>
+      <w:commentRangeStart w:id="7"/>
       <w:r>
         <w:rPr>
           <w:color w:val="0F1115"/>
@@ -3706,7 +3494,7 @@
         </w:rPr>
         <w:t>10.870, док је након чишћења задржано 8.912 коментара.</w:t>
       </w:r>
-      <w:commentRangeEnd w:id="45"/>
+      <w:commentRangeEnd w:id="7"/>
       <w:r>
         <w:rPr>
           <w:rStyle w:val="CommentReference"/>
@@ -3714,7 +3502,7 @@
           <w:sz w:val="24"/>
           <w:szCs w:val="30"/>
         </w:rPr>
-        <w:commentReference w:id="45"/>
+        <w:commentReference w:id="7"/>
       </w:r>
     </w:p>
     <w:p>
@@ -3836,32 +3624,21 @@
         </w:rPr>
         <w:t xml:space="preserve">, Instagram је најзаступљенија платформа у </w:t>
       </w:r>
-      <w:del w:id="46" w:author="Nikola Babić" w:date="2026-08-20T19:23:00Z" w16du:dateUtc="2026-08-20T17:23:00Z">
-        <w:r>
-          <w:rPr>
-            <w:color w:val="0F1115"/>
-            <w:szCs w:val="30"/>
-          </w:rPr>
-          <w:delText xml:space="preserve">сировом </w:delText>
-        </w:r>
-      </w:del>
-      <w:ins w:id="47" w:author="Nikola Babić" w:date="2026-08-20T19:23:00Z" w16du:dateUtc="2026-08-20T17:23:00Z">
-        <w:r>
-          <w:rPr>
-            <w:color w:val="0F1115"/>
-            <w:szCs w:val="30"/>
-            <w:lang w:val="sr-Cyrl-RS"/>
-          </w:rPr>
-          <w:t>необрађеном</w:t>
-        </w:r>
-        <w:r>
-          <w:rPr>
-            <w:color w:val="0F1115"/>
-            <w:szCs w:val="30"/>
-          </w:rPr>
-          <w:t xml:space="preserve"> </w:t>
-        </w:r>
-      </w:ins>
+      <w:r>
+        <w:rPr>
+          <w:color w:val="0F1115"/>
+          <w:szCs w:val="30"/>
+          <w:lang w:val="sr-Cyrl-RS"/>
+        </w:rPr>
+        <w:t>необрађеном</w:t>
+      </w:r>
+      <w:r>
+        <w:rPr>
+          <w:color w:val="0F1115"/>
+          <w:szCs w:val="30"/>
+        </w:rPr>
+        <w:t xml:space="preserve"> </w:t>
+      </w:r>
       <w:r>
         <w:rPr>
           <w:color w:val="0F1115"/>
@@ -3874,11 +3651,11 @@
       <w:pPr>
         <w:pStyle w:val="Heading2"/>
       </w:pPr>
-      <w:bookmarkStart w:id="48" w:name="_Toc238141431"/>
+      <w:bookmarkStart w:id="8" w:name="_Toc238481649"/>
       <w:r>
         <w:t>2.2. Чишћење и стандардизација корпуса</w:t>
       </w:r>
-      <w:bookmarkEnd w:id="48"/>
+      <w:bookmarkEnd w:id="8"/>
     </w:p>
     <w:p>
       <w:pPr>
@@ -3901,7 +3678,7 @@
         </w:rPr>
         <w:t xml:space="preserve">Сирови коментари са друштвених мрежа карактеришу се различитим облицима неформалности који би значајно отежали рад </w:t>
       </w:r>
-      <w:commentRangeStart w:id="49"/>
+      <w:commentRangeStart w:id="9"/>
       <w:r>
         <w:rPr>
           <w:color w:val="0F1115"/>
@@ -3910,7 +3687,7 @@
         </w:rPr>
         <w:t>класификационих модела</w:t>
       </w:r>
-      <w:commentRangeEnd w:id="49"/>
+      <w:commentRangeEnd w:id="9"/>
       <w:r>
         <w:rPr>
           <w:rStyle w:val="CommentReference"/>
@@ -3919,7 +3696,7 @@
           <w:szCs w:val="30"/>
           <w:lang w:val="en-GB"/>
         </w:rPr>
-        <w:commentReference w:id="49"/>
+        <w:commentReference w:id="9"/>
       </w:r>
       <w:r>
         <w:rPr>
@@ -3954,34 +3731,22 @@
         </w:rPr>
         <w:t xml:space="preserve">припрема </w:t>
       </w:r>
-      <w:del w:id="50" w:author="Nikola Babić" w:date="2026-08-20T19:25:00Z" w16du:dateUtc="2026-08-20T17:25:00Z">
-        <w:r>
-          <w:rPr>
-            <w:color w:val="0F1115"/>
-            <w:szCs w:val="30"/>
-            <w:lang w:val="en-GB"/>
-          </w:rPr>
-          <w:delText xml:space="preserve">сировог </w:delText>
-        </w:r>
-      </w:del>
-      <w:ins w:id="51" w:author="Nikola Babić" w:date="2026-08-20T19:25:00Z" w16du:dateUtc="2026-08-20T17:25:00Z">
-        <w:r>
-          <w:rPr>
-            <w:color w:val="0F1115"/>
-            <w:szCs w:val="30"/>
-            <w:lang w:val="sr-Cyrl-RS"/>
-          </w:rPr>
-          <w:t>необрађеног</w:t>
-        </w:r>
-        <w:r>
-          <w:rPr>
-            <w:color w:val="0F1115"/>
-            <w:szCs w:val="30"/>
-            <w:lang w:val="en-GB"/>
-          </w:rPr>
-          <w:t xml:space="preserve"> </w:t>
-        </w:r>
-      </w:ins>
+      <w:r>
+        <w:rPr>
+          <w:color w:val="0F1115"/>
+          <w:szCs w:val="30"/>
+          <w:lang w:val="sr-Cyrl-RS"/>
+        </w:rPr>
+        <w:t>необрађеног</w:t>
+      </w:r>
+      <w:r>
+        <w:rPr>
+          <w:color w:val="0F1115"/>
+          <w:szCs w:val="30"/>
+          <w:lang w:val="en-GB"/>
+        </w:rPr>
+        <w:t xml:space="preserve"> </w:t>
+      </w:r>
       <w:r>
         <w:rPr>
           <w:color w:val="0F1115"/>
@@ -4055,7 +3820,7 @@
           <w:sz w:val="32"/>
         </w:rPr>
       </w:pPr>
-      <w:bookmarkStart w:id="52" w:name="_Toc238141432"/>
+      <w:bookmarkStart w:id="10" w:name="_Toc238481650"/>
       <w:r>
         <w:rPr>
           <w:rFonts w:ascii="Times New Roman" w:hAnsi="Times New Roman" w:cs="Times New Roman"/>
@@ -4064,44 +3829,32 @@
         </w:rPr>
         <w:t xml:space="preserve">2.2.1. Припрема </w:t>
       </w:r>
-      <w:del w:id="53" w:author="Nikola Babić" w:date="2026-08-20T19:26:00Z" w16du:dateUtc="2026-08-20T17:26:00Z">
-        <w:r>
-          <w:rPr>
-            <w:rFonts w:ascii="Times New Roman" w:hAnsi="Times New Roman" w:cs="Times New Roman"/>
-            <w:color w:val="auto"/>
-            <w:sz w:val="32"/>
-          </w:rPr>
-          <w:delText xml:space="preserve">сировог </w:delText>
-        </w:r>
-      </w:del>
-      <w:ins w:id="54" w:author="Nikola Babić" w:date="2026-08-20T19:26:00Z" w16du:dateUtc="2026-08-20T17:26:00Z">
-        <w:r>
-          <w:rPr>
-            <w:rFonts w:ascii="Times New Roman" w:hAnsi="Times New Roman" w:cs="Times New Roman"/>
-            <w:color w:val="auto"/>
-            <w:sz w:val="32"/>
-            <w:lang w:val="sr-Cyrl-RS"/>
-          </w:rPr>
-          <w:t>необрађеног</w:t>
-        </w:r>
-        <w:r>
-          <w:rPr>
-            <w:rFonts w:ascii="Times New Roman" w:hAnsi="Times New Roman" w:cs="Times New Roman"/>
-            <w:color w:val="auto"/>
-            <w:sz w:val="32"/>
-          </w:rPr>
-          <w:t xml:space="preserve"> </w:t>
-        </w:r>
-      </w:ins>
       <w:r>
         <w:rPr>
           <w:rFonts w:ascii="Times New Roman" w:hAnsi="Times New Roman" w:cs="Times New Roman"/>
           <w:color w:val="auto"/>
           <w:sz w:val="32"/>
+          <w:lang w:val="sr-Cyrl-RS"/>
+        </w:rPr>
+        <w:t>необрађеног</w:t>
+      </w:r>
+      <w:r>
+        <w:rPr>
+          <w:rFonts w:ascii="Times New Roman" w:hAnsi="Times New Roman" w:cs="Times New Roman"/>
+          <w:color w:val="auto"/>
+          <w:sz w:val="32"/>
+        </w:rPr>
+        <w:t xml:space="preserve"> </w:t>
+      </w:r>
+      <w:r>
+        <w:rPr>
+          <w:rFonts w:ascii="Times New Roman" w:hAnsi="Times New Roman" w:cs="Times New Roman"/>
+          <w:color w:val="auto"/>
+          <w:sz w:val="32"/>
         </w:rPr>
         <w:t>корпуса</w:t>
       </w:r>
-      <w:bookmarkEnd w:id="52"/>
+      <w:bookmarkEnd w:id="10"/>
       <w:r>
         <w:rPr>
           <w:rFonts w:ascii="Times New Roman" w:hAnsi="Times New Roman" w:cs="Times New Roman"/>
@@ -4130,32 +3883,21 @@
         </w:rPr>
         <w:t xml:space="preserve">Сви </w:t>
       </w:r>
-      <w:del w:id="55" w:author="Nikola Babić" w:date="2026-08-20T19:27:00Z" w16du:dateUtc="2026-08-20T17:27:00Z">
-        <w:r>
-          <w:rPr>
-            <w:color w:val="0F1115"/>
-            <w:szCs w:val="30"/>
-          </w:rPr>
-          <w:delText xml:space="preserve">експорти </w:delText>
-        </w:r>
-      </w:del>
-      <w:ins w:id="56" w:author="Nikola Babić" w:date="2026-08-20T19:27:00Z" w16du:dateUtc="2026-08-20T17:27:00Z">
-        <w:r>
-          <w:rPr>
-            <w:color w:val="0F1115"/>
-            <w:szCs w:val="30"/>
-            <w:lang w:val="sr-Cyrl-RS"/>
-          </w:rPr>
-          <w:t>преузети коментари</w:t>
-        </w:r>
-        <w:r>
-          <w:rPr>
-            <w:color w:val="0F1115"/>
-            <w:szCs w:val="30"/>
-          </w:rPr>
-          <w:t xml:space="preserve"> </w:t>
-        </w:r>
-      </w:ins>
+      <w:r>
+        <w:rPr>
+          <w:color w:val="0F1115"/>
+          <w:szCs w:val="30"/>
+          <w:lang w:val="sr-Cyrl-RS"/>
+        </w:rPr>
+        <w:t>преузети коментари</w:t>
+      </w:r>
+      <w:r>
+        <w:rPr>
+          <w:color w:val="0F1115"/>
+          <w:szCs w:val="30"/>
+        </w:rPr>
+        <w:t xml:space="preserve"> </w:t>
+      </w:r>
       <w:r>
         <w:rPr>
           <w:color w:val="0F1115"/>
@@ -4183,31 +3925,20 @@
         </w:rPr>
         <w:t>Емотикони и сродни графички симболи уклањају се регуларним изразом, након чега се узастопне белине сабијају у један размак. Овај корак је спроведен из два разлога. Прво, емотикони могу унети семантичку двосмисленост</w:t>
       </w:r>
-      <w:del w:id="57" w:author="Nikola Babić" w:date="2026-08-20T19:27:00Z" w16du:dateUtc="2026-08-20T17:27:00Z">
-        <w:r>
-          <w:rPr>
-            <w:color w:val="0F1115"/>
-            <w:szCs w:val="30"/>
-          </w:rPr>
-          <w:delText xml:space="preserve"> —</w:delText>
-        </w:r>
-      </w:del>
-      <w:ins w:id="58" w:author="Nikola Babić" w:date="2026-08-20T19:27:00Z" w16du:dateUtc="2026-08-20T17:27:00Z">
-        <w:r>
-          <w:rPr>
-            <w:color w:val="0F1115"/>
-            <w:szCs w:val="30"/>
-            <w:lang w:val="sr-Cyrl-RS"/>
-          </w:rPr>
-          <w:t>,</w:t>
-        </w:r>
-      </w:ins>
-      <w:r>
-        <w:rPr>
-          <w:color w:val="0F1115"/>
-          <w:szCs w:val="30"/>
-        </w:rPr>
-        <w:t xml:space="preserve"> исти симбол (нпр. палчеви горе) може пратити и коментаре подршке протестима и оне са саркастичном намером. </w:t>
+      <w:r>
+        <w:rPr>
+          <w:color w:val="0F1115"/>
+          <w:szCs w:val="30"/>
+          <w:lang w:val="sr-Cyrl-RS"/>
+        </w:rPr>
+        <w:t>,</w:t>
+      </w:r>
+      <w:r>
+        <w:rPr>
+          <w:color w:val="0F1115"/>
+          <w:szCs w:val="30"/>
+        </w:rPr>
+        <w:t xml:space="preserve"> исти симбол (нпр. палчеви горе) може пратити и коментаре подршке протестима и оне са саркастичном намером. Њихово </w:t>
       </w:r>
       <w:r>
         <w:rPr>
@@ -4215,34 +3946,23 @@
           <w:szCs w:val="30"/>
         </w:rPr>
         <w:lastRenderedPageBreak/>
-        <w:t xml:space="preserve">Њихово задржавање уносило би </w:t>
-      </w:r>
-      <w:del w:id="59" w:author="Nikola Babić" w:date="2026-08-20T19:29:00Z" w16du:dateUtc="2026-08-20T17:29:00Z">
-        <w:r>
-          <w:rPr>
-            <w:color w:val="0F1115"/>
-            <w:szCs w:val="30"/>
-          </w:rPr>
-          <w:delText xml:space="preserve">буку </w:delText>
-        </w:r>
-      </w:del>
-      <w:ins w:id="60" w:author="Nikola Babić" w:date="2026-08-20T19:29:00Z" w16du:dateUtc="2026-08-20T17:29:00Z">
-        <w:r>
-          <w:rPr>
-            <w:color w:val="0F1115"/>
-            <w:szCs w:val="30"/>
-            <w:lang w:val="sr-Cyrl-RS"/>
-          </w:rPr>
-          <w:t>шум</w:t>
-        </w:r>
-        <w:r>
-          <w:rPr>
-            <w:color w:val="0F1115"/>
-            <w:szCs w:val="30"/>
-          </w:rPr>
-          <w:t xml:space="preserve"> </w:t>
-        </w:r>
-      </w:ins>
+        <w:t xml:space="preserve">задржавање уносило би </w:t>
+      </w:r>
+      <w:r>
+        <w:rPr>
+          <w:color w:val="0F1115"/>
+          <w:szCs w:val="30"/>
+          <w:lang w:val="sr-Cyrl-RS"/>
+        </w:rPr>
+        <w:t>шум</w:t>
+      </w:r>
+      <w:r>
+        <w:rPr>
+          <w:color w:val="0F1115"/>
+          <w:szCs w:val="30"/>
+        </w:rPr>
+        <w:t xml:space="preserve"> </w:t>
+      </w:r>
       <w:r>
         <w:rPr>
           <w:color w:val="0F1115"/>
@@ -4262,12 +3982,6 @@
           <w:color w:val="0F1115"/>
           <w:szCs w:val="30"/>
           <w:lang w:val="sr-Cyrl-RS"/>
-          <w:rPrChange w:id="61" w:author="Nikola Babić" w:date="2026-08-20T19:30:00Z" w16du:dateUtc="2026-08-20T17:30:00Z">
-            <w:rPr>
-              <w:color w:val="0F1115"/>
-              <w:szCs w:val="30"/>
-            </w:rPr>
-          </w:rPrChange>
         </w:rPr>
       </w:pPr>
       <w:r>
@@ -4278,38 +3992,15 @@
         </w:rPr>
         <w:t xml:space="preserve">Правопис, ћирилица/латиница и садржај коментара нису </w:t>
       </w:r>
-      <w:del w:id="62" w:author="Nikola Babić" w:date="2026-08-20T19:30:00Z" w16du:dateUtc="2026-08-20T17:30:00Z">
-        <w:r>
-          <w:rPr>
-            <w:rStyle w:val="skip-quote-patch"/>
-            <w:color w:val="0F1115"/>
-            <w:szCs w:val="30"/>
-          </w:rPr>
-          <w:delText>„исправљани“ — текст остаје онакав какав је корисник написао, како би модел видео стварну употребу језика на мрежама.</w:delText>
-        </w:r>
-      </w:del>
-      <w:ins w:id="63" w:author="Nikola Babić" w:date="2026-08-20T19:30:00Z" w16du:dateUtc="2026-08-20T17:30:00Z">
-        <w:r>
-          <w:rPr>
-            <w:rStyle w:val="skip-quote-patch"/>
-            <w:color w:val="0F1115"/>
-            <w:szCs w:val="30"/>
-            <w:lang w:val="sr-Cyrl-RS"/>
-          </w:rPr>
-          <w:t>већински исправљани, исправљане су словне грешке у куцању где је то би</w:t>
-        </w:r>
-      </w:ins>
-      <w:ins w:id="64" w:author="Nikola Babić" w:date="2026-08-20T19:31:00Z" w16du:dateUtc="2026-08-20T17:31:00Z">
-        <w:r>
-          <w:rPr>
-            <w:rStyle w:val="skip-quote-patch"/>
-            <w:color w:val="0F1115"/>
-            <w:szCs w:val="30"/>
-            <w:lang w:val="sr-Cyrl-RS"/>
-          </w:rPr>
-          <w:t>ло уочено и процењено као ненамерна грешка.</w:t>
-        </w:r>
-      </w:ins>
+      <w:r>
+        <w:rPr>
+          <w:rStyle w:val="skip-quote-patch"/>
+          <w:color w:val="0F1115"/>
+          <w:szCs w:val="30"/>
+          <w:lang w:val="sr-Cyrl-RS"/>
+        </w:rPr>
+        <w:t>већински исправљани, исправљане су словне грешке у куцању где је то било уочено и процењено као ненамерна грешка.</w:t>
+      </w:r>
     </w:p>
     <w:p>
       <w:pPr>
@@ -4324,7 +4015,7 @@
           <w:szCs w:val="37"/>
         </w:rPr>
       </w:pPr>
-      <w:bookmarkStart w:id="65" w:name="_Toc238141433"/>
+      <w:bookmarkStart w:id="11" w:name="_Toc238481651"/>
       <w:r>
         <w:rPr>
           <w:rFonts w:ascii="Times New Roman" w:hAnsi="Times New Roman" w:cs="Times New Roman"/>
@@ -4334,7 +4025,7 @@
         </w:rPr>
         <w:t>2.2.2. Анотациони скуп</w:t>
       </w:r>
-      <w:bookmarkEnd w:id="65"/>
+      <w:bookmarkEnd w:id="11"/>
       <w:r>
         <w:rPr>
           <w:rFonts w:ascii="Times New Roman" w:hAnsi="Times New Roman" w:cs="Times New Roman"/>
@@ -4364,16 +4055,14 @@
         </w:rPr>
         <w:t xml:space="preserve">Из очишћеног корпуса ручно је </w:t>
       </w:r>
-      <w:ins w:id="66" w:author="Nikola Babić" w:date="2026-08-20T19:32:00Z" w16du:dateUtc="2026-08-20T17:32:00Z">
-        <w:r>
-          <w:rPr>
-            <w:color w:val="0F1115"/>
-            <w:szCs w:val="30"/>
-            <w:lang w:val="sr-Cyrl-RS"/>
-          </w:rPr>
-          <w:t xml:space="preserve">коришћењем специјализованог алата, </w:t>
-        </w:r>
-      </w:ins>
+      <w:r>
+        <w:rPr>
+          <w:color w:val="0F1115"/>
+          <w:szCs w:val="30"/>
+          <w:lang w:val="sr-Cyrl-RS"/>
+        </w:rPr>
+        <w:t xml:space="preserve">коришћењем специјализованог алата, </w:t>
+      </w:r>
       <w:r>
         <w:rPr>
           <w:color w:val="0F1115"/>
@@ -4381,16 +4070,14 @@
         </w:rPr>
         <w:t>издвојен подскуп</w:t>
       </w:r>
-      <w:ins w:id="67" w:author="Nikola Babić" w:date="2026-08-20T19:32:00Z" w16du:dateUtc="2026-08-20T17:32:00Z">
-        <w:r>
-          <w:rPr>
-            <w:color w:val="0F1115"/>
-            <w:szCs w:val="30"/>
-            <w:lang w:val="sr-Cyrl-RS"/>
-          </w:rPr>
-          <w:t xml:space="preserve"> података</w:t>
-        </w:r>
-      </w:ins>
+      <w:r>
+        <w:rPr>
+          <w:color w:val="0F1115"/>
+          <w:szCs w:val="30"/>
+          <w:lang w:val="sr-Cyrl-RS"/>
+        </w:rPr>
+        <w:t xml:space="preserve"> података</w:t>
+      </w:r>
       <w:r>
         <w:rPr>
           <w:color w:val="0F1115"/>
@@ -4398,16 +4085,14 @@
         </w:rPr>
         <w:t xml:space="preserve"> за обележавање</w:t>
       </w:r>
-      <w:ins w:id="68" w:author="Nikola Babić" w:date="2026-08-20T19:33:00Z" w16du:dateUtc="2026-08-20T17:33:00Z">
-        <w:r>
-          <w:rPr>
-            <w:color w:val="0F1115"/>
-            <w:szCs w:val="30"/>
-            <w:lang w:val="sr-Cyrl-RS"/>
-          </w:rPr>
-          <w:t xml:space="preserve"> који је био смислен и одговарао теми проучавања</w:t>
-        </w:r>
-      </w:ins>
+      <w:r>
+        <w:rPr>
+          <w:color w:val="0F1115"/>
+          <w:szCs w:val="30"/>
+          <w:lang w:val="sr-Cyrl-RS"/>
+        </w:rPr>
+        <w:t xml:space="preserve"> који је био смислен и одговарао теми проучавања</w:t>
+      </w:r>
       <w:r>
         <w:rPr>
           <w:color w:val="0F1115"/>
@@ -4415,34 +4100,22 @@
         </w:rPr>
         <w:t>.</w:t>
       </w:r>
-      <w:ins w:id="69" w:author="Nikola Babić" w:date="2026-08-20T19:34:00Z" w16du:dateUtc="2026-08-20T17:34:00Z">
-        <w:r>
-          <w:rPr>
-            <w:color w:val="0F1115"/>
-            <w:szCs w:val="30"/>
-            <w:lang w:val="sr-Cyrl-RS"/>
-          </w:rPr>
-          <w:t xml:space="preserve"> Одбацивани су коментари који превише дивергирају од теме објаве и немају политичку конотацију.</w:t>
-        </w:r>
-        <w:r>
-          <w:rPr>
-            <w:color w:val="0F1115"/>
-            <w:szCs w:val="30"/>
-            <w:lang w:val="sr-Cyrl-RS"/>
-          </w:rPr>
-          <w:t xml:space="preserve"> Пример филтрираних коментара јесу </w:t>
-        </w:r>
-      </w:ins>
-      <w:ins w:id="70" w:author="Nikola Babić" w:date="2026-08-20T19:35:00Z" w16du:dateUtc="2026-08-20T17:35:00Z">
-        <w:r>
-          <w:rPr>
-            <w:color w:val="0F1115"/>
-            <w:szCs w:val="30"/>
-            <w:lang w:val="sr-Cyrl-RS"/>
-          </w:rPr>
-          <w:t>препирке и вређања током коментарисања објава.</w:t>
-        </w:r>
-      </w:ins>
+      <w:r>
+        <w:rPr>
+          <w:color w:val="0F1115"/>
+          <w:szCs w:val="30"/>
+          <w:lang w:val="sr-Cyrl-RS"/>
+        </w:rPr>
+        <w:t xml:space="preserve"> Одбацивани су коментари који превише дивергирају од теме објаве и немају политичку конотацију.</w:t>
+      </w:r>
+      <w:r>
+        <w:rPr>
+          <w:color w:val="0F1115"/>
+          <w:szCs w:val="30"/>
+          <w:lang w:val="sr-Cyrl-RS"/>
+        </w:rPr>
+        <w:t xml:space="preserve"> Пример филтрираних коментара јесу препирке и вређања током коментарисања објава.</w:t>
+      </w:r>
       <w:r>
         <w:rPr>
           <w:color w:val="0F1115"/>
@@ -4450,75 +4123,44 @@
         </w:rPr>
         <w:t xml:space="preserve"> Приликом уписа ознаке текст се не нормализује додатно</w:t>
       </w:r>
-      <w:ins w:id="71" w:author="Nikola Babić" w:date="2026-08-20T19:31:00Z" w16du:dateUtc="2026-08-20T17:31:00Z">
-        <w:r>
-          <w:rPr>
-            <w:color w:val="0F1115"/>
-            <w:szCs w:val="30"/>
-            <w:lang w:val="sr-Cyrl-RS"/>
-          </w:rPr>
-          <w:t>,</w:t>
-        </w:r>
-      </w:ins>
-      <w:r>
-        <w:rPr>
-          <w:color w:val="0F1115"/>
-          <w:szCs w:val="30"/>
+      <w:r>
+        <w:rPr>
+          <w:color w:val="0F1115"/>
+          <w:szCs w:val="30"/>
+          <w:lang w:val="sr-Cyrl-RS"/>
+        </w:rPr>
+        <w:t>,</w:t>
+      </w:r>
+      <w:r>
+        <w:rPr>
+          <w:color w:val="0F1115"/>
+          <w:szCs w:val="30"/>
+        </w:rPr>
+        <w:t xml:space="preserve"> остаје оригинални коментар, уз URL и </w:t>
+      </w:r>
+      <w:r>
+        <w:rPr>
+          <w:color w:val="0F1115"/>
+          <w:szCs w:val="30"/>
+          <w:lang w:val="sr-Cyrl-RS"/>
+        </w:rPr>
+        <w:t xml:space="preserve">анотирану </w:t>
+      </w:r>
+      <w:r>
+        <w:rPr>
+          <w:color w:val="0F1115"/>
+          <w:szCs w:val="30"/>
+        </w:rPr>
+        <w:t>класу</w:t>
+      </w:r>
+      <w:r>
+        <w:rPr>
+          <w:color w:val="0F1115"/>
+          <w:szCs w:val="30"/>
+          <w:lang w:val="sr-Cyrl-RS"/>
         </w:rPr>
         <w:t xml:space="preserve"> </w:t>
       </w:r>
-      <w:del w:id="72" w:author="Nikola Babić" w:date="2026-08-20T19:31:00Z" w16du:dateUtc="2026-08-20T17:31:00Z">
-        <w:r>
-          <w:rPr>
-            <w:color w:val="0F1115"/>
-            <w:szCs w:val="30"/>
-          </w:rPr>
-          <w:delText xml:space="preserve">— </w:delText>
-        </w:r>
-      </w:del>
-      <w:r>
-        <w:rPr>
-          <w:color w:val="0F1115"/>
-          <w:szCs w:val="30"/>
-        </w:rPr>
-        <w:t xml:space="preserve">остаје оригинални коментар, уз URL и </w:t>
-      </w:r>
-      <w:ins w:id="73" w:author="Nikola Babić" w:date="2026-08-20T19:32:00Z" w16du:dateUtc="2026-08-20T17:32:00Z">
-        <w:r>
-          <w:rPr>
-            <w:color w:val="0F1115"/>
-            <w:szCs w:val="30"/>
-            <w:lang w:val="sr-Cyrl-RS"/>
-          </w:rPr>
-          <w:t xml:space="preserve">анотирану </w:t>
-        </w:r>
-      </w:ins>
-      <w:r>
-        <w:rPr>
-          <w:color w:val="0F1115"/>
-          <w:szCs w:val="30"/>
-        </w:rPr>
-        <w:t>класу</w:t>
-      </w:r>
-      <w:del w:id="74" w:author="Nikola Babić" w:date="2026-08-20T19:31:00Z" w16du:dateUtc="2026-08-20T17:31:00Z">
-        <w:r>
-          <w:rPr>
-            <w:color w:val="0F1115"/>
-            <w:szCs w:val="30"/>
-          </w:rPr>
-          <w:delText xml:space="preserve"> —</w:delText>
-        </w:r>
-      </w:del>
-      <w:ins w:id="75" w:author="Nikola Babić" w:date="2026-08-20T19:31:00Z" w16du:dateUtc="2026-08-20T17:31:00Z">
-        <w:r>
-          <w:rPr>
-            <w:color w:val="0F1115"/>
-            <w:szCs w:val="30"/>
-            <w:lang w:val="sr-Cyrl-RS"/>
-          </w:rPr>
-          <w:t xml:space="preserve"> </w:t>
-        </w:r>
-      </w:ins>
       <w:r>
         <w:rPr>
           <w:color w:val="0F1115"/>
@@ -4540,7 +4182,7 @@
           <w:szCs w:val="37"/>
         </w:rPr>
       </w:pPr>
-      <w:bookmarkStart w:id="76" w:name="_Toc238141434"/>
+      <w:bookmarkStart w:id="12" w:name="_Toc238481652"/>
       <w:r>
         <w:rPr>
           <w:rFonts w:ascii="Times New Roman" w:hAnsi="Times New Roman" w:cs="Times New Roman"/>
@@ -4569,7 +4211,7 @@
         </w:rPr>
         <w:t xml:space="preserve"> моделе</w:t>
       </w:r>
-      <w:bookmarkEnd w:id="76"/>
+      <w:bookmarkEnd w:id="12"/>
       <w:r>
         <w:rPr>
           <w:rFonts w:ascii="Times New Roman" w:hAnsi="Times New Roman" w:cs="Times New Roman"/>
@@ -4668,25 +4310,14 @@
         </w:rPr>
         <w:t xml:space="preserve">стемовање </w:t>
       </w:r>
-      <w:ins w:id="77" w:author="Nikola Babić" w:date="2026-08-20T19:37:00Z" w16du:dateUtc="2026-08-20T17:37:00Z">
-        <w:r>
-          <w:rPr>
-            <w:color w:val="0F1115"/>
-            <w:szCs w:val="30"/>
-            <w:lang w:val="sr-Cyrl-RS"/>
-          </w:rPr>
-          <w:t>-</w:t>
-        </w:r>
-      </w:ins>
-      <w:del w:id="78" w:author="Nikola Babić" w:date="2026-08-20T19:37:00Z" w16du:dateUtc="2026-08-20T17:37:00Z">
-        <w:r>
-          <w:rPr>
-            <w:color w:val="0F1115"/>
-            <w:szCs w:val="30"/>
-          </w:rPr>
-          <w:delText>—</w:delText>
-        </w:r>
-      </w:del>
+      <w:r>
+        <w:rPr>
+          <w:color w:val="0F1115"/>
+          <w:szCs w:val="30"/>
+          <w:lang w:val="sr-Cyrl-RS"/>
+        </w:rPr>
+        <w:t>-</w:t>
+      </w:r>
       <w:r>
         <w:rPr>
           <w:color w:val="0F1115"/>
@@ -4717,25 +4348,14 @@
         </w:rPr>
         <w:t xml:space="preserve">лематизација </w:t>
       </w:r>
-      <w:ins w:id="79" w:author="Nikola Babić" w:date="2026-08-20T19:37:00Z" w16du:dateUtc="2026-08-20T17:37:00Z">
-        <w:r>
-          <w:rPr>
-            <w:color w:val="0F1115"/>
-            <w:szCs w:val="30"/>
-            <w:lang w:val="sr-Cyrl-RS"/>
-          </w:rPr>
-          <w:t>-</w:t>
-        </w:r>
-      </w:ins>
-      <w:del w:id="80" w:author="Nikola Babić" w:date="2026-08-20T19:37:00Z" w16du:dateUtc="2026-08-20T17:37:00Z">
-        <w:r>
-          <w:rPr>
-            <w:color w:val="0F1115"/>
-            <w:szCs w:val="30"/>
-          </w:rPr>
-          <w:delText>—</w:delText>
-        </w:r>
-      </w:del>
+      <w:r>
+        <w:rPr>
+          <w:color w:val="0F1115"/>
+          <w:szCs w:val="30"/>
+          <w:lang w:val="sr-Cyrl-RS"/>
+        </w:rPr>
+        <w:t>-</w:t>
+      </w:r>
       <w:r>
         <w:rPr>
           <w:color w:val="0F1115"/>
@@ -4850,7 +4470,7 @@
           <w:szCs w:val="37"/>
         </w:rPr>
       </w:pPr>
-      <w:bookmarkStart w:id="81" w:name="_Toc238141435"/>
+      <w:bookmarkStart w:id="13" w:name="_Toc238481653"/>
       <w:r>
         <w:rPr>
           <w:rFonts w:ascii="Times New Roman" w:hAnsi="Times New Roman" w:cs="Times New Roman"/>
@@ -4860,7 +4480,7 @@
         </w:rPr>
         <w:t>2.2.4. Енкодерски модели</w:t>
       </w:r>
-      <w:bookmarkEnd w:id="81"/>
+      <w:bookmarkEnd w:id="13"/>
       <w:r>
         <w:rPr>
           <w:rFonts w:ascii="Times New Roman" w:hAnsi="Times New Roman" w:cs="Times New Roman"/>
@@ -4890,35 +4510,14 @@
         </w:rPr>
         <w:t xml:space="preserve">BERTић и mBERT користе сопствени подречни токенизатор. Додатно ручно чишћење (стемовање/лематизација) се на њих не примењује, јер би нарушило репрезентацију коју модел већ учи из </w:t>
       </w:r>
-      <w:ins w:id="82" w:author="Nikola Babić" w:date="2026-08-20T19:38:00Z" w16du:dateUtc="2026-08-20T17:38:00Z">
-        <w:r>
-          <w:rPr>
-            <w:color w:val="0F1115"/>
-            <w:szCs w:val="30"/>
-            <w:lang w:val="sr-Cyrl-RS"/>
-          </w:rPr>
-          <w:t>необрађеног</w:t>
-        </w:r>
-      </w:ins>
-      <w:ins w:id="83" w:author="Nikola Babić" w:date="2026-08-20T19:39:00Z" w16du:dateUtc="2026-08-20T17:39:00Z">
-        <w:r>
-          <w:rPr>
-            <w:color w:val="0F1115"/>
-            <w:szCs w:val="30"/>
-            <w:lang w:val="sr-Cyrl-RS"/>
-          </w:rPr>
-          <w:t xml:space="preserve"> </w:t>
-        </w:r>
-      </w:ins>
-      <w:del w:id="84" w:author="Nikola Babić" w:date="2026-08-20T19:38:00Z" w16du:dateUtc="2026-08-20T17:38:00Z">
-        <w:r>
-          <w:rPr>
-            <w:color w:val="0F1115"/>
-            <w:szCs w:val="30"/>
-          </w:rPr>
-          <w:delText xml:space="preserve">сировог </w:delText>
-        </w:r>
-      </w:del>
+      <w:r>
+        <w:rPr>
+          <w:color w:val="0F1115"/>
+          <w:szCs w:val="30"/>
+          <w:lang w:val="sr-Cyrl-RS"/>
+        </w:rPr>
+        <w:t xml:space="preserve">необрађеног </w:t>
+      </w:r>
       <w:r>
         <w:rPr>
           <w:color w:val="0F1115"/>
@@ -4947,11 +4546,12 @@
           <w:szCs w:val="30"/>
         </w:rPr>
       </w:pPr>
-      <w:bookmarkStart w:id="85" w:name="_Toc238141436"/>
-      <w:r>
+      <w:bookmarkStart w:id="14" w:name="_Toc238481654"/>
+      <w:r>
+        <w:lastRenderedPageBreak/>
         <w:t>2.3. Анотација коментара</w:t>
       </w:r>
-      <w:bookmarkEnd w:id="85"/>
+      <w:bookmarkEnd w:id="14"/>
     </w:p>
     <w:p>
       <w:pPr>
@@ -5003,16 +4603,14 @@
         </w:rPr>
         <w:t> – коментари који</w:t>
       </w:r>
-      <w:ins w:id="86" w:author="Nikola Babić" w:date="2026-08-20T19:40:00Z" w16du:dateUtc="2026-08-20T17:40:00Z">
-        <w:r>
-          <w:rPr>
-            <w:color w:val="0F1115"/>
-            <w:szCs w:val="30"/>
-            <w:lang w:val="sr-Cyrl-RS"/>
-          </w:rPr>
-          <w:t xml:space="preserve"> директно критикују власт и њене представнике,</w:t>
-        </w:r>
-      </w:ins>
+      <w:r>
+        <w:rPr>
+          <w:color w:val="0F1115"/>
+          <w:szCs w:val="30"/>
+          <w:lang w:val="sr-Cyrl-RS"/>
+        </w:rPr>
+        <w:t xml:space="preserve"> директно критикују власт и њене представнике,</w:t>
+      </w:r>
       <w:r>
         <w:rPr>
           <w:color w:val="0F1115"/>
@@ -5020,16 +4618,14 @@
         </w:rPr>
         <w:t xml:space="preserve"> подржавају студентске протесте и критикују </w:t>
       </w:r>
-      <w:ins w:id="87" w:author="Nikola Babić" w:date="2026-08-20T19:41:00Z" w16du:dateUtc="2026-08-20T17:41:00Z">
-        <w:r>
-          <w:rPr>
-            <w:color w:val="0F1115"/>
-            <w:szCs w:val="30"/>
-            <w:lang w:val="sr-Cyrl-RS"/>
-          </w:rPr>
-          <w:t xml:space="preserve">рад </w:t>
-        </w:r>
-      </w:ins>
+      <w:r>
+        <w:rPr>
+          <w:color w:val="0F1115"/>
+          <w:szCs w:val="30"/>
+          <w:lang w:val="sr-Cyrl-RS"/>
+        </w:rPr>
+        <w:t xml:space="preserve">рад </w:t>
+      </w:r>
       <w:r>
         <w:rPr>
           <w:color w:val="0F1115"/>
@@ -5037,25 +4633,14 @@
         </w:rPr>
         <w:t>институциј</w:t>
       </w:r>
-      <w:del w:id="88" w:author="Nikola Babić" w:date="2026-08-20T19:41:00Z" w16du:dateUtc="2026-08-20T17:41:00Z">
-        <w:r>
-          <w:rPr>
-            <w:color w:val="0F1115"/>
-            <w:szCs w:val="30"/>
-          </w:rPr>
-          <w:delText>е</w:delText>
-        </w:r>
-      </w:del>
-      <w:ins w:id="89" w:author="Nikola Babić" w:date="2026-08-20T19:41:00Z" w16du:dateUtc="2026-08-20T17:41:00Z">
-        <w:r>
-          <w:rPr>
-            <w:color w:val="0F1115"/>
-            <w:szCs w:val="30"/>
-            <w:lang w:val="sr-Cyrl-RS"/>
-          </w:rPr>
-          <w:t>а</w:t>
-        </w:r>
-      </w:ins>
+      <w:r>
+        <w:rPr>
+          <w:color w:val="0F1115"/>
+          <w:szCs w:val="30"/>
+          <w:lang w:val="sr-Cyrl-RS"/>
+        </w:rPr>
+        <w:t>а</w:t>
+      </w:r>
       <w:r>
         <w:rPr>
           <w:color w:val="0F1115"/>
@@ -5063,7 +4648,7 @@
         </w:rPr>
         <w:t>. Карактеристична лексика: </w:t>
       </w:r>
-      <w:commentRangeStart w:id="90"/>
+      <w:commentRangeStart w:id="15"/>
       <w:r>
         <w:rPr>
           <w:rStyle w:val="Emphasis"/>
@@ -5072,7 +4657,7 @@
         </w:rPr>
         <w:t>подржавам, правда, корупција, смењивање, транспарентност.</w:t>
       </w:r>
-      <w:commentRangeEnd w:id="90"/>
+      <w:commentRangeEnd w:id="15"/>
       <w:r>
         <w:rPr>
           <w:rStyle w:val="CommentReference"/>
@@ -5080,7 +4665,7 @@
           <w:sz w:val="24"/>
           <w:szCs w:val="30"/>
         </w:rPr>
-        <w:commentReference w:id="90"/>
+        <w:commentReference w:id="15"/>
       </w:r>
     </w:p>
     <w:p>
@@ -5113,16 +4698,14 @@
         </w:rPr>
         <w:t> – коментари који подржавају тренутну власт и доводе у питање легитимитет</w:t>
       </w:r>
-      <w:ins w:id="91" w:author="Nikola Babić" w:date="2026-08-20T19:43:00Z" w16du:dateUtc="2026-08-20T17:43:00Z">
-        <w:r>
-          <w:rPr>
-            <w:color w:val="0F1115"/>
-            <w:szCs w:val="30"/>
-            <w:lang w:val="sr-Cyrl-RS"/>
-          </w:rPr>
-          <w:t xml:space="preserve"> и искреност намере учесника</w:t>
-        </w:r>
-      </w:ins>
+      <w:r>
+        <w:rPr>
+          <w:color w:val="0F1115"/>
+          <w:szCs w:val="30"/>
+          <w:lang w:val="sr-Cyrl-RS"/>
+        </w:rPr>
+        <w:t xml:space="preserve"> и искреност намере учесника</w:t>
+      </w:r>
       <w:r>
         <w:rPr>
           <w:color w:val="0F1115"/>
@@ -5169,16 +4752,14 @@
         </w:rPr>
         <w:t> – коментари без израженог става</w:t>
       </w:r>
-      <w:ins w:id="92" w:author="Nikola Babić" w:date="2026-08-20T19:44:00Z" w16du:dateUtc="2026-08-20T17:44:00Z">
-        <w:r>
-          <w:rPr>
-            <w:color w:val="0F1115"/>
-            <w:szCs w:val="30"/>
-            <w:lang w:val="sr-Cyrl-RS"/>
-          </w:rPr>
-          <w:t xml:space="preserve"> или у сукобу и са влашћу и са опозицијом/студентима учесницима протеста</w:t>
-        </w:r>
-      </w:ins>
+      <w:r>
+        <w:rPr>
+          <w:color w:val="0F1115"/>
+          <w:szCs w:val="30"/>
+          <w:lang w:val="sr-Cyrl-RS"/>
+        </w:rPr>
+        <w:t xml:space="preserve"> или у сукобу и са влашћу и са опозицијом/студентима учесницима протеста</w:t>
+      </w:r>
       <w:r>
         <w:rPr>
           <w:color w:val="0F1115"/>
@@ -5186,16 +4767,14 @@
         </w:rPr>
         <w:t xml:space="preserve">, </w:t>
       </w:r>
-      <w:ins w:id="93" w:author="Nikola Babić" w:date="2026-08-20T19:45:00Z" w16du:dateUtc="2026-08-20T17:45:00Z">
-        <w:r>
-          <w:rPr>
-            <w:color w:val="0F1115"/>
-            <w:szCs w:val="30"/>
-            <w:lang w:val="sr-Cyrl-RS"/>
-          </w:rPr>
-          <w:t xml:space="preserve">они </w:t>
-        </w:r>
-      </w:ins>
+      <w:r>
+        <w:rPr>
+          <w:color w:val="0F1115"/>
+          <w:szCs w:val="30"/>
+          <w:lang w:val="sr-Cyrl-RS"/>
+        </w:rPr>
+        <w:t xml:space="preserve">они </w:t>
+      </w:r>
       <w:r>
         <w:rPr>
           <w:color w:val="0F1115"/>
@@ -5419,41 +4998,54 @@
           <w:color w:val="0F1115"/>
           <w:szCs w:val="30"/>
         </w:rPr>
+        <w:t>Најзаступљенија је класа PROTIV-VLASTI са 1.168 коментара (40,6%), следи ZA-VLAST са 1.038 (36,1%), док су неутрални к</w:t>
+      </w:r>
+      <w:r>
+        <w:rPr>
+          <w:color w:val="0F1115"/>
+          <w:szCs w:val="30"/>
+        </w:rPr>
+        <w:t>оментари најређи</w:t>
+      </w:r>
+      <w:r>
+        <w:rPr>
+          <w:color w:val="0F1115"/>
+          <w:szCs w:val="30"/>
+          <w:lang w:val="sr-Cyrl-RS"/>
+        </w:rPr>
+        <w:t>,</w:t>
+      </w:r>
+      <w:r>
+        <w:rPr>
+          <w:color w:val="0F1115"/>
+          <w:szCs w:val="30"/>
+        </w:rPr>
+        <w:t xml:space="preserve"> 668 (23,2%), </w:t>
+      </w:r>
+      <w:r>
+        <w:rPr>
+          <w:color w:val="0F1115"/>
+          <w:szCs w:val="30"/>
+          <w:lang w:val="en-GB"/>
+        </w:rPr>
+        <w:t xml:space="preserve"> што је </w:t>
+      </w:r>
+      <w:r>
+        <w:rPr>
+          <w:color w:val="0F1115"/>
+          <w:szCs w:val="30"/>
+          <w:lang w:val="en-GB"/>
+        </w:rPr>
         <w:lastRenderedPageBreak/>
-        <w:t>Најзаступљенија је класа PROTIV-VLASTI са 1.168 коментара (40,6%), следи ZA-VLAST са 1.038 (36,1%), док су неутрални к</w:t>
-      </w:r>
-      <w:r>
-        <w:rPr>
-          <w:color w:val="0F1115"/>
-          <w:szCs w:val="30"/>
-        </w:rPr>
-        <w:t>оментари најређи</w:t>
-      </w:r>
-      <w:ins w:id="94" w:author="Nikola Babić" w:date="2026-08-20T19:45:00Z" w16du:dateUtc="2026-08-20T17:45:00Z">
-        <w:r>
-          <w:rPr>
-            <w:color w:val="0F1115"/>
-            <w:szCs w:val="30"/>
-            <w:lang w:val="sr-Cyrl-RS"/>
-          </w:rPr>
-          <w:t>,</w:t>
-        </w:r>
-      </w:ins>
-      <w:del w:id="95" w:author="Nikola Babić" w:date="2026-08-20T19:45:00Z" w16du:dateUtc="2026-08-20T17:45:00Z">
-        <w:r>
-          <w:rPr>
-            <w:color w:val="0F1115"/>
-            <w:szCs w:val="30"/>
-          </w:rPr>
-          <w:delText xml:space="preserve"> —</w:delText>
-        </w:r>
-      </w:del>
-      <w:r>
-        <w:rPr>
-          <w:color w:val="0F1115"/>
-          <w:szCs w:val="30"/>
-        </w:rPr>
-        <w:t xml:space="preserve"> 668 (23,2%), </w:t>
+        <w:t>приказано на Слици 2.</w:t>
+      </w:r>
+      <w:r>
+        <w:rPr>
+          <w:color w:val="0F1115"/>
+          <w:szCs w:val="30"/>
+          <w:lang w:val="sr-Cyrl-RS"/>
+        </w:rPr>
+        <w:t>3</w:t>
       </w:r>
       <w:r>
         <w:rPr>
@@ -5461,74 +5053,16 @@
           <w:szCs w:val="30"/>
           <w:lang w:val="en-GB"/>
         </w:rPr>
-        <w:t> што је приказано на Слици 2.</w:t>
-      </w:r>
-      <w:r>
-        <w:rPr>
-          <w:color w:val="0F1115"/>
-          <w:szCs w:val="30"/>
-          <w:lang w:val="sr-Cyrl-RS"/>
-        </w:rPr>
-        <w:t>3</w:t>
-      </w:r>
-      <w:r>
-        <w:rPr>
-          <w:color w:val="0F1115"/>
-          <w:szCs w:val="30"/>
-          <w:lang w:val="en-GB"/>
-        </w:rPr>
         <w:t>. </w:t>
       </w:r>
-      <w:ins w:id="96" w:author="Nikola Babić" w:date="2026-08-20T19:46:00Z" w16du:dateUtc="2026-08-20T17:46:00Z">
-        <w:r>
-          <w:rPr>
-            <w:color w:val="0F1115"/>
-            <w:szCs w:val="30"/>
-            <w:lang w:val="sr-Cyrl-RS"/>
-          </w:rPr>
-          <w:t>И очекивано за овакав тип класификације да је неутрална класа м</w:t>
-        </w:r>
-      </w:ins>
-      <w:ins w:id="97" w:author="Nikola Babić" w:date="2026-08-20T19:47:00Z" w16du:dateUtc="2026-08-20T17:47:00Z">
-        <w:r>
-          <w:rPr>
-            <w:color w:val="0F1115"/>
-            <w:szCs w:val="30"/>
-            <w:lang w:val="sr-Cyrl-RS"/>
-          </w:rPr>
-          <w:t>ање заступљена јер је чист облик њеног појављивања изузетно тешко пронаћи. Из тог разлога приликом д</w:t>
-        </w:r>
-      </w:ins>
-      <w:ins w:id="98" w:author="Nikola Babić" w:date="2026-08-20T19:48:00Z" w16du:dateUtc="2026-08-20T17:48:00Z">
-        <w:r>
-          <w:rPr>
-            <w:color w:val="0F1115"/>
-            <w:szCs w:val="30"/>
-            <w:lang w:val="sr-Cyrl-RS"/>
-          </w:rPr>
-          <w:t>оговора око анотације постигнути су одређени компромиси</w:t>
-        </w:r>
-      </w:ins>
-      <w:ins w:id="99" w:author="Nikola Babić" w:date="2026-08-20T19:50:00Z" w16du:dateUtc="2026-08-20T17:50:00Z">
-        <w:r>
-          <w:rPr>
-            <w:color w:val="0F1115"/>
-            <w:szCs w:val="30"/>
-            <w:lang w:val="sr-Cyrl-RS"/>
-          </w:rPr>
-          <w:t xml:space="preserve"> и проширена схватања неутралних коме</w:t>
-        </w:r>
-      </w:ins>
-      <w:ins w:id="100" w:author="Nikola Babić" w:date="2026-08-20T19:51:00Z" w16du:dateUtc="2026-08-20T17:51:00Z">
-        <w:r>
-          <w:rPr>
-            <w:color w:val="0F1115"/>
-            <w:szCs w:val="30"/>
-            <w:lang w:val="sr-Cyrl-RS"/>
-          </w:rPr>
-          <w:t xml:space="preserve">нтара који су већ описани у подпоглављу 2.3. </w:t>
-        </w:r>
-      </w:ins>
+      <w:r>
+        <w:rPr>
+          <w:color w:val="0F1115"/>
+          <w:szCs w:val="30"/>
+          <w:lang w:val="sr-Cyrl-RS"/>
+        </w:rPr>
+        <w:t xml:space="preserve">И очекивано за овакав тип класификације да је неутрална класа мање заступљена јер је чист облик њеног појављивања изузетно тешко пронаћи. Из тог разлога приликом договора око анотације постигнути су одређени компромиси и проширена схватања неутралних коментара који су већ описани у подпоглављу 2.3. </w:t>
+      </w:r>
       <w:r>
         <w:rPr>
           <w:color w:val="0F1115"/>
@@ -5707,45 +5241,14 @@
         </w:rPr>
         <w:t>Анализирајући расподелу по платформама (Слика 2.4), уочава се релативно уравнотежен узорак</w:t>
       </w:r>
-      <w:ins w:id="101" w:author="Nikola Babić" w:date="2026-08-20T19:52:00Z" w16du:dateUtc="2026-08-20T17:52:00Z">
-        <w:r>
-          <w:rPr>
-            <w:color w:val="0F1115"/>
-            <w:szCs w:val="30"/>
-            <w:lang w:val="sr-Cyrl-RS"/>
-          </w:rPr>
-          <w:t>.</w:t>
-        </w:r>
-      </w:ins>
-      <w:ins w:id="102" w:author="Nikola Babić" w:date="2026-08-20T19:53:00Z" w16du:dateUtc="2026-08-20T17:53:00Z">
-        <w:r>
-          <w:rPr>
-            <w:color w:val="0F1115"/>
-            <w:szCs w:val="30"/>
-            <w:lang w:val="sr-Cyrl-RS"/>
-          </w:rPr>
-          <w:t xml:space="preserve"> </w:t>
-        </w:r>
-      </w:ins>
-      <w:del w:id="103" w:author="Nikola Babić" w:date="2026-08-20T19:52:00Z" w16du:dateUtc="2026-08-20T17:52:00Z">
-        <w:r>
-          <w:rPr>
-            <w:color w:val="0F1115"/>
-            <w:szCs w:val="30"/>
-          </w:rPr>
-          <w:delText xml:space="preserve"> — с</w:delText>
-        </w:r>
-      </w:del>
-      <w:ins w:id="104" w:author="Nikola Babić" w:date="2026-08-20T19:53:00Z" w16du:dateUtc="2026-08-20T17:53:00Z">
-        <w:r>
-          <w:rPr>
-            <w:color w:val="0F1115"/>
-            <w:szCs w:val="30"/>
-            <w:lang w:val="sr-Cyrl-RS"/>
-          </w:rPr>
-          <w:t>С</w:t>
-        </w:r>
-      </w:ins>
+      <w:r>
+        <w:rPr>
+          <w:color w:val="0F1115"/>
+          <w:szCs w:val="30"/>
+          <w:lang w:val="sr-Cyrl-RS"/>
+        </w:rPr>
+        <w:t>. С</w:t>
+      </w:r>
       <w:r>
         <w:rPr>
           <w:color w:val="0F1115"/>
@@ -5832,7 +5335,7 @@
           <w:lang w:val="sr-Cyrl-RS"/>
         </w:rPr>
       </w:pPr>
-      <w:commentRangeStart w:id="105"/>
+      <w:commentRangeStart w:id="16"/>
       <w:r>
         <w:rPr>
           <w:rStyle w:val="ds-markdown-html"/>
@@ -5842,7 +5345,7 @@
         </w:rPr>
         <w:t>Слика 2.4. Број анотираних коментара по платформи и класи</w:t>
       </w:r>
-      <w:commentRangeEnd w:id="105"/>
+      <w:commentRangeEnd w:id="16"/>
       <w:r>
         <w:rPr>
           <w:rStyle w:val="CommentReference"/>
@@ -5852,7 +5355,7 @@
           <w:shd w:val="clear" w:color="auto" w:fill="FFFFFF"/>
           <w:lang w:val="sr-Cyrl-RS"/>
         </w:rPr>
-        <w:commentReference w:id="105"/>
+        <w:commentReference w:id="16"/>
       </w:r>
     </w:p>
     <w:p>
@@ -6091,7 +5594,7 @@
           <w:lang w:val="sr-Cyrl-RS"/>
         </w:rPr>
       </w:pPr>
-      <w:commentRangeStart w:id="106"/>
+      <w:commentRangeStart w:id="17"/>
       <w:r>
         <w:rPr>
           <w:color w:val="0F1115"/>
@@ -6101,7 +5604,7 @@
         <w:lastRenderedPageBreak/>
         <w:t xml:space="preserve">Табела 2.1 </w:t>
       </w:r>
-      <w:commentRangeEnd w:id="106"/>
+      <w:commentRangeEnd w:id="17"/>
       <w:r>
         <w:rPr>
           <w:rStyle w:val="CommentReference"/>
@@ -6110,7 +5613,7 @@
           <w:szCs w:val="30"/>
           <w:lang w:val="sr-Cyrl-RS"/>
         </w:rPr>
-        <w:commentReference w:id="106"/>
+        <w:commentReference w:id="17"/>
       </w:r>
       <w:r>
         <w:rPr>
@@ -7006,25 +6509,14 @@
         </w:rPr>
         <w:t>Коментари који подржавају власт су у просеку најдужи (медијана 14 речи), док су неутрални најкраћи (медијана 9 речи). Ово је интуитивно очекивано</w:t>
       </w:r>
-      <w:ins w:id="107" w:author="Nikola Babić" w:date="2026-08-20T19:56:00Z" w16du:dateUtc="2026-08-20T17:56:00Z">
-        <w:r>
-          <w:rPr>
-            <w:color w:val="0F1115"/>
-            <w:szCs w:val="30"/>
-            <w:lang w:val="sr-Cyrl-RS"/>
-          </w:rPr>
-          <w:t>,</w:t>
-        </w:r>
-      </w:ins>
-      <w:del w:id="108" w:author="Nikola Babić" w:date="2026-08-20T19:56:00Z" w16du:dateUtc="2026-08-20T17:56:00Z">
-        <w:r>
-          <w:rPr>
-            <w:color w:val="0F1115"/>
-            <w:szCs w:val="30"/>
-          </w:rPr>
-          <w:delText xml:space="preserve"> —</w:delText>
-        </w:r>
-      </w:del>
+      <w:r>
+        <w:rPr>
+          <w:color w:val="0F1115"/>
+          <w:szCs w:val="30"/>
+          <w:lang w:val="sr-Cyrl-RS"/>
+        </w:rPr>
+        <w:t>,</w:t>
+      </w:r>
       <w:r>
         <w:rPr>
           <w:color w:val="0F1115"/>
@@ -7270,7 +6762,7 @@
         </w:rPr>
         <w:t xml:space="preserve">Посматрано по платформама, најдужи коментари потичу са </w:t>
       </w:r>
-      <w:commentRangeStart w:id="109"/>
+      <w:commentRangeStart w:id="18"/>
       <w:r>
         <w:rPr>
           <w:i/>
@@ -7287,7 +6779,7 @@
         </w:rPr>
         <w:t xml:space="preserve">-а </w:t>
       </w:r>
-      <w:commentRangeEnd w:id="109"/>
+      <w:commentRangeEnd w:id="18"/>
       <w:r>
         <w:rPr>
           <w:rStyle w:val="CommentReference"/>
@@ -7295,7 +6787,7 @@
           <w:sz w:val="24"/>
           <w:szCs w:val="30"/>
         </w:rPr>
-        <w:commentReference w:id="109"/>
+        <w:commentReference w:id="18"/>
       </w:r>
       <w:r>
         <w:rPr>
@@ -7320,7 +6812,7 @@
         </w:rPr>
         <w:t xml:space="preserve">-а, где корисници чешће остављају опширније изразе. На X-у су коментари очекивано краћи, што је последица </w:t>
       </w:r>
-      <w:commentRangeStart w:id="110"/>
+      <w:commentRangeStart w:id="19"/>
       <w:r>
         <w:rPr>
           <w:color w:val="0F1115"/>
@@ -7328,7 +6820,7 @@
         </w:rPr>
         <w:t>ограничења дужине твитова</w:t>
       </w:r>
-      <w:commentRangeEnd w:id="110"/>
+      <w:commentRangeEnd w:id="19"/>
       <w:r>
         <w:rPr>
           <w:rStyle w:val="CommentReference"/>
@@ -7336,7 +6828,7 @@
           <w:sz w:val="24"/>
           <w:szCs w:val="30"/>
         </w:rPr>
-        <w:commentReference w:id="110"/>
+        <w:commentReference w:id="19"/>
       </w:r>
       <w:r>
         <w:rPr>
@@ -7367,7 +6859,7 @@
           <w:szCs w:val="37"/>
         </w:rPr>
       </w:pPr>
-      <w:bookmarkStart w:id="111" w:name="_Toc238141437"/>
+      <w:bookmarkStart w:id="20" w:name="_Toc238481655"/>
       <w:r>
         <w:rPr>
           <w:rFonts w:ascii="Times New Roman" w:hAnsi="Times New Roman" w:cs="Times New Roman"/>
@@ -7377,7 +6869,7 @@
         </w:rPr>
         <w:t>2.4.3. Најчешће речи — семантички отисак класа</w:t>
       </w:r>
-      <w:bookmarkEnd w:id="111"/>
+      <w:bookmarkEnd w:id="20"/>
     </w:p>
     <w:p>
       <w:pPr>
@@ -7443,7 +6935,7 @@
         </w:rPr>
         <w:t>, што указује на патриотски дискурс. Код противника власти доминирају речи </w:t>
       </w:r>
-      <w:commentRangeStart w:id="112"/>
+      <w:commentRangeStart w:id="21"/>
       <w:r>
         <w:rPr>
           <w:rStyle w:val="Emphasis"/>
@@ -7459,7 +6951,7 @@
         </w:rPr>
         <w:t> </w:t>
       </w:r>
-      <w:commentRangeEnd w:id="112"/>
+      <w:commentRangeEnd w:id="21"/>
       <w:r>
         <w:rPr>
           <w:rStyle w:val="CommentReference"/>
@@ -7467,7 +6959,7 @@
           <w:sz w:val="24"/>
           <w:szCs w:val="30"/>
         </w:rPr>
-        <w:commentReference w:id="112"/>
+        <w:commentReference w:id="21"/>
       </w:r>
       <w:r>
         <w:rPr>
@@ -7872,7 +7364,7 @@
           <w:szCs w:val="45"/>
         </w:rPr>
       </w:pPr>
-      <w:bookmarkStart w:id="113" w:name="_Toc238141438"/>
+      <w:bookmarkStart w:id="22" w:name="_Toc238481656"/>
       <w:r>
         <w:rPr>
           <w:color w:val="0F1115"/>
@@ -7900,7 +7392,7 @@
         </w:rPr>
         <w:t>Обучавање и евалуација модела</w:t>
       </w:r>
-      <w:bookmarkEnd w:id="113"/>
+      <w:bookmarkEnd w:id="22"/>
     </w:p>
     <w:p>
       <w:pPr>
@@ -7925,24 +7417,18 @@
       <w:r>
         <w:t>) коментара који се односе на</w:t>
       </w:r>
-      <w:del w:id="114" w:author="Nikola Babić" w:date="2026-08-20T20:02:00Z" w16du:dateUtc="2026-08-20T18:02:00Z">
-        <w:r>
-          <w:delText xml:space="preserve"> </w:delText>
-        </w:r>
-      </w:del>
-      <w:ins w:id="115" w:author="Nikola Babić" w:date="2026-08-20T20:02:00Z" w16du:dateUtc="2026-08-20T18:02:00Z">
-        <w:r>
-          <w:rPr>
-            <w:lang w:val="sr-Cyrl-RS"/>
-          </w:rPr>
-          <w:t>став људи према тренутној власти у Србији</w:t>
-        </w:r>
-      </w:ins>
-      <w:del w:id="116" w:author="Nikola Babić" w:date="2026-08-20T20:02:00Z" w16du:dateUtc="2026-08-20T18:02:00Z">
-        <w:r>
-          <w:delText>студентске протесте у Србији</w:delText>
-        </w:r>
-      </w:del>
+      <w:r>
+        <w:rPr>
+          <w:lang w:val="sr-Cyrl-RS"/>
+        </w:rPr>
+        <w:t xml:space="preserve"> </w:t>
+      </w:r>
+      <w:r>
+        <w:rPr>
+          <w:lang w:val="sr-Cyrl-RS"/>
+        </w:rPr>
+        <w:t>став људи према тренутној власти у Србији</w:t>
+      </w:r>
       <w:r>
         <w:t xml:space="preserve">. Циљ ове фазе је да се успостави репрезентативна </w:t>
       </w:r>
@@ -8002,7 +7488,7 @@
           <w:lang w:val="sr-Cyrl-RS"/>
         </w:rPr>
       </w:pPr>
-      <w:bookmarkStart w:id="117" w:name="_Toc238141439"/>
+      <w:bookmarkStart w:id="23" w:name="_Toc238481657"/>
       <w:r>
         <w:rPr>
           <w:lang w:val="sr-Cyrl-RS"/>
@@ -8028,7 +7514,7 @@
         </w:rPr>
         <w:t>модели</w:t>
       </w:r>
-      <w:bookmarkEnd w:id="117"/>
+      <w:bookmarkEnd w:id="23"/>
       <w:r>
         <w:t xml:space="preserve"> </w:t>
       </w:r>
@@ -8092,7 +7578,7 @@
         </w:rPr>
         <w:t xml:space="preserve">Као baseline модели коришћени су </w:t>
       </w:r>
-      <w:commentRangeStart w:id="118"/>
+      <w:commentRangeStart w:id="24"/>
       <w:r>
         <w:rPr>
           <w:b/>
@@ -8105,7 +7591,7 @@
         </w:rPr>
         <w:t xml:space="preserve">Multinomial Naive Bayes </w:t>
       </w:r>
-      <w:commentRangeEnd w:id="118"/>
+      <w:commentRangeEnd w:id="24"/>
       <w:r>
         <w:rPr>
           <w:rStyle w:val="CommentReference"/>
@@ -8118,7 +7604,7 @@
           <w:szCs w:val="27"/>
           <w:lang w:val="en-US"/>
         </w:rPr>
-        <w:commentReference w:id="118"/>
+        <w:commentReference w:id="24"/>
       </w:r>
       <w:r>
         <w:rPr>
@@ -8311,7 +7797,7 @@
           <w:lang w:val="sr-Cyrl-RS"/>
         </w:rPr>
       </w:pPr>
-      <w:bookmarkStart w:id="119" w:name="_Toc238141440"/>
+      <w:bookmarkStart w:id="25" w:name="_Toc238481658"/>
       <w:r>
         <w:rPr>
           <w:rFonts w:ascii="Times New Roman" w:hAnsi="Times New Roman" w:cs="Times New Roman"/>
@@ -8338,7 +7824,7 @@
         </w:rPr>
         <w:t>етпроцесирање и репрезентација текста</w:t>
       </w:r>
-      <w:bookmarkEnd w:id="119"/>
+      <w:bookmarkEnd w:id="25"/>
     </w:p>
     <w:p>
       <w:pPr>
@@ -8672,7 +8158,7 @@
           <w:lang w:val="sr-Cyrl-RS"/>
         </w:rPr>
       </w:pPr>
-      <w:bookmarkStart w:id="120" w:name="_Toc238141441"/>
+      <w:bookmarkStart w:id="26" w:name="_Toc238481659"/>
       <w:r>
         <w:rPr>
           <w:rFonts w:ascii="Times New Roman" w:hAnsi="Times New Roman" w:cs="Times New Roman"/>
@@ -8707,7 +8193,7 @@
         </w:rPr>
         <w:t>Евалуација</w:t>
       </w:r>
-      <w:bookmarkEnd w:id="120"/>
+      <w:bookmarkEnd w:id="26"/>
     </w:p>
     <w:p>
       <w:pPr>
@@ -8970,7 +8456,7 @@
           <w:lang w:val="sr-Cyrl-RS"/>
         </w:rPr>
       </w:pPr>
-      <w:bookmarkStart w:id="121" w:name="_Toc238141442"/>
+      <w:bookmarkStart w:id="27" w:name="_Toc238481660"/>
       <w:r>
         <w:rPr>
           <w:rFonts w:ascii="Times New Roman" w:hAnsi="Times New Roman" w:cs="Times New Roman"/>
@@ -9005,7 +8491,7 @@
         </w:rPr>
         <w:t>Резултати</w:t>
       </w:r>
-      <w:bookmarkEnd w:id="121"/>
+      <w:bookmarkEnd w:id="27"/>
     </w:p>
     <w:p>
       <w:pPr>
@@ -9590,7 +9076,7 @@
           <w:noProof/>
         </w:rPr>
         <w:drawing>
-          <wp:inline distT="0" distB="0" distL="0" distR="0" wp14:anchorId="1313D8FD" wp14:editId="3480008E">
+          <wp:inline distT="0" distB="0" distL="0" distR="0" wp14:anchorId="1313D8FD" wp14:editId="3D68F17A">
             <wp:extent cx="5943600" cy="3328035"/>
             <wp:effectExtent l="0" t="0" r="0" b="0"/>
             <wp:docPr id="898205917" name="Picture 1"/>
@@ -9877,7 +9363,7 @@
           <w:noProof/>
         </w:rPr>
         <w:drawing>
-          <wp:inline distT="0" distB="0" distL="0" distR="0" wp14:anchorId="2C920BA3" wp14:editId="1DED526E">
+          <wp:inline distT="0" distB="0" distL="0" distR="0" wp14:anchorId="2C920BA3" wp14:editId="62FA750A">
             <wp:extent cx="4251960" cy="3056777"/>
             <wp:effectExtent l="0" t="0" r="0" b="0"/>
             <wp:docPr id="509868485" name="Picture 4"/>
@@ -10215,7 +9701,7 @@
           <w:noProof/>
         </w:rPr>
         <w:drawing>
-          <wp:inline distT="0" distB="0" distL="0" distR="0" wp14:anchorId="79D5321F" wp14:editId="2C2EE3FE">
+          <wp:inline distT="0" distB="0" distL="0" distR="0" wp14:anchorId="79D5321F" wp14:editId="0A5B1327">
             <wp:extent cx="4953000" cy="3560760"/>
             <wp:effectExtent l="0" t="0" r="0" b="0"/>
             <wp:docPr id="1245236040" name="Picture 3"/>
@@ -10571,7 +10057,7 @@
           <w:noProof/>
         </w:rPr>
         <w:drawing>
-          <wp:inline distT="0" distB="0" distL="0" distR="0" wp14:anchorId="53B33680" wp14:editId="665D811B">
+          <wp:inline distT="0" distB="0" distL="0" distR="0" wp14:anchorId="53B33680" wp14:editId="66DEBF3A">
             <wp:extent cx="4389120" cy="3111305"/>
             <wp:effectExtent l="0" t="0" r="0" b="0"/>
             <wp:docPr id="1521652836" name="Picture 8"/>
@@ -10696,7 +10182,7 @@
           <w:lang w:val="sr-Cyrl-RS"/>
         </w:rPr>
       </w:pPr>
-      <w:bookmarkStart w:id="122" w:name="_Toc238141443"/>
+      <w:bookmarkStart w:id="28" w:name="_Toc238481661"/>
       <w:r>
         <w:rPr>
           <w:rFonts w:ascii="Times New Roman" w:hAnsi="Times New Roman" w:cs="Times New Roman"/>
@@ -10723,7 +10209,7 @@
         </w:rPr>
         <w:t>Дискусија</w:t>
       </w:r>
-      <w:bookmarkEnd w:id="122"/>
+      <w:bookmarkEnd w:id="28"/>
     </w:p>
     <w:p>
       <w:pPr>
@@ -10882,11 +10368,6 @@
         <w:jc w:val="both"/>
         <w:rPr>
           <w:lang w:val="sr-Cyrl-RS"/>
-          <w:rPrChange w:id="123" w:author="Nikola Babić" w:date="2026-08-20T20:16:00Z" w16du:dateUtc="2026-08-20T18:16:00Z">
-            <w:rPr>
-              <w:lang w:val="en-US"/>
-            </w:rPr>
-          </w:rPrChange>
         </w:rPr>
       </w:pPr>
       <w:r>
@@ -10921,39 +10402,20 @@
         <w:rPr>
           <w:lang w:val="en-US"/>
         </w:rPr>
-        <w:t xml:space="preserve"> енкодери (BERTić и mBERT), који могу да искористе контекстуалне односе између речи, могу да превазиђу ограничења </w:t>
-      </w:r>
-      <w:commentRangeStart w:id="124"/>
-      <w:r>
-        <w:rPr>
-          <w:lang w:val="en-US"/>
-        </w:rPr>
-        <w:t>класич</w:t>
-      </w:r>
-      <w:commentRangeEnd w:id="124"/>
-      <w:r>
-        <w:rPr>
-          <w:rStyle w:val="CommentReference"/>
-          <w:sz w:val="24"/>
-          <w:szCs w:val="24"/>
-          <w:lang w:val="sr-Cyrl-RS"/>
-        </w:rPr>
-        <w:commentReference w:id="124"/>
-      </w:r>
-      <w:ins w:id="125" w:author="Nikola Babić" w:date="2026-08-20T20:16:00Z" w16du:dateUtc="2026-08-20T18:16:00Z">
-        <w:r>
-          <w:rPr>
-            <w:lang w:val="sr-Cyrl-RS"/>
-          </w:rPr>
-          <w:t>них прист</w:t>
-        </w:r>
-        <w:r>
-          <w:rPr>
-            <w:lang w:val="sr-Cyrl-RS"/>
-          </w:rPr>
-          <w:t>упа.</w:t>
-        </w:r>
-      </w:ins>
+        <w:t xml:space="preserve"> енкодери (BERTić и mBERT), који могу да искористе контекстуалне односе између речи, могу да превазиђу ограничења класич</w:t>
+      </w:r>
+      <w:r>
+        <w:rPr>
+          <w:lang w:val="sr-Cyrl-RS"/>
+        </w:rPr>
+        <w:t>них прист</w:t>
+      </w:r>
+      <w:r>
+        <w:rPr>
+          <w:lang w:val="sr-Cyrl-RS"/>
+        </w:rPr>
+        <w:t>упа.</w:t>
+      </w:r>
     </w:p>
     <w:p>
       <w:pPr>
@@ -10967,7 +10429,7 @@
       <w:pPr>
         <w:pStyle w:val="Heading2"/>
       </w:pPr>
-      <w:bookmarkStart w:id="126" w:name="_Toc238141444"/>
+      <w:bookmarkStart w:id="29" w:name="_Toc238481662"/>
       <w:r>
         <w:t>3.2</w:t>
       </w:r>
@@ -10977,7 +10439,7 @@
       <w:r>
         <w:t>Енкодер</w:t>
       </w:r>
-      <w:bookmarkEnd w:id="126"/>
+      <w:bookmarkEnd w:id="29"/>
       <w:r>
         <w:t xml:space="preserve">  </w:t>
       </w:r>
@@ -11115,7 +10577,7 @@
           <w:lang w:val="sr-Cyrl-RS"/>
         </w:rPr>
       </w:pPr>
-      <w:bookmarkStart w:id="127" w:name="_Toc238141445"/>
+      <w:bookmarkStart w:id="30" w:name="_Toc238481663"/>
       <w:r>
         <w:rPr>
           <w:rFonts w:ascii="Times New Roman" w:hAnsi="Times New Roman" w:cs="Times New Roman"/>
@@ -11151,7 +10613,7 @@
         </w:rPr>
         <w:t>Модели</w:t>
       </w:r>
-      <w:bookmarkEnd w:id="127"/>
+      <w:bookmarkEnd w:id="30"/>
     </w:p>
     <w:p>
       <w:pPr>
@@ -11309,7 +10771,7 @@
         </w:rPr>
         <w:t xml:space="preserve"> BERTić боље моделује локални идиом; mBERT нуди ширу мултилингвалну репрезентацију, али мање специјализације за </w:t>
       </w:r>
-      <w:commentRangeStart w:id="128"/>
+      <w:commentRangeStart w:id="31"/>
       <w:r>
         <w:rPr>
           <w:color w:val="0F1115"/>
@@ -11317,7 +10779,7 @@
         </w:rPr>
         <w:t>српски/BCMS</w:t>
       </w:r>
-      <w:commentRangeEnd w:id="128"/>
+      <w:commentRangeEnd w:id="31"/>
       <w:r>
         <w:rPr>
           <w:rStyle w:val="CommentReference"/>
@@ -11325,7 +10787,7 @@
           <w:sz w:val="24"/>
           <w:szCs w:val="27"/>
         </w:rPr>
-        <w:commentReference w:id="128"/>
+        <w:commentReference w:id="31"/>
       </w:r>
       <w:r>
         <w:rPr>
@@ -11355,7 +10817,7 @@
           <w:lang w:val="sr-Cyrl-RS"/>
         </w:rPr>
       </w:pPr>
-      <w:bookmarkStart w:id="129" w:name="_Toc238141446"/>
+      <w:bookmarkStart w:id="32" w:name="_Toc238481664"/>
       <w:r>
         <w:rPr>
           <w:rFonts w:ascii="Times New Roman" w:hAnsi="Times New Roman" w:cs="Times New Roman"/>
@@ -11400,7 +10862,7 @@
         </w:rPr>
         <w:t>Поставка и хиперпараметри</w:t>
       </w:r>
-      <w:bookmarkEnd w:id="129"/>
+      <w:bookmarkEnd w:id="32"/>
     </w:p>
     <w:p>
       <w:pPr>
@@ -12346,7 +11808,7 @@
         </w:rPr>
         <w:t xml:space="preserve">. Овај корак омогућава да се за финалну примену искористе сви расположиви означени подаци, након што је евалуација већ спроведена. BERTić и mBERT модели се чувају одвојено, како би се омогућили независан </w:t>
       </w:r>
-      <w:commentRangeStart w:id="130"/>
+      <w:commentRangeStart w:id="33"/>
       <w:r>
         <w:rPr>
           <w:color w:val="0F1115"/>
@@ -12355,7 +11817,7 @@
         </w:rPr>
         <w:t xml:space="preserve">инференс </w:t>
       </w:r>
-      <w:commentRangeEnd w:id="130"/>
+      <w:commentRangeEnd w:id="33"/>
       <w:r>
         <w:rPr>
           <w:rStyle w:val="CommentReference"/>
@@ -12364,7 +11826,7 @@
           <w:szCs w:val="27"/>
           <w:lang w:val="en-US"/>
         </w:rPr>
-        <w:commentReference w:id="130"/>
+        <w:commentReference w:id="33"/>
       </w:r>
       <w:r>
         <w:rPr>
@@ -12392,7 +11854,7 @@
           <w:lang w:val="sr-Cyrl-RS"/>
         </w:rPr>
       </w:pPr>
-      <w:bookmarkStart w:id="131" w:name="_Toc238141447"/>
+      <w:bookmarkStart w:id="34" w:name="_Toc238481665"/>
       <w:r>
         <w:rPr>
           <w:rFonts w:ascii="Times New Roman" w:hAnsi="Times New Roman" w:cs="Times New Roman"/>
@@ -12437,7 +11899,7 @@
         </w:rPr>
         <w:t>Резултати</w:t>
       </w:r>
-      <w:bookmarkEnd w:id="131"/>
+      <w:bookmarkEnd w:id="34"/>
     </w:p>
     <w:p>
       <w:pPr>
@@ -12674,7 +12136,7 @@
           <w:noProof/>
         </w:rPr>
         <w:drawing>
-          <wp:inline distT="0" distB="0" distL="0" distR="0" wp14:anchorId="452BD82B" wp14:editId="5C1D2D3E">
+          <wp:inline distT="0" distB="0" distL="0" distR="0" wp14:anchorId="452BD82B" wp14:editId="35325474">
             <wp:extent cx="4762500" cy="2300348"/>
             <wp:effectExtent l="0" t="0" r="0" b="0"/>
             <wp:docPr id="303430873" name="Picture 10"/>
@@ -15582,7 +15044,7 @@
         </w:rPr>
         <w:lastRenderedPageBreak/>
         <w:drawing>
-          <wp:inline distT="0" distB="0" distL="0" distR="0" wp14:anchorId="04D3C557" wp14:editId="66336100">
+          <wp:inline distT="0" distB="0" distL="0" distR="0" wp14:anchorId="04D3C557" wp14:editId="24ED0DAC">
             <wp:extent cx="4711700" cy="2918636"/>
             <wp:effectExtent l="0" t="0" r="0" b="0"/>
             <wp:docPr id="755663901" name="Picture 15"/>
@@ -16131,24 +15593,13 @@
         </w:rPr>
         <w:t>VLAST. Поређењем две матрице види се да BERTić доследно боље одваја све три класе, уз исти тип најчешћих грешака</w:t>
       </w:r>
-      <w:ins w:id="132" w:author="Nikola Babić" w:date="2026-08-20T20:23:00Z" w16du:dateUtc="2026-08-20T18:23:00Z">
-        <w:r>
-          <w:rPr>
-            <w:color w:val="0F1115"/>
-            <w:szCs w:val="27"/>
-          </w:rPr>
-          <w:t>,</w:t>
-        </w:r>
-      </w:ins>
-      <w:del w:id="133" w:author="Nikola Babić" w:date="2026-08-20T20:23:00Z" w16du:dateUtc="2026-08-20T18:23:00Z">
-        <w:r>
-          <w:rPr>
-            <w:color w:val="0F1115"/>
-            <w:szCs w:val="27"/>
-          </w:rPr>
-          <w:delText xml:space="preserve"> —</w:delText>
-        </w:r>
-      </w:del>
+      <w:r>
+        <w:rPr>
+          <w:color w:val="0F1115"/>
+          <w:szCs w:val="27"/>
+        </w:rPr>
+        <w:t>,</w:t>
+      </w:r>
       <w:r>
         <w:rPr>
           <w:color w:val="0F1115"/>
@@ -16179,7 +15630,7 @@
           <w:lang w:val="sr-Cyrl-RS"/>
         </w:rPr>
       </w:pPr>
-      <w:bookmarkStart w:id="134" w:name="_Toc238141448"/>
+      <w:bookmarkStart w:id="35" w:name="_Toc238481666"/>
       <w:r>
         <w:rPr>
           <w:rFonts w:ascii="Times New Roman" w:hAnsi="Times New Roman" w:cs="Times New Roman"/>
@@ -16216,7 +15667,7 @@
         </w:rPr>
         <w:t xml:space="preserve">. </w:t>
       </w:r>
-      <w:commentRangeStart w:id="135"/>
+      <w:commentRangeStart w:id="36"/>
       <w:r>
         <w:rPr>
           <w:rFonts w:ascii="Times New Roman" w:hAnsi="Times New Roman" w:cs="Times New Roman"/>
@@ -16226,8 +15677,8 @@
         </w:rPr>
         <w:t>Дискусија</w:t>
       </w:r>
-      <w:bookmarkEnd w:id="134"/>
-      <w:commentRangeEnd w:id="135"/>
+      <w:bookmarkEnd w:id="35"/>
+      <w:commentRangeEnd w:id="36"/>
       <w:r>
         <w:rPr>
           <w:rStyle w:val="CommentReference"/>
@@ -16237,7 +15688,7 @@
           <w:szCs w:val="24"/>
           <w:lang w:val="sr-Cyrl-RS"/>
         </w:rPr>
-        <w:commentReference w:id="135"/>
+        <w:commentReference w:id="36"/>
       </w:r>
     </w:p>
     <w:p>
@@ -16540,7 +15991,7 @@
           <w:lang w:val="sr-Cyrl-RS"/>
         </w:rPr>
       </w:pPr>
-      <w:bookmarkStart w:id="136" w:name="_Toc238141449"/>
+      <w:bookmarkStart w:id="37" w:name="_Toc238481667"/>
       <w:r>
         <w:rPr>
           <w:color w:val="0F1115"/>
@@ -16568,7 +16019,7 @@
         </w:rPr>
         <w:t>Закључак</w:t>
       </w:r>
-      <w:bookmarkEnd w:id="136"/>
+      <w:bookmarkEnd w:id="37"/>
     </w:p>
     <w:p>
       <w:pPr>
@@ -16867,8 +16318,8 @@
 </file>
 
 <file path=word/comments.xml><?xml version="1.0" encoding="utf-8"?>
-<w:comments xmlns:wpc="http://schemas.microsoft.com/office/word/2010/wordprocessingCanvas" xmlns:cx="http://schemas.microsoft.com/office/drawing/2014/chartex" xmlns:cx1="http://schemas.microsoft.com/office/drawing/2015/9/8/chartex" xmlns:cx2="http://schemas.microsoft.com/office/drawing/2015/10/21/chartex" xmlns:cx3="http://schemas.microsoft.com/office/drawing/2016/5/9/chartex" xmlns:cx4="http://schemas.microsoft.com/office/drawing/2016/5/10/chartex" xmlns:cx5="http://schemas.microsoft.com/office/drawing/2016/5/11/chartex" xmlns:cx6="http://schemas.microsoft.com/office/drawing/2016/5/12/chartex" xmlns:cx7="http://schemas.microsoft.com/office/drawing/2016/5/13/chartex" xmlns:cx8="http://schemas.microsoft.com/office/drawing/2016/5/14/chartex" xmlns:mc="http://schemas.openxmlformats.org/markup-compatibility/2006" xmlns:aink="http://schemas.microsoft.com/office/drawing/2016/ink" xmlns:am3d="http://schemas.microsoft.com/office/drawing/2017/model3d" xmlns:o="urn:schemas-microsoft-com:office:office" xmlns:oel="http://schemas.microsoft.com/office/2019/extlst" xmlns:r="http://schemas.openxmlformats.org/officeDocument/2006/relationships" xmlns:m="http://schemas.openxmlformats.org/officeDocument/2006/math" xmlns:v="urn:schemas-microsoft-com:vml" xmlns:wp14="http://schemas.microsoft.com/office/word/2010/wordprocessingDrawing" xmlns:wp="http://schemas.openxmlformats.org/drawingml/2006/wordprocessingDrawing" xmlns:w10="urn:schemas-microsoft-com:office:word" xmlns:w="http://schemas.openxmlformats.org/wordprocessingml/2006/main" xmlns:w14="http://schemas.microsoft.com/office/word/2010/wordml" xmlns:w15="http://schemas.microsoft.com/office/word/2012/wordml" xmlns:w16cei="http://schemas.microsoft.com/office/word/2026/wordml/cei" xmlns:w16cex="http://schemas.microsoft.com/office/word/2018/wordml/cex" xmlns:w16cid="http://schemas.microsoft.com/office/word/2016/wordml/cid" xmlns:w16="http://schemas.microsoft.com/office/word/2018/wordml" xmlns:w16du="http://schemas.microsoft.com/office/word/2023/wordml/word16du" xmlns:w16sdtdh="http://schemas.microsoft.com/office/word/2020/wordml/sdtdatahash" xmlns:w16sdtfl="http://schemas.microsoft.com/office/word/2024/wordml/sdtformatlock" xmlns:w16se="http://schemas.microsoft.com/office/word/2015/wordml/symex" xmlns:wpg="http://schemas.microsoft.com/office/word/2010/wordprocessingGroup" xmlns:wpi="http://schemas.microsoft.com/office/word/2010/wordprocessingInk" xmlns:wne="http://schemas.microsoft.com/office/word/2006/wordml" xmlns:wps="http://schemas.microsoft.com/office/word/2010/wordprocessingShape" mc:Ignorable="w14 w15 w16se w16cid w16 w16cex w16sdtdh w16sdtfl w16du wp14">
-  <w:comment w:id="4" w:author="Nikola Babić" w:date="2026-08-20T18:33:00Z" w:initials="NB">
+<w:comments xmlns:wpc="http://schemas.microsoft.com/office/word/2010/wordprocessingCanvas" xmlns:cx="http://schemas.microsoft.com/office/drawing/2014/chartex" xmlns:cx1="http://schemas.microsoft.com/office/drawing/2015/9/8/chartex" xmlns:cx2="http://schemas.microsoft.com/office/drawing/2015/10/21/chartex" xmlns:cx3="http://schemas.microsoft.com/office/drawing/2016/5/9/chartex" xmlns:cx4="http://schemas.microsoft.com/office/drawing/2016/5/10/chartex" xmlns:cx5="http://schemas.microsoft.com/office/drawing/2016/5/11/chartex" xmlns:cx6="http://schemas.microsoft.com/office/drawing/2016/5/12/chartex" xmlns:cx7="http://schemas.microsoft.com/office/drawing/2016/5/13/chartex" xmlns:cx8="http://schemas.microsoft.com/office/drawing/2016/5/14/chartex" xmlns:mc="http://schemas.openxmlformats.org/markup-compatibility/2006" xmlns:aink="http://schemas.microsoft.com/office/drawing/2016/ink" xmlns:am3d="http://schemas.microsoft.com/office/drawing/2017/model3d" xmlns:o="urn:schemas-microsoft-com:office:office" xmlns:oel="http://schemas.microsoft.com/office/2019/extlst" xmlns:r="http://schemas.openxmlformats.org/officeDocument/2006/relationships" xmlns:m="http://schemas.openxmlformats.org/officeDocument/2006/math" xmlns:v="urn:schemas-microsoft-com:vml" xmlns:wp14="http://schemas.microsoft.com/office/word/2010/wordprocessingDrawing" xmlns:wp="http://schemas.openxmlformats.org/drawingml/2006/wordprocessingDrawing" xmlns:w10="urn:schemas-microsoft-com:office:word" xmlns:w="http://schemas.openxmlformats.org/wordprocessingml/2006/main" xmlns:w14="http://schemas.microsoft.com/office/word/2010/wordml" xmlns:w15="http://schemas.microsoft.com/office/word/2012/wordml" xmlns:w16cex="http://schemas.microsoft.com/office/word/2018/wordml/cex" xmlns:w16cid="http://schemas.microsoft.com/office/word/2016/wordml/cid" xmlns:w16="http://schemas.microsoft.com/office/word/2018/wordml" xmlns:w16du="http://schemas.microsoft.com/office/word/2023/wordml/word16du" xmlns:w16sdtdh="http://schemas.microsoft.com/office/word/2020/wordml/sdtdatahash" xmlns:w16sdtfl="http://schemas.microsoft.com/office/word/2024/wordml/sdtformatlock" xmlns:w16se="http://schemas.microsoft.com/office/word/2015/wordml/symex" xmlns:wpg="http://schemas.microsoft.com/office/word/2010/wordprocessingGroup" xmlns:wpi="http://schemas.microsoft.com/office/word/2010/wordprocessingInk" xmlns:wne="http://schemas.microsoft.com/office/word/2006/wordml" xmlns:wps="http://schemas.microsoft.com/office/word/2010/wordprocessingShape" mc:Ignorable="w14 w15 w16se w16cid w16 w16cex w16sdtdh w16sdtfl w16du wp14">
+  <w:comment w:id="3" w:author="Nikola Babić" w:date="2026-08-20T19:28:00Z" w:initials="NB">
     <w:p>
       <w:pPr>
         <w:pStyle w:val="CommentText"/>
@@ -16883,11 +16334,11 @@
         <w:rPr>
           <w:lang w:val="sr-Cyrl-RS"/>
         </w:rPr>
-        <w:t xml:space="preserve">Ако сам добро разумео, а и такво смо класе именовали, нисмо више везани само за протесте него генерално став грађана по питању власти у периоду од појаве протеста до данас. </w:t>
+        <w:t>Да ли су ово реални примери, мало ми вештачки звуче поједини</w:t>
       </w:r>
     </w:p>
   </w:comment>
-  <w:comment w:id="5" w:author="Nikola Babić" w:date="2026-08-20T18:41:00Z" w:initials="NB">
+  <w:comment w:id="7" w:author="Nikola Babić" w:date="2026-08-20T19:23:00Z" w:initials="NB">
     <w:p>
       <w:pPr>
         <w:pStyle w:val="CommentText"/>
@@ -16902,23 +16353,23 @@
         <w:rPr>
           <w:lang w:val="sr-Cyrl-RS"/>
         </w:rPr>
-        <w:t xml:space="preserve">Нису нам све објаве </w:t>
+        <w:t xml:space="preserve">Јако велико одступање </w:t>
       </w:r>
       <w:r>
         <w:rPr>
           <w:lang w:val="ru-RU"/>
         </w:rPr>
-        <w:t>имале</w:t>
-      </w:r>
-      <w:r>
-        <w:rPr>
-          <w:lang w:val="sr-Cyrl-RS"/>
-        </w:rPr>
-        <w:t xml:space="preserve"> везе са студентима, већ генерално политичким и економским дешавањима у Србији.</w:t>
+        <w:t>инстаграма</w:t>
+      </w:r>
+      <w:r>
+        <w:rPr>
+          <w:lang w:val="sr-Cyrl-RS"/>
+        </w:rPr>
+        <w:t xml:space="preserve"> од осталих платформи и оставља простор за запиткивање о начну селекције репрезентативних коментара.</w:t>
       </w:r>
     </w:p>
   </w:comment>
-  <w:comment w:id="6" w:author="Nikola Babić" w:date="2026-08-20T18:42:00Z" w:initials="NB">
+  <w:comment w:id="9" w:author="Nikola Babić" w:date="2026-08-20T19:25:00Z" w:initials="NB">
     <w:p>
       <w:pPr>
         <w:pStyle w:val="CommentText"/>
@@ -16933,17 +16384,276 @@
         <w:rPr>
           <w:lang w:val="ru-RU"/>
         </w:rPr>
+        <w:t>З</w:t>
+      </w:r>
+      <w:r>
+        <w:rPr>
+          <w:lang w:val="sr-Cyrl-RS"/>
+        </w:rPr>
+        <w:t xml:space="preserve">ашто и које су то облици неформалности? </w:t>
+      </w:r>
+      <w:r>
+        <w:rPr>
+          <w:lang w:val="ru-RU"/>
+        </w:rPr>
+        <w:t>М</w:t>
+      </w:r>
+      <w:r>
+        <w:rPr>
+          <w:lang w:val="sr-Cyrl-RS"/>
+        </w:rPr>
+        <w:t>ало је непотпуна реченица</w:t>
+      </w:r>
+    </w:p>
+  </w:comment>
+  <w:comment w:id="15" w:author="Nikola Babić" w:date="2026-08-20T19:41:00Z" w:initials="NB">
+    <w:p>
+      <w:pPr>
+        <w:pStyle w:val="CommentText"/>
+      </w:pPr>
+      <w:r>
+        <w:rPr>
+          <w:rStyle w:val="CommentReference"/>
+        </w:rPr>
+        <w:annotationRef/>
+      </w:r>
+      <w:r>
+        <w:rPr>
+          <w:lang w:val="ru-RU"/>
+        </w:rPr>
+        <w:t>О</w:t>
+      </w:r>
+      <w:r>
+        <w:rPr>
+          <w:lang w:val="sr-Cyrl-RS"/>
+        </w:rPr>
+        <w:t xml:space="preserve">пет јако вештачки звучи, сва </w:t>
+      </w:r>
+      <w:r>
+        <w:rPr>
+          <w:lang w:val="ru-RU"/>
+        </w:rPr>
+        <w:t>три</w:t>
+      </w:r>
+      <w:r>
+        <w:rPr>
+          <w:lang w:val="sr-Cyrl-RS"/>
+        </w:rPr>
+        <w:t>,</w:t>
+      </w:r>
+      <w:r>
+        <w:rPr>
+          <w:lang w:val="ru-RU"/>
+        </w:rPr>
+        <w:t>плус</w:t>
+      </w:r>
+      <w:r>
+        <w:rPr>
+          <w:lang w:val="sr-Cyrl-RS"/>
+        </w:rPr>
+        <w:t xml:space="preserve"> је </w:t>
+      </w:r>
+      <w:r>
+        <w:rPr>
+          <w:lang w:val="ru-RU"/>
+        </w:rPr>
+        <w:t>репетитивно</w:t>
+      </w:r>
+      <w:r>
+        <w:rPr>
+          <w:lang w:val="sr-Cyrl-RS"/>
+        </w:rPr>
+        <w:t>, можда избацити прву појаву у 1.1</w:t>
+      </w:r>
+    </w:p>
+  </w:comment>
+  <w:comment w:id="16" w:author="Nikola Babić" w:date="2026-08-20T19:52:00Z" w:initials="NB">
+    <w:p>
+      <w:pPr>
+        <w:pStyle w:val="CommentText"/>
+      </w:pPr>
+      <w:r>
+        <w:rPr>
+          <w:rStyle w:val="CommentReference"/>
+        </w:rPr>
+        <w:annotationRef/>
+      </w:r>
+      <w:r>
+        <w:rPr>
+          <w:lang w:val="sr-Cyrl-RS"/>
+        </w:rPr>
+        <w:t>5 коментара непознатог порекла?</w:t>
+      </w:r>
+    </w:p>
+  </w:comment>
+  <w:comment w:id="17" w:author="Nikola Babić" w:date="2026-08-20T19:56:00Z" w:initials="NB">
+    <w:p>
+      <w:pPr>
+        <w:pStyle w:val="CommentText"/>
+      </w:pPr>
+      <w:r>
+        <w:rPr>
+          <w:rStyle w:val="CommentReference"/>
+        </w:rPr>
+        <w:annotationRef/>
+      </w:r>
+      <w:r>
+        <w:rPr>
+          <w:lang w:val="ru-RU"/>
+        </w:rPr>
+        <w:t>Да ли желимо овакав изглеед</w:t>
+      </w:r>
+      <w:r>
+        <w:rPr>
+          <w:lang w:val="sr-Cyrl-RS"/>
+        </w:rPr>
+        <w:t xml:space="preserve"> </w:t>
+      </w:r>
+      <w:r>
+        <w:rPr>
+          <w:lang w:val="ru-RU"/>
+        </w:rPr>
+        <w:t>табеле без ивица и поља?</w:t>
+      </w:r>
+    </w:p>
+  </w:comment>
+  <w:comment w:id="18" w:author="Nikola Babić" w:date="2026-08-20T19:58:00Z" w:initials="NB">
+    <w:p>
+      <w:pPr>
+        <w:pStyle w:val="CommentText"/>
+      </w:pPr>
+      <w:r>
+        <w:rPr>
+          <w:rStyle w:val="CommentReference"/>
+        </w:rPr>
+        <w:annotationRef/>
+      </w:r>
+      <w:r>
+        <w:rPr>
+          <w:lang w:val="ru-RU"/>
+        </w:rPr>
+        <w:t>А</w:t>
+      </w:r>
+      <w:r>
+        <w:rPr>
+          <w:lang w:val="sr-Cyrl-RS"/>
+        </w:rPr>
+        <w:t xml:space="preserve">ко ја добро </w:t>
+      </w:r>
+      <w:r>
+        <w:rPr>
+          <w:lang w:val="ru-RU"/>
+        </w:rPr>
+        <w:t>ћитам</w:t>
+      </w:r>
+      <w:r>
+        <w:rPr>
+          <w:lang w:val="sr-Cyrl-RS"/>
+        </w:rPr>
+        <w:t xml:space="preserve"> </w:t>
+      </w:r>
+      <w:r>
+        <w:rPr>
+          <w:lang w:val="ru-RU"/>
+        </w:rPr>
+        <w:t>график</w:t>
+      </w:r>
+      <w:r>
+        <w:rPr>
+          <w:lang w:val="sr-Cyrl-RS"/>
+        </w:rPr>
+        <w:t xml:space="preserve"> ово није тачно, </w:t>
+      </w:r>
+      <w:r>
+        <w:t xml:space="preserve">YT </w:t>
+      </w:r>
+      <w:r>
+        <w:rPr>
+          <w:lang w:val="sr-Cyrl-RS"/>
+        </w:rPr>
+        <w:t>и</w:t>
+      </w:r>
+      <w:r>
+        <w:t xml:space="preserve"> FB</w:t>
+      </w:r>
+    </w:p>
+  </w:comment>
+  <w:comment w:id="19" w:author="Nikola Babić" w:date="2026-08-20T19:58:00Z" w:initials="NB">
+    <w:p>
+      <w:pPr>
+        <w:pStyle w:val="CommentText"/>
+      </w:pPr>
+      <w:r>
+        <w:rPr>
+          <w:rStyle w:val="CommentReference"/>
+        </w:rPr>
+        <w:annotationRef/>
+      </w:r>
+      <w:r>
+        <w:rPr>
+          <w:lang w:val="ru-RU"/>
+        </w:rPr>
+        <w:t>О</w:t>
+      </w:r>
+      <w:r>
+        <w:rPr>
+          <w:lang w:val="sr-Cyrl-RS"/>
+        </w:rPr>
+        <w:t>во је укинуто ја мислим али је остала таква култура/форма писања па можда треба преправити</w:t>
+      </w:r>
+    </w:p>
+  </w:comment>
+  <w:comment w:id="21" w:author="Nikola Babić" w:date="2026-08-20T20:00:00Z" w:initials="NB">
+    <w:p>
+      <w:pPr>
+        <w:pStyle w:val="CommentText"/>
+      </w:pPr>
+      <w:r>
+        <w:rPr>
+          <w:rStyle w:val="CommentReference"/>
+        </w:rPr>
+        <w:annotationRef/>
+      </w:r>
+      <w:r>
+        <w:rPr>
+          <w:lang w:val="ru-RU"/>
+        </w:rPr>
+        <w:t>О</w:t>
+      </w:r>
+      <w:r>
+        <w:rPr>
+          <w:lang w:val="sr-Cyrl-RS"/>
+        </w:rPr>
+        <w:t>во баш одудара од садржаја на графику, и за власт исто мање више</w:t>
+      </w:r>
+    </w:p>
+  </w:comment>
+  <w:comment w:id="24" w:author="Nikola Babić" w:date="2026-08-20T20:05:00Z" w:initials="NB">
+    <w:p>
+      <w:pPr>
+        <w:pStyle w:val="CommentText"/>
+      </w:pPr>
+      <w:r>
+        <w:rPr>
+          <w:rStyle w:val="CommentReference"/>
+        </w:rPr>
+        <w:annotationRef/>
+      </w:r>
+      <w:r>
+        <w:rPr>
+          <w:lang w:val="ru-RU"/>
+        </w:rPr>
         <w:t>Д</w:t>
       </w:r>
       <w:r>
         <w:rPr>
           <w:lang w:val="sr-Cyrl-RS"/>
         </w:rPr>
-        <w:t>а ли допунити да има и псовки, нисам цензурисао у својим коментарима, јер сам сматрао да модел онда није релевантан. Овде нема коментара да неко неком мајку не поздрави.</w:t>
+        <w:t>о сад је било на српском, треба доследно користити. Рамотрити шта за остала имена исто</w:t>
       </w:r>
     </w:p>
   </w:comment>
-  <w:comment w:id="14" w:author="Nikola Babić" w:date="2026-08-20T19:28:00Z" w:initials="NB">
+  <w:comment w:id="31" w:author="Nikola Babić" w:date="2026-08-20T20:17:00Z" w:initials="NB">
     <w:p>
       <w:pPr>
         <w:pStyle w:val="CommentText"/>
@@ -16956,16 +16666,25 @@
       </w:r>
       <w:r>
         <w:rPr>
-          <w:lang w:val="sr-Cyrl-RS"/>
-        </w:rPr>
-        <w:t>Да ли су ово реални примери, мало ми вештачки звуче поједини</w:t>
+          <w:lang w:val="ru-RU"/>
+        </w:rPr>
+        <w:t>З</w:t>
+      </w:r>
+      <w:r>
+        <w:rPr>
+          <w:lang w:val="sr-Cyrl-RS"/>
+        </w:rPr>
+        <w:t>апис?</w:t>
       </w:r>
     </w:p>
   </w:comment>
-  <w:comment w:id="45" w:author="Nikola Babić" w:date="2026-08-20T19:23:00Z" w:initials="NB">
+  <w:comment w:id="33" w:author="Nikola Babić" w:date="2026-08-20T20:19:00Z" w:initials="NB">
     <w:p>
       <w:pPr>
         <w:pStyle w:val="CommentText"/>
+        <w:rPr>
+          <w:lang w:val="en-US"/>
+        </w:rPr>
       </w:pPr>
       <w:r>
         <w:rPr>
@@ -16975,399 +16694,19 @@
       </w:r>
       <w:r>
         <w:rPr>
-          <w:lang w:val="sr-Cyrl-RS"/>
-        </w:rPr>
-        <w:t xml:space="preserve">Јако велико одступање </w:t>
-      </w:r>
-      <w:r>
-        <w:rPr>
           <w:lang w:val="ru-RU"/>
         </w:rPr>
-        <w:t>инстаграма</w:t>
-      </w:r>
-      <w:r>
-        <w:rPr>
-          <w:lang w:val="sr-Cyrl-RS"/>
-        </w:rPr>
-        <w:t xml:space="preserve"> од осталих платформи и оставља простор за запиткивање о начну селекције репрезентативних коментара.</w:t>
+        <w:t>П</w:t>
+      </w:r>
+      <w:r>
+        <w:rPr>
+          <w:lang w:val="sr-Cyrl-RS"/>
+        </w:rPr>
+        <w:t>адеж?</w:t>
       </w:r>
     </w:p>
   </w:comment>
-  <w:comment w:id="49" w:author="Nikola Babić" w:date="2026-08-20T19:25:00Z" w:initials="NB">
-    <w:p>
-      <w:pPr>
-        <w:pStyle w:val="CommentText"/>
-      </w:pPr>
-      <w:r>
-        <w:rPr>
-          <w:rStyle w:val="CommentReference"/>
-        </w:rPr>
-        <w:annotationRef/>
-      </w:r>
-      <w:r>
-        <w:rPr>
-          <w:lang w:val="ru-RU"/>
-        </w:rPr>
-        <w:t>З</w:t>
-      </w:r>
-      <w:r>
-        <w:rPr>
-          <w:lang w:val="sr-Cyrl-RS"/>
-        </w:rPr>
-        <w:t xml:space="preserve">ашто и које су то облици неформалности? </w:t>
-      </w:r>
-      <w:r>
-        <w:rPr>
-          <w:lang w:val="ru-RU"/>
-        </w:rPr>
-        <w:t>М</w:t>
-      </w:r>
-      <w:r>
-        <w:rPr>
-          <w:lang w:val="sr-Cyrl-RS"/>
-        </w:rPr>
-        <w:t>ало је непотпуна реченица</w:t>
-      </w:r>
-    </w:p>
-  </w:comment>
-  <w:comment w:id="90" w:author="Nikola Babić" w:date="2026-08-20T19:41:00Z" w:initials="NB">
-    <w:p>
-      <w:pPr>
-        <w:pStyle w:val="CommentText"/>
-      </w:pPr>
-      <w:r>
-        <w:rPr>
-          <w:rStyle w:val="CommentReference"/>
-        </w:rPr>
-        <w:annotationRef/>
-      </w:r>
-      <w:r>
-        <w:rPr>
-          <w:lang w:val="ru-RU"/>
-        </w:rPr>
-        <w:t>О</w:t>
-      </w:r>
-      <w:r>
-        <w:rPr>
-          <w:lang w:val="sr-Cyrl-RS"/>
-        </w:rPr>
-        <w:t xml:space="preserve">пет јако вештачки звучи, сва </w:t>
-      </w:r>
-      <w:r>
-        <w:rPr>
-          <w:lang w:val="ru-RU"/>
-        </w:rPr>
-        <w:t>три</w:t>
-      </w:r>
-      <w:r>
-        <w:rPr>
-          <w:lang w:val="sr-Cyrl-RS"/>
-        </w:rPr>
-        <w:t>,</w:t>
-      </w:r>
-      <w:r>
-        <w:rPr>
-          <w:lang w:val="ru-RU"/>
-        </w:rPr>
-        <w:t>плус</w:t>
-      </w:r>
-      <w:r>
-        <w:rPr>
-          <w:lang w:val="sr-Cyrl-RS"/>
-        </w:rPr>
-        <w:t xml:space="preserve"> је </w:t>
-      </w:r>
-      <w:r>
-        <w:rPr>
-          <w:lang w:val="ru-RU"/>
-        </w:rPr>
-        <w:t>репетитивно</w:t>
-      </w:r>
-      <w:r>
-        <w:rPr>
-          <w:lang w:val="sr-Cyrl-RS"/>
-        </w:rPr>
-        <w:t>, можда избацити прву појаву у 1.1</w:t>
-      </w:r>
-    </w:p>
-  </w:comment>
-  <w:comment w:id="105" w:author="Nikola Babić" w:date="2026-08-20T19:52:00Z" w:initials="NB">
-    <w:p>
-      <w:pPr>
-        <w:pStyle w:val="CommentText"/>
-      </w:pPr>
-      <w:r>
-        <w:rPr>
-          <w:rStyle w:val="CommentReference"/>
-        </w:rPr>
-        <w:annotationRef/>
-      </w:r>
-      <w:r>
-        <w:rPr>
-          <w:lang w:val="sr-Cyrl-RS"/>
-        </w:rPr>
-        <w:t>5 коментара непознатог порекла?</w:t>
-      </w:r>
-    </w:p>
-  </w:comment>
-  <w:comment w:id="106" w:author="Nikola Babić" w:date="2026-08-20T19:56:00Z" w:initials="NB">
-    <w:p>
-      <w:pPr>
-        <w:pStyle w:val="CommentText"/>
-      </w:pPr>
-      <w:r>
-        <w:rPr>
-          <w:rStyle w:val="CommentReference"/>
-        </w:rPr>
-        <w:annotationRef/>
-      </w:r>
-      <w:r>
-        <w:rPr>
-          <w:lang w:val="ru-RU"/>
-        </w:rPr>
-        <w:t>Да ли желимо овакав изглеед</w:t>
-      </w:r>
-      <w:r>
-        <w:rPr>
-          <w:lang w:val="sr-Cyrl-RS"/>
-        </w:rPr>
-        <w:t xml:space="preserve"> </w:t>
-      </w:r>
-      <w:r>
-        <w:rPr>
-          <w:lang w:val="ru-RU"/>
-        </w:rPr>
-        <w:t>табеле без ивица и поља?</w:t>
-      </w:r>
-    </w:p>
-  </w:comment>
-  <w:comment w:id="109" w:author="Nikola Babić" w:date="2026-08-20T19:58:00Z" w:initials="NB">
-    <w:p>
-      <w:pPr>
-        <w:pStyle w:val="CommentText"/>
-      </w:pPr>
-      <w:r>
-        <w:rPr>
-          <w:rStyle w:val="CommentReference"/>
-        </w:rPr>
-        <w:annotationRef/>
-      </w:r>
-      <w:r>
-        <w:rPr>
-          <w:lang w:val="ru-RU"/>
-        </w:rPr>
-        <w:t>А</w:t>
-      </w:r>
-      <w:r>
-        <w:rPr>
-          <w:lang w:val="sr-Cyrl-RS"/>
-        </w:rPr>
-        <w:t xml:space="preserve">ко ја добро </w:t>
-      </w:r>
-      <w:r>
-        <w:rPr>
-          <w:lang w:val="ru-RU"/>
-        </w:rPr>
-        <w:t>ћитам</w:t>
-      </w:r>
-      <w:r>
-        <w:rPr>
-          <w:lang w:val="sr-Cyrl-RS"/>
-        </w:rPr>
-        <w:t xml:space="preserve"> </w:t>
-      </w:r>
-      <w:r>
-        <w:rPr>
-          <w:lang w:val="ru-RU"/>
-        </w:rPr>
-        <w:t>график</w:t>
-      </w:r>
-      <w:r>
-        <w:rPr>
-          <w:lang w:val="sr-Cyrl-RS"/>
-        </w:rPr>
-        <w:t xml:space="preserve"> ово није тачно, </w:t>
-      </w:r>
-      <w:r>
-        <w:t xml:space="preserve">YT </w:t>
-      </w:r>
-      <w:r>
-        <w:rPr>
-          <w:lang w:val="sr-Cyrl-RS"/>
-        </w:rPr>
-        <w:t>и</w:t>
-      </w:r>
-      <w:r>
-        <w:t xml:space="preserve"> FB</w:t>
-      </w:r>
-    </w:p>
-  </w:comment>
-  <w:comment w:id="110" w:author="Nikola Babić" w:date="2026-08-20T19:58:00Z" w:initials="NB">
-    <w:p>
-      <w:pPr>
-        <w:pStyle w:val="CommentText"/>
-      </w:pPr>
-      <w:r>
-        <w:rPr>
-          <w:rStyle w:val="CommentReference"/>
-        </w:rPr>
-        <w:annotationRef/>
-      </w:r>
-      <w:r>
-        <w:rPr>
-          <w:lang w:val="ru-RU"/>
-        </w:rPr>
-        <w:t>О</w:t>
-      </w:r>
-      <w:r>
-        <w:rPr>
-          <w:lang w:val="sr-Cyrl-RS"/>
-        </w:rPr>
-        <w:t>во је укинуто ја мислим али је остала таква култура/форма писања па можда треба преправити</w:t>
-      </w:r>
-    </w:p>
-  </w:comment>
-  <w:comment w:id="112" w:author="Nikola Babić" w:date="2026-08-20T20:00:00Z" w:initials="NB">
-    <w:p>
-      <w:pPr>
-        <w:pStyle w:val="CommentText"/>
-      </w:pPr>
-      <w:r>
-        <w:rPr>
-          <w:rStyle w:val="CommentReference"/>
-        </w:rPr>
-        <w:annotationRef/>
-      </w:r>
-      <w:r>
-        <w:rPr>
-          <w:lang w:val="ru-RU"/>
-        </w:rPr>
-        <w:t>О</w:t>
-      </w:r>
-      <w:r>
-        <w:rPr>
-          <w:lang w:val="sr-Cyrl-RS"/>
-        </w:rPr>
-        <w:t>во баш одудара од садржаја на графику, и за власт исто мање више</w:t>
-      </w:r>
-    </w:p>
-  </w:comment>
-  <w:comment w:id="118" w:author="Nikola Babić" w:date="2026-08-20T20:05:00Z" w:initials="NB">
-    <w:p>
-      <w:pPr>
-        <w:pStyle w:val="CommentText"/>
-      </w:pPr>
-      <w:r>
-        <w:rPr>
-          <w:rStyle w:val="CommentReference"/>
-        </w:rPr>
-        <w:annotationRef/>
-      </w:r>
-      <w:r>
-        <w:rPr>
-          <w:lang w:val="ru-RU"/>
-        </w:rPr>
-        <w:t>Д</w:t>
-      </w:r>
-      <w:r>
-        <w:rPr>
-          <w:lang w:val="sr-Cyrl-RS"/>
-        </w:rPr>
-        <w:t>о сад је било на српском, треба доследно користити. Рамотрити шта за остала имена исто</w:t>
-      </w:r>
-    </w:p>
-  </w:comment>
-  <w:comment w:id="124" w:author="Nikola Babić" w:date="2026-08-20T20:16:00Z" w:initials="NB">
-    <w:p>
-      <w:pPr>
-        <w:pStyle w:val="CommentText"/>
-      </w:pPr>
-      <w:r>
-        <w:rPr>
-          <w:rStyle w:val="CommentReference"/>
-        </w:rPr>
-        <w:annotationRef/>
-      </w:r>
-      <w:r>
-        <w:rPr>
-          <w:lang w:val="ru-RU"/>
-        </w:rPr>
-        <w:t>Класичних</w:t>
-      </w:r>
-      <w:r>
-        <w:rPr>
-          <w:lang w:val="sr-Cyrl-RS"/>
-        </w:rPr>
-        <w:t xml:space="preserve"> модела/</w:t>
-      </w:r>
-      <w:r>
-        <w:rPr>
-          <w:lang w:val="ru-RU"/>
-        </w:rPr>
-        <w:t>неуралних</w:t>
-      </w:r>
-      <w:r>
-        <w:rPr>
-          <w:lang w:val="sr-Cyrl-RS"/>
-        </w:rPr>
-        <w:t xml:space="preserve"> мрежа/ чега*?</w:t>
-      </w:r>
-    </w:p>
-  </w:comment>
-  <w:comment w:id="128" w:author="Nikola Babić" w:date="2026-08-20T20:17:00Z" w:initials="NB">
-    <w:p>
-      <w:pPr>
-        <w:pStyle w:val="CommentText"/>
-      </w:pPr>
-      <w:r>
-        <w:rPr>
-          <w:rStyle w:val="CommentReference"/>
-        </w:rPr>
-        <w:annotationRef/>
-      </w:r>
-      <w:r>
-        <w:rPr>
-          <w:lang w:val="ru-RU"/>
-        </w:rPr>
-        <w:t>З</w:t>
-      </w:r>
-      <w:r>
-        <w:rPr>
-          <w:lang w:val="sr-Cyrl-RS"/>
-        </w:rPr>
-        <w:t>апис?</w:t>
-      </w:r>
-    </w:p>
-  </w:comment>
-  <w:comment w:id="130" w:author="Nikola Babić" w:date="2026-08-20T20:19:00Z" w:initials="NB">
-    <w:p>
-      <w:pPr>
-        <w:pStyle w:val="CommentText"/>
-        <w:rPr>
-          <w:lang w:val="en-US"/>
-        </w:rPr>
-      </w:pPr>
-      <w:r>
-        <w:rPr>
-          <w:rStyle w:val="CommentReference"/>
-        </w:rPr>
-        <w:annotationRef/>
-      </w:r>
-      <w:r>
-        <w:rPr>
-          <w:lang w:val="ru-RU"/>
-        </w:rPr>
-        <w:t>П</w:t>
-      </w:r>
-      <w:r>
-        <w:rPr>
-          <w:lang w:val="sr-Cyrl-RS"/>
-        </w:rPr>
-        <w:t>адеж?</w:t>
-      </w:r>
-    </w:p>
-  </w:comment>
-  <w:comment w:id="135" w:author="Nikola Babić" w:date="2026-08-20T20:12:00Z" w:initials="NB">
+  <w:comment w:id="36" w:author="Nikola Babić" w:date="2026-08-20T20:12:00Z" w:initials="NB">
     <w:p>
       <w:pPr>
         <w:pStyle w:val="CommentText"/>
@@ -17396,10 +16735,7 @@
 </file>
 
 <file path=word/commentsExtended.xml><?xml version="1.0" encoding="utf-8"?>
-<w15:commentsEx xmlns:wpc="http://schemas.microsoft.com/office/word/2010/wordprocessingCanvas" xmlns:cx="http://schemas.microsoft.com/office/drawing/2014/chartex" xmlns:cx1="http://schemas.microsoft.com/office/drawing/2015/9/8/chartex" xmlns:cx2="http://schemas.microsoft.com/office/drawing/2015/10/21/chartex" xmlns:cx3="http://schemas.microsoft.com/office/drawing/2016/5/9/chartex" xmlns:cx4="http://schemas.microsoft.com/office/drawing/2016/5/10/chartex" xmlns:cx5="http://schemas.microsoft.com/office/drawing/2016/5/11/chartex" xmlns:cx6="http://schemas.microsoft.com/office/drawing/2016/5/12/chartex" xmlns:cx7="http://schemas.microsoft.com/office/drawing/2016/5/13/chartex" xmlns:cx8="http://schemas.microsoft.com/office/drawing/2016/5/14/chartex" xmlns:mc="http://schemas.openxmlformats.org/markup-compatibility/2006" xmlns:aink="http://schemas.microsoft.com/office/drawing/2016/ink" xmlns:am3d="http://schemas.microsoft.com/office/drawing/2017/model3d" xmlns:o="urn:schemas-microsoft-com:office:office" xmlns:oel="http://schemas.microsoft.com/office/2019/extlst" xmlns:r="http://schemas.openxmlformats.org/officeDocument/2006/relationships" xmlns:m="http://schemas.openxmlformats.org/officeDocument/2006/math" xmlns:v="urn:schemas-microsoft-com:vml" xmlns:wp14="http://schemas.microsoft.com/office/word/2010/wordprocessingDrawing" xmlns:wp="http://schemas.openxmlformats.org/drawingml/2006/wordprocessingDrawing" xmlns:w10="urn:schemas-microsoft-com:office:word" xmlns:w="http://schemas.openxmlformats.org/wordprocessingml/2006/main" xmlns:w14="http://schemas.microsoft.com/office/word/2010/wordml" xmlns:w15="http://schemas.microsoft.com/office/word/2012/wordml" xmlns:w16cei="http://schemas.microsoft.com/office/word/2026/wordml/cei" xmlns:w16cex="http://schemas.microsoft.com/office/word/2018/wordml/cex" xmlns:w16cid="http://schemas.microsoft.com/office/word/2016/wordml/cid" xmlns:w16="http://schemas.microsoft.com/office/word/2018/wordml" xmlns:w16du="http://schemas.microsoft.com/office/word/2023/wordml/word16du" xmlns:w16sdtdh="http://schemas.microsoft.com/office/word/2020/wordml/sdtdatahash" xmlns:w16sdtfl="http://schemas.microsoft.com/office/word/2024/wordml/sdtformatlock" xmlns:w16se="http://schemas.microsoft.com/office/word/2015/wordml/symex" xmlns:wpg="http://schemas.microsoft.com/office/word/2010/wordprocessingGroup" xmlns:wpi="http://schemas.microsoft.com/office/word/2010/wordprocessingInk" xmlns:wne="http://schemas.microsoft.com/office/word/2006/wordml" xmlns:wps="http://schemas.microsoft.com/office/word/2010/wordprocessingShape" mc:Ignorable="w14 w15 w16se w16cid w16 w16cex w16sdtdh w16sdtfl w16du wp14">
-  <w15:commentEx w15:paraId="2A073117" w15:done="0"/>
-  <w15:commentEx w15:paraId="27E6D7EF" w15:done="0"/>
-  <w15:commentEx w15:paraId="1EBD3C5B" w15:done="0"/>
+<w15:commentsEx xmlns:wpc="http://schemas.microsoft.com/office/word/2010/wordprocessingCanvas" xmlns:cx="http://schemas.microsoft.com/office/drawing/2014/chartex" xmlns:cx1="http://schemas.microsoft.com/office/drawing/2015/9/8/chartex" xmlns:cx2="http://schemas.microsoft.com/office/drawing/2015/10/21/chartex" xmlns:cx3="http://schemas.microsoft.com/office/drawing/2016/5/9/chartex" xmlns:cx4="http://schemas.microsoft.com/office/drawing/2016/5/10/chartex" xmlns:cx5="http://schemas.microsoft.com/office/drawing/2016/5/11/chartex" xmlns:cx6="http://schemas.microsoft.com/office/drawing/2016/5/12/chartex" xmlns:cx7="http://schemas.microsoft.com/office/drawing/2016/5/13/chartex" xmlns:cx8="http://schemas.microsoft.com/office/drawing/2016/5/14/chartex" xmlns:mc="http://schemas.openxmlformats.org/markup-compatibility/2006" xmlns:aink="http://schemas.microsoft.com/office/drawing/2016/ink" xmlns:am3d="http://schemas.microsoft.com/office/drawing/2017/model3d" xmlns:o="urn:schemas-microsoft-com:office:office" xmlns:oel="http://schemas.microsoft.com/office/2019/extlst" xmlns:r="http://schemas.openxmlformats.org/officeDocument/2006/relationships" xmlns:m="http://schemas.openxmlformats.org/officeDocument/2006/math" xmlns:v="urn:schemas-microsoft-com:vml" xmlns:wp14="http://schemas.microsoft.com/office/word/2010/wordprocessingDrawing" xmlns:wp="http://schemas.openxmlformats.org/drawingml/2006/wordprocessingDrawing" xmlns:w10="urn:schemas-microsoft-com:office:word" xmlns:w="http://schemas.openxmlformats.org/wordprocessingml/2006/main" xmlns:w14="http://schemas.microsoft.com/office/word/2010/wordml" xmlns:w15="http://schemas.microsoft.com/office/word/2012/wordml" xmlns:w16cex="http://schemas.microsoft.com/office/word/2018/wordml/cex" xmlns:w16cid="http://schemas.microsoft.com/office/word/2016/wordml/cid" xmlns:w16="http://schemas.microsoft.com/office/word/2018/wordml" xmlns:w16du="http://schemas.microsoft.com/office/word/2023/wordml/word16du" xmlns:w16sdtdh="http://schemas.microsoft.com/office/word/2020/wordml/sdtdatahash" xmlns:w16sdtfl="http://schemas.microsoft.com/office/word/2024/wordml/sdtformatlock" xmlns:w16se="http://schemas.microsoft.com/office/word/2015/wordml/symex" xmlns:wpg="http://schemas.microsoft.com/office/word/2010/wordprocessingGroup" xmlns:wpi="http://schemas.microsoft.com/office/word/2010/wordprocessingInk" xmlns:wne="http://schemas.microsoft.com/office/word/2006/wordml" xmlns:wps="http://schemas.microsoft.com/office/word/2010/wordprocessingShape" mc:Ignorable="w14 w15 w16se w16cid w16 w16cex w16sdtdh w16sdtfl w16du wp14">
   <w15:commentEx w15:paraId="1D41D77E" w15:done="0"/>
   <w15:commentEx w15:paraId="6B959167" w15:done="0"/>
   <w15:commentEx w15:paraId="0A7E268B" w15:done="0"/>
@@ -17410,7 +16746,6 @@
   <w15:commentEx w15:paraId="072325D1" w15:done="0"/>
   <w15:commentEx w15:paraId="5D4F91E8" w15:done="0"/>
   <w15:commentEx w15:paraId="778FF368" w15:done="0"/>
-  <w15:commentEx w15:paraId="5A544283" w15:done="0"/>
   <w15:commentEx w15:paraId="40B544CD" w15:done="0"/>
   <w15:commentEx w15:paraId="43ADE672" w15:done="0"/>
   <w15:commentEx w15:paraId="7B502B8B" w15:done="0"/>
@@ -17418,10 +16753,7 @@
 </file>
 
 <file path=word/commentsExtensible.xml><?xml version="1.0" encoding="utf-8"?>
-<w16cex:commentsExtensible xmlns:wpc="http://schemas.microsoft.com/office/word/2010/wordprocessingCanvas" xmlns:cx="http://schemas.microsoft.com/office/drawing/2014/chartex" xmlns:cx1="http://schemas.microsoft.com/office/drawing/2015/9/8/chartex" xmlns:cx2="http://schemas.microsoft.com/office/drawing/2015/10/21/chartex" xmlns:cx3="http://schemas.microsoft.com/office/drawing/2016/5/9/chartex" xmlns:cx4="http://schemas.microsoft.com/office/drawing/2016/5/10/chartex" xmlns:cx5="http://schemas.microsoft.com/office/drawing/2016/5/11/chartex" xmlns:cx6="http://schemas.microsoft.com/office/drawing/2016/5/12/chartex" xmlns:cx7="http://schemas.microsoft.com/office/drawing/2016/5/13/chartex" xmlns:cx8="http://schemas.microsoft.com/office/drawing/2016/5/14/chartex" xmlns:cr="http://schemas.microsoft.com/office/comments/2020/reactions" xmlns:mc="http://schemas.openxmlformats.org/markup-compatibility/2006" xmlns:aink="http://schemas.microsoft.com/office/drawing/2016/ink" xmlns:am3d="http://schemas.microsoft.com/office/drawing/2017/model3d" xmlns:o="urn:schemas-microsoft-com:office:office" xmlns:oel="http://schemas.microsoft.com/office/2019/extlst" xmlns:r="http://schemas.openxmlformats.org/officeDocument/2006/relationships" xmlns:m="http://schemas.openxmlformats.org/officeDocument/2006/math" xmlns:v="urn:schemas-microsoft-com:vml" xmlns:wp14="http://schemas.microsoft.com/office/word/2010/wordprocessingDrawing" xmlns:wp="http://schemas.openxmlformats.org/drawingml/2006/wordprocessingDrawing" xmlns:w10="urn:schemas-microsoft-com:office:word" xmlns:w="http://schemas.openxmlformats.org/wordprocessingml/2006/main" xmlns:w14="http://schemas.microsoft.com/office/word/2010/wordml" xmlns:w15="http://schemas.microsoft.com/office/word/2012/wordml" xmlns:w16cei="http://schemas.microsoft.com/office/word/2026/wordml/cei" xmlns:w16cex="http://schemas.microsoft.com/office/word/2018/wordml/cex" xmlns:w16cid="http://schemas.microsoft.com/office/word/2016/wordml/cid" xmlns:w16="http://schemas.microsoft.com/office/word/2018/wordml" xmlns:w16du="http://schemas.microsoft.com/office/word/2023/wordml/word16du" xmlns:w16sdtdh="http://schemas.microsoft.com/office/word/2020/wordml/sdtdatahash" xmlns:w16sdtfl="http://schemas.microsoft.com/office/word/2024/wordml/sdtformatlock" xmlns:w16se="http://schemas.microsoft.com/office/word/2015/wordml/symex" xmlns:wpg="http://schemas.microsoft.com/office/word/2010/wordprocessingGroup" xmlns:wpi="http://schemas.microsoft.com/office/word/2010/wordprocessingInk" xmlns:wne="http://schemas.microsoft.com/office/word/2006/wordml" xmlns:wps="http://schemas.microsoft.com/office/word/2010/wordprocessingShape" mc:Ignorable="w14 w15 w16se w16cid w16 w16cex w16sdtdh w16sdtfl cr w16du wp14">
-  <w16cex:commentExtensible w16cex:durableId="7B127492" w16cex:dateUtc="2026-08-20T16:33:00Z"/>
-  <w16cex:commentExtensible w16cex:durableId="592FB293" w16cex:dateUtc="2026-08-20T16:41:00Z"/>
-  <w16cex:commentExtensible w16cex:durableId="60D63EED" w16cex:dateUtc="2026-08-20T16:42:00Z"/>
+<w16cex:commentsExtensible xmlns:wpc="http://schemas.microsoft.com/office/word/2010/wordprocessingCanvas" xmlns:cx="http://schemas.microsoft.com/office/drawing/2014/chartex" xmlns:cx1="http://schemas.microsoft.com/office/drawing/2015/9/8/chartex" xmlns:cx2="http://schemas.microsoft.com/office/drawing/2015/10/21/chartex" xmlns:cx3="http://schemas.microsoft.com/office/drawing/2016/5/9/chartex" xmlns:cx4="http://schemas.microsoft.com/office/drawing/2016/5/10/chartex" xmlns:cx5="http://schemas.microsoft.com/office/drawing/2016/5/11/chartex" xmlns:cx6="http://schemas.microsoft.com/office/drawing/2016/5/12/chartex" xmlns:cx7="http://schemas.microsoft.com/office/drawing/2016/5/13/chartex" xmlns:cx8="http://schemas.microsoft.com/office/drawing/2016/5/14/chartex" xmlns:cr="http://schemas.microsoft.com/office/comments/2020/reactions" xmlns:mc="http://schemas.openxmlformats.org/markup-compatibility/2006" xmlns:aink="http://schemas.microsoft.com/office/drawing/2016/ink" xmlns:am3d="http://schemas.microsoft.com/office/drawing/2017/model3d" xmlns:o="urn:schemas-microsoft-com:office:office" xmlns:oel="http://schemas.microsoft.com/office/2019/extlst" xmlns:r="http://schemas.openxmlformats.org/officeDocument/2006/relationships" xmlns:m="http://schemas.openxmlformats.org/officeDocument/2006/math" xmlns:v="urn:schemas-microsoft-com:vml" xmlns:wp14="http://schemas.microsoft.com/office/word/2010/wordprocessingDrawing" xmlns:wp="http://schemas.openxmlformats.org/drawingml/2006/wordprocessingDrawing" xmlns:w10="urn:schemas-microsoft-com:office:word" xmlns:w="http://schemas.openxmlformats.org/wordprocessingml/2006/main" xmlns:w14="http://schemas.microsoft.com/office/word/2010/wordml" xmlns:w15="http://schemas.microsoft.com/office/word/2012/wordml" xmlns:w16cex="http://schemas.microsoft.com/office/word/2018/wordml/cex" xmlns:w16cid="http://schemas.microsoft.com/office/word/2016/wordml/cid" xmlns:w16="http://schemas.microsoft.com/office/word/2018/wordml" xmlns:w16du="http://schemas.microsoft.com/office/word/2023/wordml/word16du" xmlns:w16sdtdh="http://schemas.microsoft.com/office/word/2020/wordml/sdtdatahash" xmlns:w16sdtfl="http://schemas.microsoft.com/office/word/2024/wordml/sdtformatlock" xmlns:w16se="http://schemas.microsoft.com/office/word/2015/wordml/symex" xmlns:wpg="http://schemas.microsoft.com/office/word/2010/wordprocessingGroup" xmlns:wpi="http://schemas.microsoft.com/office/word/2010/wordprocessingInk" xmlns:wne="http://schemas.microsoft.com/office/word/2006/wordml" xmlns:wps="http://schemas.microsoft.com/office/word/2010/wordprocessingShape" mc:Ignorable="w14 w15 w16se w16cid w16 w16cex w16sdtdh w16sdtfl cr w16du wp14">
   <w16cex:commentExtensible w16cex:durableId="559C571D" w16cex:dateUtc="2026-08-20T17:28:00Z"/>
   <w16cex:commentExtensible w16cex:durableId="322CC6D7" w16cex:dateUtc="2026-08-20T17:23:00Z"/>
   <w16cex:commentExtensible w16cex:durableId="7E51412B" w16cex:dateUtc="2026-08-20T17:25:00Z"/>
@@ -17432,7 +16764,6 @@
   <w16cex:commentExtensible w16cex:durableId="7A11BBA7" w16cex:dateUtc="2026-08-20T17:58:00Z"/>
   <w16cex:commentExtensible w16cex:durableId="20B18B1B" w16cex:dateUtc="2026-08-20T18:00:00Z"/>
   <w16cex:commentExtensible w16cex:durableId="6E4B3971" w16cex:dateUtc="2026-08-20T18:05:00Z"/>
-  <w16cex:commentExtensible w16cex:durableId="72B9EDD1" w16cex:dateUtc="2026-08-20T18:16:00Z"/>
   <w16cex:commentExtensible w16cex:durableId="2E30A522" w16cex:dateUtc="2026-08-20T18:17:00Z"/>
   <w16cex:commentExtensible w16cex:durableId="33165919" w16cex:dateUtc="2026-08-20T18:19:00Z"/>
   <w16cex:commentExtensible w16cex:durableId="701C7B9D" w16cex:dateUtc="2026-08-20T18:12:00Z"/>
@@ -17440,10 +16771,7 @@
 </file>
 
 <file path=word/commentsIds.xml><?xml version="1.0" encoding="utf-8"?>
-<w16cid:commentsIds xmlns:wpc="http://schemas.microsoft.com/office/word/2010/wordprocessingCanvas" xmlns:cx="http://schemas.microsoft.com/office/drawing/2014/chartex" xmlns:cx1="http://schemas.microsoft.com/office/drawing/2015/9/8/chartex" xmlns:cx2="http://schemas.microsoft.com/office/drawing/2015/10/21/chartex" xmlns:cx3="http://schemas.microsoft.com/office/drawing/2016/5/9/chartex" xmlns:cx4="http://schemas.microsoft.com/office/drawing/2016/5/10/chartex" xmlns:cx5="http://schemas.microsoft.com/office/drawing/2016/5/11/chartex" xmlns:cx6="http://schemas.microsoft.com/office/drawing/2016/5/12/chartex" xmlns:cx7="http://schemas.microsoft.com/office/drawing/2016/5/13/chartex" xmlns:cx8="http://schemas.microsoft.com/office/drawing/2016/5/14/chartex" xmlns:mc="http://schemas.openxmlformats.org/markup-compatibility/2006" xmlns:aink="http://schemas.microsoft.com/office/drawing/2016/ink" xmlns:am3d="http://schemas.microsoft.com/office/drawing/2017/model3d" xmlns:o="urn:schemas-microsoft-com:office:office" xmlns:oel="http://schemas.microsoft.com/office/2019/extlst" xmlns:r="http://schemas.openxmlformats.org/officeDocument/2006/relationships" xmlns:m="http://schemas.openxmlformats.org/officeDocument/2006/math" xmlns:v="urn:schemas-microsoft-com:vml" xmlns:wp14="http://schemas.microsoft.com/office/word/2010/wordprocessingDrawing" xmlns:wp="http://schemas.openxmlformats.org/drawingml/2006/wordprocessingDrawing" xmlns:w10="urn:schemas-microsoft-com:office:word" xmlns:w="http://schemas.openxmlformats.org/wordprocessingml/2006/main" xmlns:w14="http://schemas.microsoft.com/office/word/2010/wordml" xmlns:w15="http://schemas.microsoft.com/office/word/2012/wordml" xmlns:w16cei="http://schemas.microsoft.com/office/word/2026/wordml/cei" xmlns:w16cex="http://schemas.microsoft.com/office/word/2018/wordml/cex" xmlns:w16cid="http://schemas.microsoft.com/office/word/2016/wordml/cid" xmlns:w16="http://schemas.microsoft.com/office/word/2018/wordml" xmlns:w16du="http://schemas.microsoft.com/office/word/2023/wordml/word16du" xmlns:w16sdtdh="http://schemas.microsoft.com/office/word/2020/wordml/sdtdatahash" xmlns:w16sdtfl="http://schemas.microsoft.com/office/word/2024/wordml/sdtformatlock" xmlns:w16se="http://schemas.microsoft.com/office/word/2015/wordml/symex" xmlns:wpg="http://schemas.microsoft.com/office/word/2010/wordprocessingGroup" xmlns:wpi="http://schemas.microsoft.com/office/word/2010/wordprocessingInk" xmlns:wne="http://schemas.microsoft.com/office/word/2006/wordml" xmlns:wps="http://schemas.microsoft.com/office/word/2010/wordprocessingShape" mc:Ignorable="w14 w15 w16se w16cid w16 w16cex w16sdtdh w16sdtfl w16du wp14">
-  <w16cid:commentId w16cid:paraId="2A073117" w16cid:durableId="7B127492"/>
-  <w16cid:commentId w16cid:paraId="27E6D7EF" w16cid:durableId="592FB293"/>
-  <w16cid:commentId w16cid:paraId="1EBD3C5B" w16cid:durableId="60D63EED"/>
+<w16cid:commentsIds xmlns:wpc="http://schemas.microsoft.com/office/word/2010/wordprocessingCanvas" xmlns:cx="http://schemas.microsoft.com/office/drawing/2014/chartex" xmlns:cx1="http://schemas.microsoft.com/office/drawing/2015/9/8/chartex" xmlns:cx2="http://schemas.microsoft.com/office/drawing/2015/10/21/chartex" xmlns:cx3="http://schemas.microsoft.com/office/drawing/2016/5/9/chartex" xmlns:cx4="http://schemas.microsoft.com/office/drawing/2016/5/10/chartex" xmlns:cx5="http://schemas.microsoft.com/office/drawing/2016/5/11/chartex" xmlns:cx6="http://schemas.microsoft.com/office/drawing/2016/5/12/chartex" xmlns:cx7="http://schemas.microsoft.com/office/drawing/2016/5/13/chartex" xmlns:cx8="http://schemas.microsoft.com/office/drawing/2016/5/14/chartex" xmlns:mc="http://schemas.openxmlformats.org/markup-compatibility/2006" xmlns:aink="http://schemas.microsoft.com/office/drawing/2016/ink" xmlns:am3d="http://schemas.microsoft.com/office/drawing/2017/model3d" xmlns:o="urn:schemas-microsoft-com:office:office" xmlns:oel="http://schemas.microsoft.com/office/2019/extlst" xmlns:r="http://schemas.openxmlformats.org/officeDocument/2006/relationships" xmlns:m="http://schemas.openxmlformats.org/officeDocument/2006/math" xmlns:v="urn:schemas-microsoft-com:vml" xmlns:wp14="http://schemas.microsoft.com/office/word/2010/wordprocessingDrawing" xmlns:wp="http://schemas.openxmlformats.org/drawingml/2006/wordprocessingDrawing" xmlns:w10="urn:schemas-microsoft-com:office:word" xmlns:w="http://schemas.openxmlformats.org/wordprocessingml/2006/main" xmlns:w14="http://schemas.microsoft.com/office/word/2010/wordml" xmlns:w15="http://schemas.microsoft.com/office/word/2012/wordml" xmlns:w16cex="http://schemas.microsoft.com/office/word/2018/wordml/cex" xmlns:w16cid="http://schemas.microsoft.com/office/word/2016/wordml/cid" xmlns:w16="http://schemas.microsoft.com/office/word/2018/wordml" xmlns:w16du="http://schemas.microsoft.com/office/word/2023/wordml/word16du" xmlns:w16sdtdh="http://schemas.microsoft.com/office/word/2020/wordml/sdtdatahash" xmlns:w16sdtfl="http://schemas.microsoft.com/office/word/2024/wordml/sdtformatlock" xmlns:w16se="http://schemas.microsoft.com/office/word/2015/wordml/symex" xmlns:wpg="http://schemas.microsoft.com/office/word/2010/wordprocessingGroup" xmlns:wpi="http://schemas.microsoft.com/office/word/2010/wordprocessingInk" xmlns:wne="http://schemas.microsoft.com/office/word/2006/wordml" xmlns:wps="http://schemas.microsoft.com/office/word/2010/wordprocessingShape" mc:Ignorable="w14 w15 w16se w16cid w16 w16cex w16sdtdh w16sdtfl w16du wp14">
   <w16cid:commentId w16cid:paraId="1D41D77E" w16cid:durableId="559C571D"/>
   <w16cid:commentId w16cid:paraId="6B959167" w16cid:durableId="322CC6D7"/>
   <w16cid:commentId w16cid:paraId="0A7E268B" w16cid:durableId="7E51412B"/>
@@ -17454,7 +16782,6 @@
   <w16cid:commentId w16cid:paraId="072325D1" w16cid:durableId="7A11BBA7"/>
   <w16cid:commentId w16cid:paraId="5D4F91E8" w16cid:durableId="20B18B1B"/>
   <w16cid:commentId w16cid:paraId="778FF368" w16cid:durableId="6E4B3971"/>
-  <w16cid:commentId w16cid:paraId="5A544283" w16cid:durableId="72B9EDD1"/>
   <w16cid:commentId w16cid:paraId="40B544CD" w16cid:durableId="2E30A522"/>
   <w16cid:commentId w16cid:paraId="43ADE672" w16cid:durableId="33165919"/>
   <w16cid:commentId w16cid:paraId="7B502B8B" w16cid:durableId="701C7B9D"/>
@@ -17462,7 +16789,7 @@
 </file>
 
 <file path=word/numbering.xml><?xml version="1.0" encoding="utf-8"?>
-<w:numbering xmlns:wpc="http://schemas.microsoft.com/office/word/2010/wordprocessingCanvas" xmlns:cx="http://schemas.microsoft.com/office/drawing/2014/chartex" xmlns:cx1="http://schemas.microsoft.com/office/drawing/2015/9/8/chartex" xmlns:cx2="http://schemas.microsoft.com/office/drawing/2015/10/21/chartex" xmlns:cx3="http://schemas.microsoft.com/office/drawing/2016/5/9/chartex" xmlns:cx4="http://schemas.microsoft.com/office/drawing/2016/5/10/chartex" xmlns:cx5="http://schemas.microsoft.com/office/drawing/2016/5/11/chartex" xmlns:cx6="http://schemas.microsoft.com/office/drawing/2016/5/12/chartex" xmlns:cx7="http://schemas.microsoft.com/office/drawing/2016/5/13/chartex" xmlns:cx8="http://schemas.microsoft.com/office/drawing/2016/5/14/chartex" xmlns:mc="http://schemas.openxmlformats.org/markup-compatibility/2006" xmlns:aink="http://schemas.microsoft.com/office/drawing/2016/ink" xmlns:am3d="http://schemas.microsoft.com/office/drawing/2017/model3d" xmlns:o="urn:schemas-microsoft-com:office:office" xmlns:oel="http://schemas.microsoft.com/office/2019/extlst" xmlns:r="http://schemas.openxmlformats.org/officeDocument/2006/relationships" xmlns:m="http://schemas.openxmlformats.org/officeDocument/2006/math" xmlns:v="urn:schemas-microsoft-com:vml" xmlns:wp14="http://schemas.microsoft.com/office/word/2010/wordprocessingDrawing" xmlns:wp="http://schemas.openxmlformats.org/drawingml/2006/wordprocessingDrawing" xmlns:w10="urn:schemas-microsoft-com:office:word" xmlns:w="http://schemas.openxmlformats.org/wordprocessingml/2006/main" xmlns:w14="http://schemas.microsoft.com/office/word/2010/wordml" xmlns:w15="http://schemas.microsoft.com/office/word/2012/wordml" xmlns:w16cei="http://schemas.microsoft.com/office/word/2026/wordml/cei" xmlns:w16cex="http://schemas.microsoft.com/office/word/2018/wordml/cex" xmlns:w16cid="http://schemas.microsoft.com/office/word/2016/wordml/cid" xmlns:w16="http://schemas.microsoft.com/office/word/2018/wordml" xmlns:w16du="http://schemas.microsoft.com/office/word/2023/wordml/word16du" xmlns:w16sdtdh="http://schemas.microsoft.com/office/word/2020/wordml/sdtdatahash" xmlns:w16sdtfl="http://schemas.microsoft.com/office/word/2024/wordml/sdtformatlock" xmlns:w16se="http://schemas.microsoft.com/office/word/2015/wordml/symex" xmlns:wpg="http://schemas.microsoft.com/office/word/2010/wordprocessingGroup" xmlns:wpi="http://schemas.microsoft.com/office/word/2010/wordprocessingInk" xmlns:wne="http://schemas.microsoft.com/office/word/2006/wordml" xmlns:wps="http://schemas.microsoft.com/office/word/2010/wordprocessingShape" mc:Ignorable="w14 w15 w16se w16cid w16 w16cex w16sdtdh w16sdtfl w16du wp14">
+<w:numbering xmlns:wpc="http://schemas.microsoft.com/office/word/2010/wordprocessingCanvas" xmlns:cx="http://schemas.microsoft.com/office/drawing/2014/chartex" xmlns:cx1="http://schemas.microsoft.com/office/drawing/2015/9/8/chartex" xmlns:cx2="http://schemas.microsoft.com/office/drawing/2015/10/21/chartex" xmlns:cx3="http://schemas.microsoft.com/office/drawing/2016/5/9/chartex" xmlns:cx4="http://schemas.microsoft.com/office/drawing/2016/5/10/chartex" xmlns:cx5="http://schemas.microsoft.com/office/drawing/2016/5/11/chartex" xmlns:cx6="http://schemas.microsoft.com/office/drawing/2016/5/12/chartex" xmlns:cx7="http://schemas.microsoft.com/office/drawing/2016/5/13/chartex" xmlns:cx8="http://schemas.microsoft.com/office/drawing/2016/5/14/chartex" xmlns:mc="http://schemas.openxmlformats.org/markup-compatibility/2006" xmlns:aink="http://schemas.microsoft.com/office/drawing/2016/ink" xmlns:am3d="http://schemas.microsoft.com/office/drawing/2017/model3d" xmlns:o="urn:schemas-microsoft-com:office:office" xmlns:oel="http://schemas.microsoft.com/office/2019/extlst" xmlns:r="http://schemas.openxmlformats.org/officeDocument/2006/relationships" xmlns:m="http://schemas.openxmlformats.org/officeDocument/2006/math" xmlns:v="urn:schemas-microsoft-com:vml" xmlns:wp14="http://schemas.microsoft.com/office/word/2010/wordprocessingDrawing" xmlns:wp="http://schemas.openxmlformats.org/drawingml/2006/wordprocessingDrawing" xmlns:w10="urn:schemas-microsoft-com:office:word" xmlns:w="http://schemas.openxmlformats.org/wordprocessingml/2006/main" xmlns:w14="http://schemas.microsoft.com/office/word/2010/wordml" xmlns:w15="http://schemas.microsoft.com/office/word/2012/wordml" xmlns:w16cex="http://schemas.microsoft.com/office/word/2018/wordml/cex" xmlns:w16cid="http://schemas.microsoft.com/office/word/2016/wordml/cid" xmlns:w16="http://schemas.microsoft.com/office/word/2018/wordml" xmlns:w16du="http://schemas.microsoft.com/office/word/2023/wordml/word16du" xmlns:w16sdtdh="http://schemas.microsoft.com/office/word/2020/wordml/sdtdatahash" xmlns:w16sdtfl="http://schemas.microsoft.com/office/word/2024/wordml/sdtformatlock" xmlns:w16se="http://schemas.microsoft.com/office/word/2015/wordml/symex" xmlns:wpg="http://schemas.microsoft.com/office/word/2010/wordprocessingGroup" xmlns:wpi="http://schemas.microsoft.com/office/word/2010/wordprocessingInk" xmlns:wne="http://schemas.microsoft.com/office/word/2006/wordml" xmlns:wps="http://schemas.microsoft.com/office/word/2010/wordprocessingShape" mc:Ignorable="w14 w15 w16se w16cid w16 w16cex w16sdtdh w16sdtfl w16du wp14">
   <w:abstractNum w:abstractNumId="0" w15:restartNumberingAfterBreak="0">
     <w:nsid w:val="0D133A30"/>
     <w:multiLevelType w:val="hybridMultilevel"/>
@@ -19140,7 +18467,7 @@
 </file>
 
 <file path=word/people.xml><?xml version="1.0" encoding="utf-8"?>
-<w15:people xmlns:wpc="http://schemas.microsoft.com/office/word/2010/wordprocessingCanvas" xmlns:cx="http://schemas.microsoft.com/office/drawing/2014/chartex" xmlns:cx1="http://schemas.microsoft.com/office/drawing/2015/9/8/chartex" xmlns:cx2="http://schemas.microsoft.com/office/drawing/2015/10/21/chartex" xmlns:cx3="http://schemas.microsoft.com/office/drawing/2016/5/9/chartex" xmlns:cx4="http://schemas.microsoft.com/office/drawing/2016/5/10/chartex" xmlns:cx5="http://schemas.microsoft.com/office/drawing/2016/5/11/chartex" xmlns:cx6="http://schemas.microsoft.com/office/drawing/2016/5/12/chartex" xmlns:cx7="http://schemas.microsoft.com/office/drawing/2016/5/13/chartex" xmlns:cx8="http://schemas.microsoft.com/office/drawing/2016/5/14/chartex" xmlns:mc="http://schemas.openxmlformats.org/markup-compatibility/2006" xmlns:aink="http://schemas.microsoft.com/office/drawing/2016/ink" xmlns:am3d="http://schemas.microsoft.com/office/drawing/2017/model3d" xmlns:o="urn:schemas-microsoft-com:office:office" xmlns:oel="http://schemas.microsoft.com/office/2019/extlst" xmlns:r="http://schemas.openxmlformats.org/officeDocument/2006/relationships" xmlns:m="http://schemas.openxmlformats.org/officeDocument/2006/math" xmlns:v="urn:schemas-microsoft-com:vml" xmlns:wp14="http://schemas.microsoft.com/office/word/2010/wordprocessingDrawing" xmlns:wp="http://schemas.openxmlformats.org/drawingml/2006/wordprocessingDrawing" xmlns:w10="urn:schemas-microsoft-com:office:word" xmlns:w="http://schemas.openxmlformats.org/wordprocessingml/2006/main" xmlns:w14="http://schemas.microsoft.com/office/word/2010/wordml" xmlns:w15="http://schemas.microsoft.com/office/word/2012/wordml" xmlns:w16cei="http://schemas.microsoft.com/office/word/2026/wordml/cei" xmlns:w16cex="http://schemas.microsoft.com/office/word/2018/wordml/cex" xmlns:w16cid="http://schemas.microsoft.com/office/word/2016/wordml/cid" xmlns:w16="http://schemas.microsoft.com/office/word/2018/wordml" xmlns:w16du="http://schemas.microsoft.com/office/word/2023/wordml/word16du" xmlns:w16sdtdh="http://schemas.microsoft.com/office/word/2020/wordml/sdtdatahash" xmlns:w16sdtfl="http://schemas.microsoft.com/office/word/2024/wordml/sdtformatlock" xmlns:w16se="http://schemas.microsoft.com/office/word/2015/wordml/symex" xmlns:wpg="http://schemas.microsoft.com/office/word/2010/wordprocessingGroup" xmlns:wpi="http://schemas.microsoft.com/office/word/2010/wordprocessingInk" xmlns:wne="http://schemas.microsoft.com/office/word/2006/wordml" xmlns:wps="http://schemas.microsoft.com/office/word/2010/wordprocessingShape" mc:Ignorable="w14 w15 w16se w16cid w16 w16cex w16sdtdh w16sdtfl w16du wp14">
+<w15:people xmlns:wpc="http://schemas.microsoft.com/office/word/2010/wordprocessingCanvas" xmlns:cx="http://schemas.microsoft.com/office/drawing/2014/chartex" xmlns:cx1="http://schemas.microsoft.com/office/drawing/2015/9/8/chartex" xmlns:cx2="http://schemas.microsoft.com/office/drawing/2015/10/21/chartex" xmlns:cx3="http://schemas.microsoft.com/office/drawing/2016/5/9/chartex" xmlns:cx4="http://schemas.microsoft.com/office/drawing/2016/5/10/chartex" xmlns:cx5="http://schemas.microsoft.com/office/drawing/2016/5/11/chartex" xmlns:cx6="http://schemas.microsoft.com/office/drawing/2016/5/12/chartex" xmlns:cx7="http://schemas.microsoft.com/office/drawing/2016/5/13/chartex" xmlns:cx8="http://schemas.microsoft.com/office/drawing/2016/5/14/chartex" xmlns:mc="http://schemas.openxmlformats.org/markup-compatibility/2006" xmlns:aink="http://schemas.microsoft.com/office/drawing/2016/ink" xmlns:am3d="http://schemas.microsoft.com/office/drawing/2017/model3d" xmlns:o="urn:schemas-microsoft-com:office:office" xmlns:oel="http://schemas.microsoft.com/office/2019/extlst" xmlns:r="http://schemas.openxmlformats.org/officeDocument/2006/relationships" xmlns:m="http://schemas.openxmlformats.org/officeDocument/2006/math" xmlns:v="urn:schemas-microsoft-com:vml" xmlns:wp14="http://schemas.microsoft.com/office/word/2010/wordprocessingDrawing" xmlns:wp="http://schemas.openxmlformats.org/drawingml/2006/wordprocessingDrawing" xmlns:w10="urn:schemas-microsoft-com:office:word" xmlns:w="http://schemas.openxmlformats.org/wordprocessingml/2006/main" xmlns:w14="http://schemas.microsoft.com/office/word/2010/wordml" xmlns:w15="http://schemas.microsoft.com/office/word/2012/wordml" xmlns:w16cex="http://schemas.microsoft.com/office/word/2018/wordml/cex" xmlns:w16cid="http://schemas.microsoft.com/office/word/2016/wordml/cid" xmlns:w16="http://schemas.microsoft.com/office/word/2018/wordml" xmlns:w16du="http://schemas.microsoft.com/office/word/2023/wordml/word16du" xmlns:w16sdtdh="http://schemas.microsoft.com/office/word/2020/wordml/sdtdatahash" xmlns:w16sdtfl="http://schemas.microsoft.com/office/word/2024/wordml/sdtformatlock" xmlns:w16se="http://schemas.microsoft.com/office/word/2015/wordml/symex" xmlns:wpg="http://schemas.microsoft.com/office/word/2010/wordprocessingGroup" xmlns:wpi="http://schemas.microsoft.com/office/word/2010/wordprocessingInk" xmlns:wne="http://schemas.microsoft.com/office/word/2006/wordml" xmlns:wps="http://schemas.microsoft.com/office/word/2010/wordprocessingShape" mc:Ignorable="w14 w15 w16se w16cid w16 w16cex w16sdtdh w16sdtfl w16du wp14">
   <w15:person w15:author="Nikola Babić">
     <w15:presenceInfo w15:providerId="Windows Live" w15:userId="b670576d5496a851"/>
   </w15:person>

</xml_diff>